<commit_message>
Refactor report_docx.php: Implement dynamic row cloning, duty grouping by category, and non-billable filtering. Update template variables documentation.
</commit_message>
<xml_diff>
--- a/pages/fnu/ven/api/template_in.docx
+++ b/pages/fnu/ven/api/template_in.docx
@@ -1,6 +1,6 @@
 
 <file path=word/document.xml><?xml version="1.0" encoding="utf-8"?>
-<w:document xmlns:wpc="http://schemas.microsoft.com/office/word/2010/wordprocessingCanvas" xmlns:cx="http://schemas.microsoft.com/office/drawing/2014/chartex" xmlns:cx1="http://schemas.microsoft.com/office/drawing/2015/9/8/chartex" xmlns:mc="http://schemas.openxmlformats.org/markup-compatibility/2006" xmlns:o="urn:schemas-microsoft-com:office:office" xmlns:r="http://schemas.openxmlformats.org/officeDocument/2006/relationships" xmlns:m="http://schemas.openxmlformats.org/officeDocument/2006/math" xmlns:v="urn:schemas-microsoft-com:vml" xmlns:wp14="http://schemas.microsoft.com/office/word/2010/wordprocessingDrawing" xmlns:wp="http://schemas.openxmlformats.org/drawingml/2006/wordprocessingDrawing" xmlns:w10="urn:schemas-microsoft-com:office:word" xmlns:w="http://schemas.openxmlformats.org/wordprocessingml/2006/main" xmlns:w14="http://schemas.microsoft.com/office/word/2010/wordml" xmlns:w15="http://schemas.microsoft.com/office/word/2012/wordml" xmlns:w16se="http://schemas.microsoft.com/office/word/2015/wordml/symex" xmlns:wpg="http://schemas.microsoft.com/office/word/2010/wordprocessingGroup" xmlns:wpi="http://schemas.microsoft.com/office/word/2010/wordprocessingInk" xmlns:wne="http://schemas.microsoft.com/office/word/2006/wordml" xmlns:wps="http://schemas.microsoft.com/office/word/2010/wordprocessingShape" mc:Ignorable="w14 w15 w16se wp14">
+<w:document xmlns:wpc="http://schemas.microsoft.com/office/word/2010/wordprocessingCanvas" xmlns:cx="http://schemas.microsoft.com/office/drawing/2014/chartex" xmlns:cx1="http://schemas.microsoft.com/office/drawing/2015/9/8/chartex" xmlns:cx2="http://schemas.microsoft.com/office/drawing/2015/10/21/chartex" xmlns:cx3="http://schemas.microsoft.com/office/drawing/2016/5/9/chartex" xmlns:cx4="http://schemas.microsoft.com/office/drawing/2016/5/10/chartex" xmlns:cx5="http://schemas.microsoft.com/office/drawing/2016/5/11/chartex" xmlns:cx6="http://schemas.microsoft.com/office/drawing/2016/5/12/chartex" xmlns:cx7="http://schemas.microsoft.com/office/drawing/2016/5/13/chartex" xmlns:cx8="http://schemas.microsoft.com/office/drawing/2016/5/14/chartex" xmlns:mc="http://schemas.openxmlformats.org/markup-compatibility/2006" xmlns:aink="http://schemas.microsoft.com/office/drawing/2016/ink" xmlns:am3d="http://schemas.microsoft.com/office/drawing/2017/model3d" xmlns:o="urn:schemas-microsoft-com:office:office" xmlns:oel="http://schemas.microsoft.com/office/2019/extlst" xmlns:r="http://schemas.openxmlformats.org/officeDocument/2006/relationships" xmlns:m="http://schemas.openxmlformats.org/officeDocument/2006/math" xmlns:v="urn:schemas-microsoft-com:vml" xmlns:wp14="http://schemas.microsoft.com/office/word/2010/wordprocessingDrawing" xmlns:wp="http://schemas.openxmlformats.org/drawingml/2006/wordprocessingDrawing" xmlns:w10="urn:schemas-microsoft-com:office:word" xmlns:w="http://schemas.openxmlformats.org/wordprocessingml/2006/main" xmlns:w14="http://schemas.microsoft.com/office/word/2010/wordml" xmlns:w15="http://schemas.microsoft.com/office/word/2012/wordml" xmlns:w16cex="http://schemas.microsoft.com/office/word/2018/wordml/cex" xmlns:w16cid="http://schemas.microsoft.com/office/word/2016/wordml/cid" xmlns:w16="http://schemas.microsoft.com/office/word/2018/wordml" xmlns:w16du="http://schemas.microsoft.com/office/word/2023/wordml/word16du" xmlns:w16sdtdh="http://schemas.microsoft.com/office/word/2020/wordml/sdtdatahash" xmlns:w16sdtfl="http://schemas.microsoft.com/office/word/2024/wordml/sdtformatlock" xmlns:w16se="http://schemas.microsoft.com/office/word/2015/wordml/symex" xmlns:wpg="http://schemas.microsoft.com/office/word/2010/wordprocessingGroup" xmlns:wpi="http://schemas.microsoft.com/office/word/2010/wordprocessingInk" xmlns:wne="http://schemas.microsoft.com/office/word/2006/wordml" xmlns:wps="http://schemas.microsoft.com/office/word/2010/wordprocessingShape" mc:Ignorable="w14 w15 w16se w16cid w16 w16cex w16sdtdh w16sdtfl w16du wp14">
   <w:body>
     <w:p>
       <w:pPr>
@@ -159,7 +159,7 @@
                                 <w:szCs w:val="32"/>
                                 <w:cs/>
                               </w:rPr>
-                              <w:t>๖</w:t>
+                              <w:t>๙</w:t>
                             </w:r>
                             <w:r>
                               <w:rPr>
@@ -215,7 +215,7 @@
                 <v:stroke joinstyle="miter"/>
                 <v:path gradientshapeok="t" o:connecttype="rect"/>
               </v:shapetype>
-              <v:shape id="Text Box 93" o:spid="_x0000_s1026" type="#_x0000_t202" style="position:absolute;margin-left:274.35pt;margin-top:-17.15pt;width:186.7pt;height:38.8pt;z-index:251659264;visibility:visible;mso-wrap-style:square;mso-width-percent:0;mso-height-percent:0;mso-wrap-distance-left:9pt;mso-wrap-distance-top:0;mso-wrap-distance-right:9pt;mso-wrap-distance-bottom:0;mso-position-horizontal:absolute;mso-position-horizontal-relative:text;mso-position-vertical:absolute;mso-position-vertical-relative:text;mso-width-percent:0;mso-height-percent:0;mso-width-relative:page;mso-height-relative:page;v-text-anchor:top" o:gfxdata="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" filled="f" stroked="f">
+              <v:shape id="Text Box 93" o:spid="_x0000_s1026" type="#_x0000_t202" style="position:absolute;margin-left:274.35pt;margin-top:-17.15pt;width:186.7pt;height:38.8pt;z-index:251659264;visibility:visible;mso-wrap-style:square;mso-width-percent:0;mso-height-percent:0;mso-wrap-distance-left:9pt;mso-wrap-distance-top:0;mso-wrap-distance-right:9pt;mso-wrap-distance-bottom:0;mso-position-horizontal:absolute;mso-position-horizontal-relative:text;mso-position-vertical:absolute;mso-position-vertical-relative:text;mso-width-percent:0;mso-height-percent:0;mso-width-relative:page;mso-height-relative:page;v-text-anchor:top" o:gfxdata="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" filled="f" stroked="f">
                 <v:textbox>
                   <w:txbxContent>
                     <w:p>
@@ -299,7 +299,7 @@
                           <w:szCs w:val="32"/>
                           <w:cs/>
                         </w:rPr>
-                        <w:t>๖</w:t>
+                        <w:t>๙</w:t>
                       </w:r>
                       <w:r>
                         <w:rPr>
@@ -459,6 +459,7 @@
         <w:jc w:val="thaiDistribute"/>
         <w:rPr>
           <w:rFonts w:ascii="TH SarabunIT๙" w:hAnsi="TH SarabunIT๙" w:cs="TH SarabunIT๙"/>
+          <w:spacing w:val="-8"/>
           <w:sz w:val="34"/>
           <w:szCs w:val="34"/>
         </w:rPr>
@@ -502,7 +503,7 @@
           <w:szCs w:val="34"/>
           <w:cs/>
         </w:rPr>
-        <w:t xml:space="preserve">กลุ่มงานคลัง สำนักงานประจำศาลเยาวชนและครอบครัวจังหวัดประจวบคีรีขันธ์ </w:t>
+        <w:t>กลุ่มงานคลัง สำนักงานประจำศาล</w:t>
       </w:r>
       <w:r>
         <w:rPr>
@@ -512,6 +513,16 @@
           <w:szCs w:val="34"/>
           <w:cs/>
         </w:rPr>
+        <w:t xml:space="preserve">จังหวัดเบตง </w:t>
+      </w:r>
+      <w:r>
+        <w:rPr>
+          <w:rFonts w:ascii="TH SarabunIT๙" w:hAnsi="TH SarabunIT๙" w:cs="TH SarabunIT๙" w:hint="cs"/>
+          <w:spacing w:val="-8"/>
+          <w:sz w:val="34"/>
+          <w:szCs w:val="34"/>
+          <w:cs/>
+        </w:rPr>
         <w:t>ต่อ</w:t>
       </w:r>
       <w:r>
@@ -522,8 +533,31 @@
           <w:szCs w:val="34"/>
           <w:cs/>
         </w:rPr>
-        <w:t xml:space="preserve"> 109</w:t>
-      </w:r>
+        <w:t xml:space="preserve"> </w:t>
+      </w:r>
+      <w:r>
+        <w:rPr>
+          <w:rFonts w:ascii="TH SarabunIT๙" w:hAnsi="TH SarabunIT๙" w:cs="TH SarabunIT๙" w:hint="cs"/>
+          <w:spacing w:val="-8"/>
+          <w:sz w:val="34"/>
+          <w:szCs w:val="34"/>
+          <w:cs/>
+        </w:rPr>
+        <w:t>208</w:t>
+      </w:r>
+    </w:p>
+    <w:p>
+      <w:pPr>
+        <w:tabs>
+          <w:tab w:val="left" w:pos="4536"/>
+        </w:tabs>
+        <w:jc w:val="thaiDistribute"/>
+        <w:rPr>
+          <w:rFonts w:ascii="TH SarabunIT๙" w:hAnsi="TH SarabunIT๙" w:cs="TH SarabunIT๙"/>
+          <w:sz w:val="34"/>
+          <w:szCs w:val="34"/>
+        </w:rPr>
+      </w:pPr>
       <w:r>
         <w:rPr>
           <w:rFonts w:ascii="TH SarabunIT๙" w:hAnsi="TH SarabunIT๙" w:cs="TH SarabunIT๙"/>
@@ -542,7 +576,43 @@
           <w:szCs w:val="34"/>
           <w:cs/>
         </w:rPr>
-        <w:t xml:space="preserve">  ศย 307.022/  -</w:t>
+        <w:t xml:space="preserve">  ศย 30</w:t>
+      </w:r>
+      <w:r>
+        <w:rPr>
+          <w:rFonts w:ascii="TH SarabunIT๙" w:hAnsi="TH SarabunIT๙" w:cs="TH SarabunIT๙" w:hint="cs"/>
+          <w:sz w:val="34"/>
+          <w:szCs w:val="34"/>
+          <w:cs/>
+        </w:rPr>
+        <w:t>9</w:t>
+      </w:r>
+      <w:r>
+        <w:rPr>
+          <w:rFonts w:ascii="TH SarabunIT๙" w:hAnsi="TH SarabunIT๙" w:cs="TH SarabunIT๙" w:hint="cs"/>
+          <w:sz w:val="34"/>
+          <w:szCs w:val="34"/>
+          <w:cs/>
+        </w:rPr>
+        <w:t>.0</w:t>
+      </w:r>
+      <w:r>
+        <w:rPr>
+          <w:rFonts w:ascii="TH SarabunIT๙" w:hAnsi="TH SarabunIT๙" w:cs="TH SarabunIT๙" w:hint="cs"/>
+          <w:sz w:val="34"/>
+          <w:szCs w:val="34"/>
+          <w:cs/>
+        </w:rPr>
+        <w:t>06</w:t>
+      </w:r>
+      <w:r>
+        <w:rPr>
+          <w:rFonts w:ascii="TH SarabunIT๙" w:hAnsi="TH SarabunIT๙" w:cs="TH SarabunIT๙" w:hint="cs"/>
+          <w:sz w:val="34"/>
+          <w:szCs w:val="34"/>
+          <w:cs/>
+        </w:rPr>
+        <w:t>/  -</w:t>
       </w:r>
       <w:r>
         <w:rPr>
@@ -588,25 +658,7 @@
           <w:sz w:val="34"/>
           <w:szCs w:val="34"/>
         </w:rPr>
-        <w:t>${</w:t>
-      </w:r>
-      <w:proofErr w:type="spellStart"/>
-      <w:r>
-        <w:rPr>
-          <w:rFonts w:ascii="TH SarabunIT๙" w:hAnsi="TH SarabunIT๙" w:cs="TH SarabunIT๙"/>
-          <w:sz w:val="34"/>
-          <w:szCs w:val="34"/>
-        </w:rPr>
-        <w:t>doc_date</w:t>
-      </w:r>
-      <w:proofErr w:type="spellEnd"/>
-      <w:r>
-        <w:rPr>
-          <w:rFonts w:ascii="TH SarabunIT๙" w:hAnsi="TH SarabunIT๙" w:cs="TH SarabunIT๙"/>
-          <w:sz w:val="34"/>
-          <w:szCs w:val="34"/>
-        </w:rPr>
-        <w:t>}</w:t>
+        <w:t>${doc_date}</w:t>
       </w:r>
       <w:r>
         <w:rPr>
@@ -762,7 +814,34 @@
           <w:szCs w:val="34"/>
           <w:cs/>
         </w:rPr>
-        <w:t>ผู้พิพากษาหัวหน้าศาลเยาวชนและครอบครัวจังหวัดประจวบคีรีขันธ์</w:t>
+        <w:t>ผู้พิพากษาหัวหน้า</w:t>
+      </w:r>
+      <w:r>
+        <w:rPr>
+          <w:rFonts w:ascii="TH SarabunIT๙" w:hAnsi="TH SarabunIT๙" w:cs="TH SarabunIT๙" w:hint="cs"/>
+          <w:sz w:val="34"/>
+          <w:szCs w:val="34"/>
+          <w:cs/>
+        </w:rPr>
+        <w:t>ศาล</w:t>
+      </w:r>
+      <w:r>
+        <w:rPr>
+          <w:rFonts w:ascii="TH SarabunIT๙" w:hAnsi="TH SarabunIT๙" w:cs="TH SarabunIT๙"/>
+          <w:sz w:val="34"/>
+          <w:szCs w:val="34"/>
+          <w:cs/>
+        </w:rPr>
+        <w:t>จังหวัด</w:t>
+      </w:r>
+      <w:r>
+        <w:rPr>
+          <w:rFonts w:ascii="TH SarabunIT๙" w:hAnsi="TH SarabunIT๙" w:cs="TH SarabunIT๙" w:hint="cs"/>
+          <w:sz w:val="34"/>
+          <w:szCs w:val="34"/>
+          <w:cs/>
+        </w:rPr>
+        <w:t>เบตง</w:t>
       </w:r>
     </w:p>
     <w:p>
@@ -946,7 +1025,27 @@
           <w:szCs w:val="34"/>
           <w:cs/>
         </w:rPr>
-        <w:t>สำนักงานประจำศาลเยาวชนและครอบครัวจังหวัดประจวบคีรีขันธ์มีความประสงค์</w:t>
+        <w:t>สำนักงานประจำศาล</w:t>
+      </w:r>
+      <w:r>
+        <w:rPr>
+          <w:rFonts w:ascii="TH SarabunIT๙" w:hAnsi="TH SarabunIT๙" w:cs="TH SarabunIT๙" w:hint="cs"/>
+          <w:spacing w:val="8"/>
+          <w:sz w:val="34"/>
+          <w:szCs w:val="34"/>
+          <w:cs/>
+        </w:rPr>
+        <w:t xml:space="preserve">จังหวัดเบตง </w:t>
+      </w:r>
+      <w:r>
+        <w:rPr>
+          <w:rFonts w:ascii="TH SarabunIT๙" w:hAnsi="TH SarabunIT๙" w:cs="TH SarabunIT๙"/>
+          <w:spacing w:val="8"/>
+          <w:sz w:val="34"/>
+          <w:szCs w:val="34"/>
+          <w:cs/>
+        </w:rPr>
+        <w:t>มีความประสงค์</w:t>
       </w:r>
       <w:r>
         <w:rPr>
@@ -956,7 +1055,47 @@
           <w:szCs w:val="34"/>
           <w:cs/>
         </w:rPr>
-        <w:t>ขอเบิกเงินค่าตอบแทนพิเศษกรณีเปิดทำการศาลในวันหยุด (เวรฟื้นฟู/จับค้น/ตรวจสอบการจับ) และ</w:t>
+        <w:t>ขอเบิกเงินค่าตอบแทนพิเศษกรณีเปิดทำการศาลในวันหยุด</w:t>
+      </w:r>
+      <w:r>
+        <w:rPr>
+          <w:rFonts w:ascii="TH SarabunIT๙" w:hAnsi="TH SarabunIT๙" w:cs="TH SarabunIT๙" w:hint="cs"/>
+          <w:spacing w:val="4"/>
+          <w:sz w:val="34"/>
+          <w:szCs w:val="34"/>
+          <w:cs/>
+        </w:rPr>
+        <w:t>ราชการ</w:t>
+      </w:r>
+      <w:r>
+        <w:rPr>
+          <w:rFonts w:ascii="TH SarabunIT๙" w:hAnsi="TH SarabunIT๙" w:cs="TH SarabunIT๙" w:hint="cs"/>
+          <w:spacing w:val="10"/>
+          <w:sz w:val="34"/>
+          <w:szCs w:val="34"/>
+          <w:cs/>
+        </w:rPr>
+        <w:t>และคำร้องขอปล่อยชั่วคราว</w:t>
+      </w:r>
+      <w:r>
+        <w:rPr>
+          <w:rFonts w:ascii="TH SarabunIT๙" w:hAnsi="TH SarabunIT๙" w:cs="TH SarabunIT๙" w:hint="cs"/>
+          <w:spacing w:val="10"/>
+          <w:sz w:val="34"/>
+          <w:szCs w:val="34"/>
+          <w:cs/>
+        </w:rPr>
+        <w:t xml:space="preserve"> </w:t>
+      </w:r>
+      <w:r>
+        <w:rPr>
+          <w:rFonts w:ascii="TH SarabunIT๙" w:hAnsi="TH SarabunIT๙" w:cs="TH SarabunIT๙"/>
+          <w:spacing w:val="4"/>
+          <w:sz w:val="34"/>
+          <w:szCs w:val="34"/>
+          <w:cs/>
+        </w:rPr>
+        <w:t>และ</w:t>
       </w:r>
       <w:r>
         <w:rPr>
@@ -1052,16 +1191,17 @@
           <w:szCs w:val="34"/>
           <w:cs/>
         </w:rPr>
-        <w:t>ิดทำการศาลในวันหยุด (เวรฟื้นฟู/</w:t>
-      </w:r>
-      <w:r>
-        <w:rPr>
-          <w:rFonts w:ascii="TH SarabunIT๙" w:hAnsi="TH SarabunIT๙" w:cs="TH SarabunIT๙"/>
-          <w:sz w:val="34"/>
-          <w:szCs w:val="34"/>
-          <w:cs/>
-        </w:rPr>
-        <w:t xml:space="preserve">ตรวจสอบการจับ) </w:t>
+        <w:t>ิดทำการศาลในวันหยุด</w:t>
+      </w:r>
+      <w:r>
+        <w:rPr>
+          <w:rFonts w:ascii="TH SarabunIT๙" w:hAnsi="TH SarabunIT๙" w:cs="TH SarabunIT๙" w:hint="cs"/>
+          <w:spacing w:val="10"/>
+          <w:sz w:val="34"/>
+          <w:szCs w:val="34"/>
+          <w:cs/>
+        </w:rPr>
+        <w:t xml:space="preserve">และคำร้องขอปล่อยชั่วคราว </w:t>
       </w:r>
       <w:r>
         <w:rPr>
@@ -1104,25 +1244,7 @@
           <w:sz w:val="34"/>
           <w:szCs w:val="34"/>
         </w:rPr>
-        <w:t>${</w:t>
-      </w:r>
-      <w:proofErr w:type="spellStart"/>
-      <w:r>
-        <w:rPr>
-          <w:rFonts w:ascii="TH SarabunIT๙" w:hAnsi="TH SarabunIT๙" w:cs="TH SarabunIT๙"/>
-          <w:sz w:val="34"/>
-          <w:szCs w:val="34"/>
-        </w:rPr>
-        <w:t>price_d</w:t>
-      </w:r>
-      <w:proofErr w:type="spellEnd"/>
-      <w:r>
-        <w:rPr>
-          <w:rFonts w:ascii="TH SarabunIT๙" w:hAnsi="TH SarabunIT๙" w:cs="TH SarabunIT๙"/>
-          <w:sz w:val="34"/>
-          <w:szCs w:val="34"/>
-        </w:rPr>
-        <w:t>}</w:t>
+        <w:t>${price_d}</w:t>
       </w:r>
       <w:r>
         <w:rPr>
@@ -1207,33 +1329,13 @@
         </w:rPr>
         <w:t xml:space="preserve">จำนวน </w:t>
       </w:r>
-      <w:bookmarkStart w:id="0" w:name="_GoBack"/>
-      <w:bookmarkEnd w:id="0"/>
-      <w:r>
-        <w:rPr>
-          <w:rFonts w:ascii="TH SarabunIT๙" w:hAnsi="TH SarabunIT๙" w:cs="TH SarabunIT๙"/>
-          <w:sz w:val="34"/>
-          <w:szCs w:val="34"/>
-        </w:rPr>
-        <w:t>${</w:t>
-      </w:r>
-      <w:proofErr w:type="spellStart"/>
-      <w:r>
-        <w:rPr>
-          <w:rFonts w:ascii="TH SarabunIT๙" w:hAnsi="TH SarabunIT๙" w:cs="TH SarabunIT๙"/>
-          <w:sz w:val="34"/>
-          <w:szCs w:val="34"/>
-        </w:rPr>
-        <w:t>price_n</w:t>
-      </w:r>
-      <w:proofErr w:type="spellEnd"/>
-      <w:r>
-        <w:rPr>
-          <w:rFonts w:ascii="TH SarabunIT๙" w:hAnsi="TH SarabunIT๙" w:cs="TH SarabunIT๙"/>
-          <w:sz w:val="34"/>
-          <w:szCs w:val="34"/>
-        </w:rPr>
-        <w:t>}</w:t>
+      <w:r>
+        <w:rPr>
+          <w:rFonts w:ascii="TH SarabunIT๙" w:hAnsi="TH SarabunIT๙" w:cs="TH SarabunIT๙"/>
+          <w:sz w:val="34"/>
+          <w:szCs w:val="34"/>
+        </w:rPr>
+        <w:t>${price_n}</w:t>
       </w:r>
       <w:r>
         <w:rPr>
@@ -1418,7 +1520,6 @@
         <w:tc>
           <w:tcPr>
             <w:tcW w:w="943" w:type="dxa"/>
-            <w:shd w:val="clear" w:color="auto" w:fill="auto"/>
           </w:tcPr>
           <w:p>
             <w:pPr>
@@ -1434,14 +1535,13 @@
                 <w:sz w:val="34"/>
                 <w:szCs w:val="34"/>
               </w:rPr>
-              <w:t>${n0}</w:t>
+              <w:t>${n}</w:t>
             </w:r>
           </w:p>
         </w:tc>
         <w:tc>
           <w:tcPr>
             <w:tcW w:w="3728" w:type="dxa"/>
-            <w:shd w:val="clear" w:color="auto" w:fill="auto"/>
           </w:tcPr>
           <w:p>
             <w:pPr>
@@ -1461,14 +1561,13 @@
                 <w:sz w:val="34"/>
                 <w:szCs w:val="34"/>
               </w:rPr>
-              <w:t>${name_n0}</w:t>
+              <w:t>${name}</w:t>
             </w:r>
           </w:p>
         </w:tc>
         <w:tc>
           <w:tcPr>
             <w:tcW w:w="1518" w:type="dxa"/>
-            <w:shd w:val="clear" w:color="auto" w:fill="auto"/>
           </w:tcPr>
           <w:p>
             <w:pPr>
@@ -1489,14 +1588,13 @@
                 <w:sz w:val="34"/>
                 <w:szCs w:val="34"/>
               </w:rPr>
-              <w:t>${t3_n0}</w:t>
+              <w:t>${t3_n}</w:t>
             </w:r>
           </w:p>
         </w:tc>
         <w:tc>
           <w:tcPr>
             <w:tcW w:w="2315" w:type="dxa"/>
-            <w:shd w:val="clear" w:color="auto" w:fill="auto"/>
           </w:tcPr>
           <w:p>
             <w:pPr>
@@ -1516,1039 +1614,7 @@
                 <w:sz w:val="34"/>
                 <w:szCs w:val="34"/>
               </w:rPr>
-              <w:t>${price_n0}</w:t>
-            </w:r>
-          </w:p>
-        </w:tc>
-      </w:tr>
-      <w:tr>
-        <w:tc>
-          <w:tcPr>
-            <w:tcW w:w="943" w:type="dxa"/>
-            <w:shd w:val="clear" w:color="auto" w:fill="auto"/>
-          </w:tcPr>
-          <w:p>
-            <w:pPr>
-              <w:jc w:val="right"/>
-              <w:rPr>
-                <w:rFonts w:ascii="TH SarabunIT๙" w:hAnsi="TH SarabunIT๙" w:cs="TH SarabunIT๙"/>
-                <w:spacing w:val="4"/>
-                <w:sz w:val="34"/>
-                <w:szCs w:val="34"/>
-              </w:rPr>
-            </w:pPr>
-            <w:r>
-              <w:rPr>
-                <w:rFonts w:ascii="TH SarabunIT๙" w:hAnsi="TH SarabunIT๙" w:cs="TH SarabunIT๙"/>
-                <w:spacing w:val="4"/>
-                <w:sz w:val="34"/>
-                <w:szCs w:val="34"/>
-              </w:rPr>
-              <w:t>${n1}</w:t>
-            </w:r>
-          </w:p>
-        </w:tc>
-        <w:tc>
-          <w:tcPr>
-            <w:tcW w:w="3728" w:type="dxa"/>
-            <w:shd w:val="clear" w:color="auto" w:fill="auto"/>
-          </w:tcPr>
-          <w:p>
-            <w:pPr>
-              <w:ind w:right="-6"/>
-              <w:jc w:val="thaiDistribute"/>
-              <w:rPr>
-                <w:rFonts w:ascii="TH SarabunIT๙" w:hAnsi="TH SarabunIT๙" w:cs="TH SarabunIT๙"/>
-                <w:spacing w:val="4"/>
-                <w:sz w:val="34"/>
-                <w:szCs w:val="34"/>
-              </w:rPr>
-            </w:pPr>
-            <w:r>
-              <w:rPr>
-                <w:rFonts w:ascii="TH SarabunIT๙" w:hAnsi="TH SarabunIT๙" w:cs="TH SarabunIT๙"/>
-                <w:spacing w:val="4"/>
-                <w:sz w:val="34"/>
-                <w:szCs w:val="34"/>
-              </w:rPr>
-              <w:t>${name_n1}</w:t>
-            </w:r>
-          </w:p>
-        </w:tc>
-        <w:tc>
-          <w:tcPr>
-            <w:tcW w:w="1518" w:type="dxa"/>
-            <w:shd w:val="clear" w:color="auto" w:fill="auto"/>
-          </w:tcPr>
-          <w:p>
-            <w:pPr>
-              <w:ind w:left="315" w:right="-6" w:hanging="315"/>
-              <w:jc w:val="right"/>
-              <w:rPr>
-                <w:rFonts w:ascii="TH SarabunIT๙" w:hAnsi="TH SarabunIT๙" w:cs="TH SarabunIT๙"/>
-                <w:spacing w:val="4"/>
-                <w:sz w:val="34"/>
-                <w:szCs w:val="34"/>
-                <w:cs/>
-              </w:rPr>
-            </w:pPr>
-            <w:r>
-              <w:rPr>
-                <w:rFonts w:ascii="TH SarabunIT๙" w:hAnsi="TH SarabunIT๙" w:cs="TH SarabunIT๙"/>
-                <w:spacing w:val="4"/>
-                <w:sz w:val="34"/>
-                <w:szCs w:val="34"/>
-              </w:rPr>
-              <w:t>${t3_n1}</w:t>
-            </w:r>
-          </w:p>
-        </w:tc>
-        <w:tc>
-          <w:tcPr>
-            <w:tcW w:w="2315" w:type="dxa"/>
-            <w:shd w:val="clear" w:color="auto" w:fill="auto"/>
-          </w:tcPr>
-          <w:p>
-            <w:pPr>
-              <w:ind w:right="-102"/>
-              <w:jc w:val="right"/>
-              <w:rPr>
-                <w:rFonts w:ascii="TH SarabunIT๙" w:hAnsi="TH SarabunIT๙" w:cs="TH SarabunIT๙"/>
-              </w:rPr>
-            </w:pPr>
-            <w:r>
-              <w:rPr>
-                <w:rFonts w:ascii="TH SarabunIT๙" w:hAnsi="TH SarabunIT๙" w:cs="TH SarabunIT๙"/>
-                <w:spacing w:val="4"/>
-                <w:sz w:val="34"/>
-                <w:szCs w:val="34"/>
-              </w:rPr>
-              <w:t>${price_n1}</w:t>
-            </w:r>
-          </w:p>
-        </w:tc>
-      </w:tr>
-      <w:tr>
-        <w:tc>
-          <w:tcPr>
-            <w:tcW w:w="943" w:type="dxa"/>
-            <w:shd w:val="clear" w:color="auto" w:fill="auto"/>
-          </w:tcPr>
-          <w:p>
-            <w:pPr>
-              <w:jc w:val="right"/>
-              <w:rPr>
-                <w:rFonts w:ascii="TH SarabunIT๙" w:hAnsi="TH SarabunIT๙" w:cs="TH SarabunIT๙"/>
-              </w:rPr>
-            </w:pPr>
-            <w:r>
-              <w:rPr>
-                <w:rFonts w:ascii="TH SarabunIT๙" w:hAnsi="TH SarabunIT๙" w:cs="TH SarabunIT๙"/>
-                <w:spacing w:val="4"/>
-                <w:sz w:val="34"/>
-                <w:szCs w:val="34"/>
-              </w:rPr>
-              <w:t>${n2}</w:t>
-            </w:r>
-          </w:p>
-        </w:tc>
-        <w:tc>
-          <w:tcPr>
-            <w:tcW w:w="3728" w:type="dxa"/>
-            <w:shd w:val="clear" w:color="auto" w:fill="auto"/>
-          </w:tcPr>
-          <w:p>
-            <w:pPr>
-              <w:ind w:right="-6"/>
-              <w:jc w:val="thaiDistribute"/>
-              <w:rPr>
-                <w:rFonts w:ascii="TH SarabunIT๙" w:hAnsi="TH SarabunIT๙" w:cs="TH SarabunIT๙"/>
-                <w:spacing w:val="4"/>
-                <w:sz w:val="34"/>
-                <w:szCs w:val="34"/>
-              </w:rPr>
-            </w:pPr>
-            <w:r>
-              <w:rPr>
-                <w:rFonts w:ascii="TH SarabunIT๙" w:hAnsi="TH SarabunIT๙" w:cs="TH SarabunIT๙"/>
-                <w:spacing w:val="4"/>
-                <w:sz w:val="34"/>
-                <w:szCs w:val="34"/>
-              </w:rPr>
-              <w:t>${name_n2}</w:t>
-            </w:r>
-          </w:p>
-        </w:tc>
-        <w:tc>
-          <w:tcPr>
-            <w:tcW w:w="1518" w:type="dxa"/>
-            <w:shd w:val="clear" w:color="auto" w:fill="auto"/>
-          </w:tcPr>
-          <w:p>
-            <w:pPr>
-              <w:jc w:val="right"/>
-              <w:rPr>
-                <w:rFonts w:ascii="TH SarabunIT๙" w:hAnsi="TH SarabunIT๙" w:cs="TH SarabunIT๙"/>
-              </w:rPr>
-            </w:pPr>
-            <w:r>
-              <w:rPr>
-                <w:rFonts w:ascii="TH SarabunIT๙" w:hAnsi="TH SarabunIT๙" w:cs="TH SarabunIT๙"/>
-                <w:spacing w:val="4"/>
-                <w:sz w:val="34"/>
-                <w:szCs w:val="34"/>
-              </w:rPr>
-              <w:t>${t3_n2}</w:t>
-            </w:r>
-          </w:p>
-        </w:tc>
-        <w:tc>
-          <w:tcPr>
-            <w:tcW w:w="2315" w:type="dxa"/>
-            <w:shd w:val="clear" w:color="auto" w:fill="auto"/>
-          </w:tcPr>
-          <w:p>
-            <w:pPr>
-              <w:ind w:right="-102"/>
-              <w:jc w:val="right"/>
-              <w:rPr>
-                <w:rFonts w:ascii="TH SarabunIT๙" w:hAnsi="TH SarabunIT๙" w:cs="TH SarabunIT๙"/>
-              </w:rPr>
-            </w:pPr>
-            <w:r>
-              <w:rPr>
-                <w:rFonts w:ascii="TH SarabunIT๙" w:hAnsi="TH SarabunIT๙" w:cs="TH SarabunIT๙"/>
-                <w:spacing w:val="4"/>
-                <w:sz w:val="34"/>
-                <w:szCs w:val="34"/>
-              </w:rPr>
-              <w:t>${price_n2}</w:t>
-            </w:r>
-          </w:p>
-        </w:tc>
-      </w:tr>
-      <w:tr>
-        <w:tc>
-          <w:tcPr>
-            <w:tcW w:w="943" w:type="dxa"/>
-            <w:shd w:val="clear" w:color="auto" w:fill="auto"/>
-          </w:tcPr>
-          <w:p>
-            <w:pPr>
-              <w:jc w:val="right"/>
-              <w:rPr>
-                <w:rFonts w:ascii="TH SarabunIT๙" w:hAnsi="TH SarabunIT๙" w:cs="TH SarabunIT๙"/>
-              </w:rPr>
-            </w:pPr>
-            <w:r>
-              <w:rPr>
-                <w:rFonts w:ascii="TH SarabunIT๙" w:hAnsi="TH SarabunIT๙" w:cs="TH SarabunIT๙"/>
-                <w:spacing w:val="4"/>
-                <w:sz w:val="34"/>
-                <w:szCs w:val="34"/>
-              </w:rPr>
-              <w:t>${n3}</w:t>
-            </w:r>
-          </w:p>
-        </w:tc>
-        <w:tc>
-          <w:tcPr>
-            <w:tcW w:w="3728" w:type="dxa"/>
-            <w:shd w:val="clear" w:color="auto" w:fill="auto"/>
-          </w:tcPr>
-          <w:p>
-            <w:pPr>
-              <w:ind w:right="-6"/>
-              <w:jc w:val="thaiDistribute"/>
-              <w:rPr>
-                <w:rFonts w:ascii="TH SarabunIT๙" w:hAnsi="TH SarabunIT๙" w:cs="TH SarabunIT๙"/>
-                <w:spacing w:val="4"/>
-                <w:sz w:val="34"/>
-                <w:szCs w:val="34"/>
-              </w:rPr>
-            </w:pPr>
-            <w:r>
-              <w:rPr>
-                <w:rFonts w:ascii="TH SarabunIT๙" w:hAnsi="TH SarabunIT๙" w:cs="TH SarabunIT๙"/>
-                <w:spacing w:val="4"/>
-                <w:sz w:val="34"/>
-                <w:szCs w:val="34"/>
-              </w:rPr>
-              <w:t>${name_n3}</w:t>
-            </w:r>
-          </w:p>
-        </w:tc>
-        <w:tc>
-          <w:tcPr>
-            <w:tcW w:w="1518" w:type="dxa"/>
-            <w:shd w:val="clear" w:color="auto" w:fill="auto"/>
-          </w:tcPr>
-          <w:p>
-            <w:pPr>
-              <w:jc w:val="right"/>
-              <w:rPr>
-                <w:rFonts w:ascii="TH SarabunIT๙" w:hAnsi="TH SarabunIT๙" w:cs="TH SarabunIT๙"/>
-              </w:rPr>
-            </w:pPr>
-            <w:r>
-              <w:rPr>
-                <w:rFonts w:ascii="TH SarabunIT๙" w:hAnsi="TH SarabunIT๙" w:cs="TH SarabunIT๙"/>
-                <w:spacing w:val="4"/>
-                <w:sz w:val="34"/>
-                <w:szCs w:val="34"/>
-              </w:rPr>
-              <w:t>${t3_n3}</w:t>
-            </w:r>
-          </w:p>
-        </w:tc>
-        <w:tc>
-          <w:tcPr>
-            <w:tcW w:w="2315" w:type="dxa"/>
-            <w:shd w:val="clear" w:color="auto" w:fill="auto"/>
-          </w:tcPr>
-          <w:p>
-            <w:pPr>
-              <w:ind w:right="-102"/>
-              <w:jc w:val="right"/>
-              <w:rPr>
-                <w:rFonts w:ascii="TH SarabunIT๙" w:hAnsi="TH SarabunIT๙" w:cs="TH SarabunIT๙"/>
-              </w:rPr>
-            </w:pPr>
-            <w:r>
-              <w:rPr>
-                <w:rFonts w:ascii="TH SarabunIT๙" w:hAnsi="TH SarabunIT๙" w:cs="TH SarabunIT๙"/>
-                <w:spacing w:val="4"/>
-                <w:sz w:val="34"/>
-                <w:szCs w:val="34"/>
-              </w:rPr>
-              <w:t>${price_n3}</w:t>
-            </w:r>
-          </w:p>
-        </w:tc>
-      </w:tr>
-      <w:tr>
-        <w:tc>
-          <w:tcPr>
-            <w:tcW w:w="943" w:type="dxa"/>
-            <w:shd w:val="clear" w:color="auto" w:fill="auto"/>
-          </w:tcPr>
-          <w:p>
-            <w:pPr>
-              <w:jc w:val="right"/>
-              <w:rPr>
-                <w:rFonts w:ascii="TH SarabunIT๙" w:hAnsi="TH SarabunIT๙" w:cs="TH SarabunIT๙"/>
-              </w:rPr>
-            </w:pPr>
-            <w:r>
-              <w:rPr>
-                <w:rFonts w:ascii="TH SarabunIT๙" w:hAnsi="TH SarabunIT๙" w:cs="TH SarabunIT๙"/>
-                <w:spacing w:val="4"/>
-                <w:sz w:val="34"/>
-                <w:szCs w:val="34"/>
-              </w:rPr>
-              <w:t>${n4}</w:t>
-            </w:r>
-          </w:p>
-        </w:tc>
-        <w:tc>
-          <w:tcPr>
-            <w:tcW w:w="3728" w:type="dxa"/>
-            <w:shd w:val="clear" w:color="auto" w:fill="auto"/>
-          </w:tcPr>
-          <w:p>
-            <w:pPr>
-              <w:ind w:right="-6"/>
-              <w:jc w:val="thaiDistribute"/>
-              <w:rPr>
-                <w:rFonts w:ascii="TH SarabunIT๙" w:hAnsi="TH SarabunIT๙" w:cs="TH SarabunIT๙"/>
-                <w:spacing w:val="4"/>
-                <w:sz w:val="34"/>
-                <w:szCs w:val="34"/>
-              </w:rPr>
-            </w:pPr>
-            <w:r>
-              <w:rPr>
-                <w:rFonts w:ascii="TH SarabunIT๙" w:hAnsi="TH SarabunIT๙" w:cs="TH SarabunIT๙"/>
-                <w:spacing w:val="4"/>
-                <w:sz w:val="34"/>
-                <w:szCs w:val="34"/>
-              </w:rPr>
-              <w:t>${name_n4}</w:t>
-            </w:r>
-          </w:p>
-        </w:tc>
-        <w:tc>
-          <w:tcPr>
-            <w:tcW w:w="1518" w:type="dxa"/>
-            <w:shd w:val="clear" w:color="auto" w:fill="auto"/>
-          </w:tcPr>
-          <w:p>
-            <w:pPr>
-              <w:jc w:val="right"/>
-              <w:rPr>
-                <w:rFonts w:ascii="TH SarabunIT๙" w:hAnsi="TH SarabunIT๙" w:cs="TH SarabunIT๙"/>
-              </w:rPr>
-            </w:pPr>
-            <w:r>
-              <w:rPr>
-                <w:rFonts w:ascii="TH SarabunIT๙" w:hAnsi="TH SarabunIT๙" w:cs="TH SarabunIT๙"/>
-                <w:spacing w:val="4"/>
-                <w:sz w:val="34"/>
-                <w:szCs w:val="34"/>
-              </w:rPr>
-              <w:t>${t3_n4}</w:t>
-            </w:r>
-          </w:p>
-        </w:tc>
-        <w:tc>
-          <w:tcPr>
-            <w:tcW w:w="2315" w:type="dxa"/>
-            <w:shd w:val="clear" w:color="auto" w:fill="auto"/>
-          </w:tcPr>
-          <w:p>
-            <w:pPr>
-              <w:ind w:right="-102"/>
-              <w:jc w:val="right"/>
-              <w:rPr>
-                <w:rFonts w:ascii="TH SarabunIT๙" w:hAnsi="TH SarabunIT๙" w:cs="TH SarabunIT๙"/>
-              </w:rPr>
-            </w:pPr>
-            <w:r>
-              <w:rPr>
-                <w:rFonts w:ascii="TH SarabunIT๙" w:hAnsi="TH SarabunIT๙" w:cs="TH SarabunIT๙"/>
-                <w:spacing w:val="4"/>
-                <w:sz w:val="34"/>
-                <w:szCs w:val="34"/>
-              </w:rPr>
-              <w:t>${price_n4}</w:t>
-            </w:r>
-          </w:p>
-        </w:tc>
-      </w:tr>
-      <w:tr>
-        <w:tc>
-          <w:tcPr>
-            <w:tcW w:w="943" w:type="dxa"/>
-            <w:shd w:val="clear" w:color="auto" w:fill="auto"/>
-          </w:tcPr>
-          <w:p>
-            <w:pPr>
-              <w:jc w:val="right"/>
-              <w:rPr>
-                <w:rFonts w:ascii="TH SarabunIT๙" w:hAnsi="TH SarabunIT๙" w:cs="TH SarabunIT๙"/>
-              </w:rPr>
-            </w:pPr>
-            <w:r>
-              <w:rPr>
-                <w:rFonts w:ascii="TH SarabunIT๙" w:hAnsi="TH SarabunIT๙" w:cs="TH SarabunIT๙"/>
-                <w:spacing w:val="4"/>
-                <w:sz w:val="34"/>
-                <w:szCs w:val="34"/>
-              </w:rPr>
-              <w:t>${n5}</w:t>
-            </w:r>
-          </w:p>
-        </w:tc>
-        <w:tc>
-          <w:tcPr>
-            <w:tcW w:w="3728" w:type="dxa"/>
-            <w:shd w:val="clear" w:color="auto" w:fill="auto"/>
-          </w:tcPr>
-          <w:p>
-            <w:pPr>
-              <w:ind w:right="-6"/>
-              <w:jc w:val="thaiDistribute"/>
-              <w:rPr>
-                <w:rFonts w:ascii="TH SarabunIT๙" w:hAnsi="TH SarabunIT๙" w:cs="TH SarabunIT๙"/>
-                <w:spacing w:val="4"/>
-                <w:sz w:val="34"/>
-                <w:szCs w:val="34"/>
-              </w:rPr>
-            </w:pPr>
-            <w:r>
-              <w:rPr>
-                <w:rFonts w:ascii="TH SarabunIT๙" w:hAnsi="TH SarabunIT๙" w:cs="TH SarabunIT๙"/>
-                <w:spacing w:val="4"/>
-                <w:sz w:val="34"/>
-                <w:szCs w:val="34"/>
-              </w:rPr>
-              <w:t>${name_n5}</w:t>
-            </w:r>
-          </w:p>
-        </w:tc>
-        <w:tc>
-          <w:tcPr>
-            <w:tcW w:w="1518" w:type="dxa"/>
-            <w:shd w:val="clear" w:color="auto" w:fill="auto"/>
-          </w:tcPr>
-          <w:p>
-            <w:pPr>
-              <w:jc w:val="right"/>
-              <w:rPr>
-                <w:rFonts w:ascii="TH SarabunIT๙" w:hAnsi="TH SarabunIT๙" w:cs="TH SarabunIT๙"/>
-              </w:rPr>
-            </w:pPr>
-            <w:r>
-              <w:rPr>
-                <w:rFonts w:ascii="TH SarabunIT๙" w:hAnsi="TH SarabunIT๙" w:cs="TH SarabunIT๙"/>
-                <w:spacing w:val="4"/>
-                <w:sz w:val="34"/>
-                <w:szCs w:val="34"/>
-              </w:rPr>
-              <w:t>${t3_n5}</w:t>
-            </w:r>
-          </w:p>
-        </w:tc>
-        <w:tc>
-          <w:tcPr>
-            <w:tcW w:w="2315" w:type="dxa"/>
-            <w:shd w:val="clear" w:color="auto" w:fill="auto"/>
-          </w:tcPr>
-          <w:p>
-            <w:pPr>
-              <w:ind w:right="-102"/>
-              <w:jc w:val="right"/>
-              <w:rPr>
-                <w:rFonts w:ascii="TH SarabunIT๙" w:hAnsi="TH SarabunIT๙" w:cs="TH SarabunIT๙"/>
-              </w:rPr>
-            </w:pPr>
-            <w:r>
-              <w:rPr>
-                <w:rFonts w:ascii="TH SarabunIT๙" w:hAnsi="TH SarabunIT๙" w:cs="TH SarabunIT๙"/>
-                <w:spacing w:val="4"/>
-                <w:sz w:val="34"/>
-                <w:szCs w:val="34"/>
-              </w:rPr>
-              <w:t>${price_n5}</w:t>
-            </w:r>
-          </w:p>
-        </w:tc>
-      </w:tr>
-      <w:tr>
-        <w:tc>
-          <w:tcPr>
-            <w:tcW w:w="943" w:type="dxa"/>
-            <w:shd w:val="clear" w:color="auto" w:fill="auto"/>
-          </w:tcPr>
-          <w:p>
-            <w:pPr>
-              <w:jc w:val="right"/>
-              <w:rPr>
-                <w:rFonts w:ascii="TH SarabunIT๙" w:hAnsi="TH SarabunIT๙" w:cs="TH SarabunIT๙"/>
-              </w:rPr>
-            </w:pPr>
-            <w:r>
-              <w:rPr>
-                <w:rFonts w:ascii="TH SarabunIT๙" w:hAnsi="TH SarabunIT๙" w:cs="TH SarabunIT๙"/>
-                <w:spacing w:val="4"/>
-                <w:sz w:val="34"/>
-                <w:szCs w:val="34"/>
-              </w:rPr>
-              <w:t>${n6}</w:t>
-            </w:r>
-          </w:p>
-        </w:tc>
-        <w:tc>
-          <w:tcPr>
-            <w:tcW w:w="3728" w:type="dxa"/>
-            <w:shd w:val="clear" w:color="auto" w:fill="auto"/>
-          </w:tcPr>
-          <w:p>
-            <w:pPr>
-              <w:ind w:right="-6"/>
-              <w:jc w:val="thaiDistribute"/>
-              <w:rPr>
-                <w:rFonts w:ascii="TH SarabunIT๙" w:hAnsi="TH SarabunIT๙" w:cs="TH SarabunIT๙"/>
-                <w:spacing w:val="4"/>
-                <w:sz w:val="34"/>
-                <w:szCs w:val="34"/>
-              </w:rPr>
-            </w:pPr>
-            <w:r>
-              <w:rPr>
-                <w:rFonts w:ascii="TH SarabunIT๙" w:hAnsi="TH SarabunIT๙" w:cs="TH SarabunIT๙"/>
-                <w:spacing w:val="4"/>
-                <w:sz w:val="34"/>
-                <w:szCs w:val="34"/>
-              </w:rPr>
-              <w:t>${name_n6}</w:t>
-            </w:r>
-          </w:p>
-        </w:tc>
-        <w:tc>
-          <w:tcPr>
-            <w:tcW w:w="1518" w:type="dxa"/>
-            <w:shd w:val="clear" w:color="auto" w:fill="auto"/>
-          </w:tcPr>
-          <w:p>
-            <w:pPr>
-              <w:jc w:val="right"/>
-              <w:rPr>
-                <w:rFonts w:ascii="TH SarabunIT๙" w:hAnsi="TH SarabunIT๙" w:cs="TH SarabunIT๙"/>
-              </w:rPr>
-            </w:pPr>
-            <w:r>
-              <w:rPr>
-                <w:rFonts w:ascii="TH SarabunIT๙" w:hAnsi="TH SarabunIT๙" w:cs="TH SarabunIT๙"/>
-                <w:spacing w:val="4"/>
-                <w:sz w:val="34"/>
-                <w:szCs w:val="34"/>
-              </w:rPr>
-              <w:t>${t3_n6}</w:t>
-            </w:r>
-          </w:p>
-        </w:tc>
-        <w:tc>
-          <w:tcPr>
-            <w:tcW w:w="2315" w:type="dxa"/>
-            <w:shd w:val="clear" w:color="auto" w:fill="auto"/>
-          </w:tcPr>
-          <w:p>
-            <w:pPr>
-              <w:ind w:right="-102"/>
-              <w:jc w:val="right"/>
-              <w:rPr>
-                <w:rFonts w:ascii="TH SarabunIT๙" w:hAnsi="TH SarabunIT๙" w:cs="TH SarabunIT๙"/>
-              </w:rPr>
-            </w:pPr>
-            <w:r>
-              <w:rPr>
-                <w:rFonts w:ascii="TH SarabunIT๙" w:hAnsi="TH SarabunIT๙" w:cs="TH SarabunIT๙"/>
-                <w:spacing w:val="4"/>
-                <w:sz w:val="34"/>
-                <w:szCs w:val="34"/>
-              </w:rPr>
-              <w:t>${price_n6}</w:t>
-            </w:r>
-          </w:p>
-        </w:tc>
-      </w:tr>
-      <w:tr>
-        <w:tc>
-          <w:tcPr>
-            <w:tcW w:w="943" w:type="dxa"/>
-            <w:shd w:val="clear" w:color="auto" w:fill="auto"/>
-          </w:tcPr>
-          <w:p>
-            <w:pPr>
-              <w:jc w:val="right"/>
-              <w:rPr>
-                <w:rFonts w:ascii="TH SarabunIT๙" w:hAnsi="TH SarabunIT๙" w:cs="TH SarabunIT๙"/>
-              </w:rPr>
-            </w:pPr>
-            <w:r>
-              <w:rPr>
-                <w:rFonts w:ascii="TH SarabunIT๙" w:hAnsi="TH SarabunIT๙" w:cs="TH SarabunIT๙"/>
-                <w:spacing w:val="4"/>
-                <w:sz w:val="34"/>
-                <w:szCs w:val="34"/>
-              </w:rPr>
-              <w:t>${n7}</w:t>
-            </w:r>
-          </w:p>
-        </w:tc>
-        <w:tc>
-          <w:tcPr>
-            <w:tcW w:w="3728" w:type="dxa"/>
-            <w:shd w:val="clear" w:color="auto" w:fill="auto"/>
-          </w:tcPr>
-          <w:p>
-            <w:pPr>
-              <w:ind w:right="-6"/>
-              <w:jc w:val="thaiDistribute"/>
-              <w:rPr>
-                <w:rFonts w:ascii="TH SarabunIT๙" w:hAnsi="TH SarabunIT๙" w:cs="TH SarabunIT๙"/>
-                <w:spacing w:val="4"/>
-                <w:sz w:val="34"/>
-                <w:szCs w:val="34"/>
-              </w:rPr>
-            </w:pPr>
-            <w:r>
-              <w:rPr>
-                <w:rFonts w:ascii="TH SarabunIT๙" w:hAnsi="TH SarabunIT๙" w:cs="TH SarabunIT๙"/>
-                <w:spacing w:val="4"/>
-                <w:sz w:val="34"/>
-                <w:szCs w:val="34"/>
-              </w:rPr>
-              <w:t>${name_n7}</w:t>
-            </w:r>
-          </w:p>
-        </w:tc>
-        <w:tc>
-          <w:tcPr>
-            <w:tcW w:w="1518" w:type="dxa"/>
-            <w:shd w:val="clear" w:color="auto" w:fill="auto"/>
-          </w:tcPr>
-          <w:p>
-            <w:pPr>
-              <w:jc w:val="right"/>
-              <w:rPr>
-                <w:rFonts w:ascii="TH SarabunIT๙" w:hAnsi="TH SarabunIT๙" w:cs="TH SarabunIT๙"/>
-              </w:rPr>
-            </w:pPr>
-            <w:r>
-              <w:rPr>
-                <w:rFonts w:ascii="TH SarabunIT๙" w:hAnsi="TH SarabunIT๙" w:cs="TH SarabunIT๙"/>
-                <w:spacing w:val="4"/>
-                <w:sz w:val="34"/>
-                <w:szCs w:val="34"/>
-              </w:rPr>
-              <w:t>${t3_n7}</w:t>
-            </w:r>
-          </w:p>
-        </w:tc>
-        <w:tc>
-          <w:tcPr>
-            <w:tcW w:w="2315" w:type="dxa"/>
-            <w:shd w:val="clear" w:color="auto" w:fill="auto"/>
-          </w:tcPr>
-          <w:p>
-            <w:pPr>
-              <w:ind w:right="-102"/>
-              <w:jc w:val="right"/>
-              <w:rPr>
-                <w:rFonts w:ascii="TH SarabunIT๙" w:hAnsi="TH SarabunIT๙" w:cs="TH SarabunIT๙"/>
-              </w:rPr>
-            </w:pPr>
-            <w:r>
-              <w:rPr>
-                <w:rFonts w:ascii="TH SarabunIT๙" w:hAnsi="TH SarabunIT๙" w:cs="TH SarabunIT๙"/>
-                <w:spacing w:val="4"/>
-                <w:sz w:val="34"/>
-                <w:szCs w:val="34"/>
-              </w:rPr>
-              <w:t>${price_n7}</w:t>
-            </w:r>
-          </w:p>
-        </w:tc>
-      </w:tr>
-      <w:tr>
-        <w:tc>
-          <w:tcPr>
-            <w:tcW w:w="943" w:type="dxa"/>
-            <w:shd w:val="clear" w:color="auto" w:fill="auto"/>
-          </w:tcPr>
-          <w:p>
-            <w:pPr>
-              <w:jc w:val="right"/>
-              <w:rPr>
-                <w:rFonts w:ascii="TH SarabunIT๙" w:hAnsi="TH SarabunIT๙" w:cs="TH SarabunIT๙"/>
-              </w:rPr>
-            </w:pPr>
-            <w:r>
-              <w:rPr>
-                <w:rFonts w:ascii="TH SarabunIT๙" w:hAnsi="TH SarabunIT๙" w:cs="TH SarabunIT๙"/>
-                <w:spacing w:val="4"/>
-                <w:sz w:val="34"/>
-                <w:szCs w:val="34"/>
-              </w:rPr>
-              <w:t>${n8}</w:t>
-            </w:r>
-          </w:p>
-        </w:tc>
-        <w:tc>
-          <w:tcPr>
-            <w:tcW w:w="3728" w:type="dxa"/>
-            <w:shd w:val="clear" w:color="auto" w:fill="auto"/>
-          </w:tcPr>
-          <w:p>
-            <w:pPr>
-              <w:ind w:right="-6"/>
-              <w:jc w:val="thaiDistribute"/>
-              <w:rPr>
-                <w:rFonts w:ascii="TH SarabunIT๙" w:hAnsi="TH SarabunIT๙" w:cs="TH SarabunIT๙"/>
-                <w:spacing w:val="4"/>
-                <w:sz w:val="34"/>
-                <w:szCs w:val="34"/>
-              </w:rPr>
-            </w:pPr>
-            <w:r>
-              <w:rPr>
-                <w:rFonts w:ascii="TH SarabunIT๙" w:hAnsi="TH SarabunIT๙" w:cs="TH SarabunIT๙"/>
-                <w:spacing w:val="4"/>
-                <w:sz w:val="34"/>
-                <w:szCs w:val="34"/>
-              </w:rPr>
-              <w:t>${name_n8}</w:t>
-            </w:r>
-          </w:p>
-        </w:tc>
-        <w:tc>
-          <w:tcPr>
-            <w:tcW w:w="1518" w:type="dxa"/>
-            <w:shd w:val="clear" w:color="auto" w:fill="auto"/>
-          </w:tcPr>
-          <w:p>
-            <w:pPr>
-              <w:jc w:val="right"/>
-              <w:rPr>
-                <w:rFonts w:ascii="TH SarabunIT๙" w:hAnsi="TH SarabunIT๙" w:cs="TH SarabunIT๙"/>
-              </w:rPr>
-            </w:pPr>
-            <w:r>
-              <w:rPr>
-                <w:rFonts w:ascii="TH SarabunIT๙" w:hAnsi="TH SarabunIT๙" w:cs="TH SarabunIT๙"/>
-                <w:spacing w:val="4"/>
-                <w:sz w:val="34"/>
-                <w:szCs w:val="34"/>
-              </w:rPr>
-              <w:t>${t3_n8}</w:t>
-            </w:r>
-          </w:p>
-        </w:tc>
-        <w:tc>
-          <w:tcPr>
-            <w:tcW w:w="2315" w:type="dxa"/>
-            <w:shd w:val="clear" w:color="auto" w:fill="auto"/>
-          </w:tcPr>
-          <w:p>
-            <w:pPr>
-              <w:ind w:right="-102"/>
-              <w:jc w:val="right"/>
-              <w:rPr>
-                <w:rFonts w:ascii="TH SarabunIT๙" w:hAnsi="TH SarabunIT๙" w:cs="TH SarabunIT๙"/>
-              </w:rPr>
-            </w:pPr>
-            <w:r>
-              <w:rPr>
-                <w:rFonts w:ascii="TH SarabunIT๙" w:hAnsi="TH SarabunIT๙" w:cs="TH SarabunIT๙"/>
-                <w:spacing w:val="4"/>
-                <w:sz w:val="34"/>
-                <w:szCs w:val="34"/>
-              </w:rPr>
-              <w:t>${price_n8}</w:t>
-            </w:r>
-          </w:p>
-        </w:tc>
-      </w:tr>
-      <w:tr>
-        <w:tc>
-          <w:tcPr>
-            <w:tcW w:w="943" w:type="dxa"/>
-            <w:shd w:val="clear" w:color="auto" w:fill="auto"/>
-          </w:tcPr>
-          <w:p>
-            <w:pPr>
-              <w:jc w:val="right"/>
-              <w:rPr>
-                <w:rFonts w:ascii="TH SarabunIT๙" w:hAnsi="TH SarabunIT๙" w:cs="TH SarabunIT๙"/>
-              </w:rPr>
-            </w:pPr>
-            <w:r>
-              <w:rPr>
-                <w:rFonts w:ascii="TH SarabunIT๙" w:hAnsi="TH SarabunIT๙" w:cs="TH SarabunIT๙"/>
-                <w:spacing w:val="4"/>
-                <w:sz w:val="34"/>
-                <w:szCs w:val="34"/>
-              </w:rPr>
-              <w:t>${n9}</w:t>
-            </w:r>
-          </w:p>
-        </w:tc>
-        <w:tc>
-          <w:tcPr>
-            <w:tcW w:w="3728" w:type="dxa"/>
-            <w:shd w:val="clear" w:color="auto" w:fill="auto"/>
-          </w:tcPr>
-          <w:p>
-            <w:pPr>
-              <w:ind w:right="-6"/>
-              <w:jc w:val="thaiDistribute"/>
-              <w:rPr>
-                <w:rFonts w:ascii="TH SarabunIT๙" w:hAnsi="TH SarabunIT๙" w:cs="TH SarabunIT๙"/>
-                <w:spacing w:val="4"/>
-                <w:sz w:val="34"/>
-                <w:szCs w:val="34"/>
-              </w:rPr>
-            </w:pPr>
-            <w:r>
-              <w:rPr>
-                <w:rFonts w:ascii="TH SarabunIT๙" w:hAnsi="TH SarabunIT๙" w:cs="TH SarabunIT๙"/>
-                <w:spacing w:val="4"/>
-                <w:sz w:val="34"/>
-                <w:szCs w:val="34"/>
-              </w:rPr>
-              <w:t>${name_n9}</w:t>
-            </w:r>
-          </w:p>
-        </w:tc>
-        <w:tc>
-          <w:tcPr>
-            <w:tcW w:w="1518" w:type="dxa"/>
-            <w:shd w:val="clear" w:color="auto" w:fill="auto"/>
-          </w:tcPr>
-          <w:p>
-            <w:pPr>
-              <w:jc w:val="right"/>
-              <w:rPr>
-                <w:rFonts w:ascii="TH SarabunIT๙" w:hAnsi="TH SarabunIT๙" w:cs="TH SarabunIT๙"/>
-              </w:rPr>
-            </w:pPr>
-            <w:r>
-              <w:rPr>
-                <w:rFonts w:ascii="TH SarabunIT๙" w:hAnsi="TH SarabunIT๙" w:cs="TH SarabunIT๙"/>
-                <w:spacing w:val="4"/>
-                <w:sz w:val="34"/>
-                <w:szCs w:val="34"/>
-              </w:rPr>
-              <w:t>${t3_n9}</w:t>
-            </w:r>
-          </w:p>
-        </w:tc>
-        <w:tc>
-          <w:tcPr>
-            <w:tcW w:w="2315" w:type="dxa"/>
-            <w:shd w:val="clear" w:color="auto" w:fill="auto"/>
-          </w:tcPr>
-          <w:p>
-            <w:pPr>
-              <w:ind w:right="-102"/>
-              <w:jc w:val="right"/>
-              <w:rPr>
-                <w:rFonts w:ascii="TH SarabunIT๙" w:hAnsi="TH SarabunIT๙" w:cs="TH SarabunIT๙"/>
-              </w:rPr>
-            </w:pPr>
-            <w:r>
-              <w:rPr>
-                <w:rFonts w:ascii="TH SarabunIT๙" w:hAnsi="TH SarabunIT๙" w:cs="TH SarabunIT๙"/>
-                <w:spacing w:val="4"/>
-                <w:sz w:val="34"/>
-                <w:szCs w:val="34"/>
-              </w:rPr>
-              <w:t>${price_n9}</w:t>
-            </w:r>
-          </w:p>
-        </w:tc>
-      </w:tr>
-      <w:tr>
-        <w:tc>
-          <w:tcPr>
-            <w:tcW w:w="943" w:type="dxa"/>
-            <w:shd w:val="clear" w:color="auto" w:fill="auto"/>
-          </w:tcPr>
-          <w:p>
-            <w:pPr>
-              <w:jc w:val="right"/>
-              <w:rPr>
-                <w:rFonts w:ascii="TH SarabunIT๙" w:hAnsi="TH SarabunIT๙" w:cs="TH SarabunIT๙"/>
-                <w:spacing w:val="4"/>
-                <w:sz w:val="34"/>
-                <w:szCs w:val="34"/>
-              </w:rPr>
-            </w:pPr>
-            <w:r>
-              <w:rPr>
-                <w:rFonts w:ascii="TH SarabunIT๙" w:hAnsi="TH SarabunIT๙" w:cs="TH SarabunIT๙"/>
-                <w:spacing w:val="4"/>
-                <w:sz w:val="34"/>
-                <w:szCs w:val="34"/>
-              </w:rPr>
-              <w:t>${n10}</w:t>
-            </w:r>
-          </w:p>
-        </w:tc>
-        <w:tc>
-          <w:tcPr>
-            <w:tcW w:w="3728" w:type="dxa"/>
-            <w:shd w:val="clear" w:color="auto" w:fill="auto"/>
-          </w:tcPr>
-          <w:p>
-            <w:pPr>
-              <w:ind w:right="-6"/>
-              <w:jc w:val="thaiDistribute"/>
-              <w:rPr>
-                <w:rFonts w:ascii="TH SarabunIT๙" w:hAnsi="TH SarabunIT๙" w:cs="TH SarabunIT๙"/>
-                <w:spacing w:val="4"/>
-                <w:sz w:val="34"/>
-                <w:szCs w:val="34"/>
-              </w:rPr>
-            </w:pPr>
-            <w:r>
-              <w:rPr>
-                <w:rFonts w:ascii="TH SarabunIT๙" w:hAnsi="TH SarabunIT๙" w:cs="TH SarabunIT๙"/>
-                <w:spacing w:val="4"/>
-                <w:sz w:val="34"/>
-                <w:szCs w:val="34"/>
-              </w:rPr>
-              <w:t>${name_n10}</w:t>
-            </w:r>
-          </w:p>
-        </w:tc>
-        <w:tc>
-          <w:tcPr>
-            <w:tcW w:w="1518" w:type="dxa"/>
-            <w:shd w:val="clear" w:color="auto" w:fill="auto"/>
-          </w:tcPr>
-          <w:p>
-            <w:pPr>
-              <w:jc w:val="right"/>
-              <w:rPr>
-                <w:rFonts w:ascii="TH SarabunIT๙" w:hAnsi="TH SarabunIT๙" w:cs="TH SarabunIT๙"/>
-                <w:spacing w:val="4"/>
-                <w:sz w:val="34"/>
-                <w:szCs w:val="34"/>
-              </w:rPr>
-            </w:pPr>
-            <w:r>
-              <w:rPr>
-                <w:rFonts w:ascii="TH SarabunIT๙" w:hAnsi="TH SarabunIT๙" w:cs="TH SarabunIT๙"/>
-                <w:spacing w:val="4"/>
-                <w:sz w:val="34"/>
-                <w:szCs w:val="34"/>
-              </w:rPr>
-              <w:t>${t3_n10}</w:t>
-            </w:r>
-          </w:p>
-        </w:tc>
-        <w:tc>
-          <w:tcPr>
-            <w:tcW w:w="2315" w:type="dxa"/>
-            <w:shd w:val="clear" w:color="auto" w:fill="auto"/>
-          </w:tcPr>
-          <w:p>
-            <w:pPr>
-              <w:ind w:right="-102"/>
-              <w:jc w:val="right"/>
-              <w:rPr>
-                <w:rFonts w:ascii="TH SarabunIT๙" w:hAnsi="TH SarabunIT๙" w:cs="TH SarabunIT๙"/>
-                <w:spacing w:val="4"/>
-                <w:sz w:val="34"/>
-                <w:szCs w:val="34"/>
-              </w:rPr>
-            </w:pPr>
-            <w:r>
-              <w:rPr>
-                <w:rFonts w:ascii="TH SarabunIT๙" w:hAnsi="TH SarabunIT๙" w:cs="TH SarabunIT๙"/>
-                <w:spacing w:val="4"/>
-                <w:sz w:val="34"/>
-                <w:szCs w:val="34"/>
-              </w:rPr>
-              <w:t>${price_n10}</w:t>
-            </w:r>
-          </w:p>
-        </w:tc>
-      </w:tr>
-      <w:tr>
-        <w:tc>
-          <w:tcPr>
-            <w:tcW w:w="943" w:type="dxa"/>
-            <w:shd w:val="clear" w:color="auto" w:fill="auto"/>
-          </w:tcPr>
-          <w:p>
-            <w:pPr>
-              <w:jc w:val="right"/>
-              <w:rPr>
-                <w:rFonts w:ascii="TH SarabunIT๙" w:hAnsi="TH SarabunIT๙" w:cs="TH SarabunIT๙"/>
-              </w:rPr>
-            </w:pPr>
-            <w:r>
-              <w:rPr>
-                <w:rFonts w:ascii="TH SarabunIT๙" w:hAnsi="TH SarabunIT๙" w:cs="TH SarabunIT๙"/>
-                <w:spacing w:val="4"/>
-                <w:sz w:val="34"/>
-                <w:szCs w:val="34"/>
-              </w:rPr>
-              <w:t>${n11</w:t>
+              <w:t>${price_</w:t>
             </w:r>
             <w:r>
               <w:rPr>
@@ -2557,117 +1623,7 @@
                 <w:sz w:val="34"/>
                 <w:szCs w:val="34"/>
               </w:rPr>
-              <w:t>}</w:t>
-            </w:r>
-          </w:p>
-        </w:tc>
-        <w:tc>
-          <w:tcPr>
-            <w:tcW w:w="3728" w:type="dxa"/>
-            <w:shd w:val="clear" w:color="auto" w:fill="auto"/>
-          </w:tcPr>
-          <w:p>
-            <w:pPr>
-              <w:ind w:right="-6"/>
-              <w:jc w:val="thaiDistribute"/>
-              <w:rPr>
-                <w:rFonts w:ascii="TH SarabunIT๙" w:hAnsi="TH SarabunIT๙" w:cs="TH SarabunIT๙"/>
-                <w:spacing w:val="4"/>
-                <w:sz w:val="34"/>
-                <w:szCs w:val="34"/>
-              </w:rPr>
-            </w:pPr>
-            <w:r>
-              <w:rPr>
-                <w:rFonts w:ascii="TH SarabunIT๙" w:hAnsi="TH SarabunIT๙" w:cs="TH SarabunIT๙"/>
-                <w:spacing w:val="4"/>
-                <w:sz w:val="34"/>
-                <w:szCs w:val="34"/>
-              </w:rPr>
-              <w:t>${name_n11</w:t>
-            </w:r>
-            <w:r>
-              <w:rPr>
-                <w:rFonts w:ascii="TH SarabunIT๙" w:hAnsi="TH SarabunIT๙" w:cs="TH SarabunIT๙"/>
-                <w:spacing w:val="4"/>
-                <w:sz w:val="34"/>
-                <w:szCs w:val="34"/>
-              </w:rPr>
-              <w:t>}</w:t>
-            </w:r>
-          </w:p>
-        </w:tc>
-        <w:tc>
-          <w:tcPr>
-            <w:tcW w:w="1518" w:type="dxa"/>
-            <w:shd w:val="clear" w:color="auto" w:fill="auto"/>
-          </w:tcPr>
-          <w:p>
-            <w:pPr>
-              <w:jc w:val="right"/>
-              <w:rPr>
-                <w:rFonts w:ascii="TH SarabunIT๙" w:hAnsi="TH SarabunIT๙" w:cs="TH SarabunIT๙"/>
-              </w:rPr>
-            </w:pPr>
-            <w:r>
-              <w:rPr>
-                <w:rFonts w:ascii="TH SarabunIT๙" w:hAnsi="TH SarabunIT๙" w:cs="TH SarabunIT๙"/>
-                <w:spacing w:val="4"/>
-                <w:sz w:val="34"/>
-                <w:szCs w:val="34"/>
-              </w:rPr>
-              <w:t>${t3_n</w:t>
-            </w:r>
-            <w:r>
-              <w:rPr>
-                <w:rFonts w:ascii="TH SarabunIT๙" w:hAnsi="TH SarabunIT๙" w:cs="TH SarabunIT๙"/>
-                <w:spacing w:val="4"/>
-                <w:sz w:val="34"/>
-                <w:szCs w:val="34"/>
-              </w:rPr>
-              <w:t>11</w:t>
-            </w:r>
-            <w:r>
-              <w:rPr>
-                <w:rFonts w:ascii="TH SarabunIT๙" w:hAnsi="TH SarabunIT๙" w:cs="TH SarabunIT๙"/>
-                <w:spacing w:val="4"/>
-                <w:sz w:val="34"/>
-                <w:szCs w:val="34"/>
-              </w:rPr>
-              <w:t>}</w:t>
-            </w:r>
-          </w:p>
-        </w:tc>
-        <w:tc>
-          <w:tcPr>
-            <w:tcW w:w="2315" w:type="dxa"/>
-            <w:shd w:val="clear" w:color="auto" w:fill="auto"/>
-          </w:tcPr>
-          <w:p>
-            <w:pPr>
-              <w:ind w:right="-102"/>
-              <w:jc w:val="right"/>
-              <w:rPr>
-                <w:rFonts w:ascii="TH SarabunIT๙" w:hAnsi="TH SarabunIT๙" w:cs="TH SarabunIT๙"/>
-              </w:rPr>
-            </w:pPr>
-            <w:r>
-              <w:rPr>
-                <w:rFonts w:ascii="TH SarabunIT๙" w:hAnsi="TH SarabunIT๙" w:cs="TH SarabunIT๙"/>
-                <w:spacing w:val="4"/>
-                <w:sz w:val="34"/>
-                <w:szCs w:val="34"/>
-              </w:rPr>
-              <w:t>${price_n</w:t>
-            </w:r>
-            <w:r>
-              <w:rPr>
-                <w:rFonts w:ascii="TH SarabunIT๙" w:hAnsi="TH SarabunIT๙" w:cs="TH SarabunIT๙"/>
-                <w:spacing w:val="4"/>
-                <w:sz w:val="34"/>
-                <w:szCs w:val="34"/>
-              </w:rPr>
-              <w:t>11</w:t>
+              <w:t>total</w:t>
             </w:r>
             <w:r>
               <w:rPr>
@@ -2681,161 +1637,7 @@
           </w:p>
         </w:tc>
       </w:tr>
-      <w:tr>
-        <w:tc>
-          <w:tcPr>
-            <w:tcW w:w="943" w:type="dxa"/>
-            <w:shd w:val="clear" w:color="auto" w:fill="auto"/>
-          </w:tcPr>
-          <w:p>
-            <w:pPr>
-              <w:jc w:val="right"/>
-              <w:rPr>
-                <w:rFonts w:ascii="TH SarabunIT๙" w:hAnsi="TH SarabunIT๙" w:cs="TH SarabunIT๙"/>
-                <w:spacing w:val="4"/>
-                <w:sz w:val="34"/>
-                <w:szCs w:val="34"/>
-              </w:rPr>
-            </w:pPr>
-            <w:r>
-              <w:rPr>
-                <w:rFonts w:ascii="TH SarabunIT๙" w:hAnsi="TH SarabunIT๙" w:cs="TH SarabunIT๙"/>
-                <w:spacing w:val="4"/>
-                <w:sz w:val="34"/>
-                <w:szCs w:val="34"/>
-              </w:rPr>
-              <w:t>${n12}</w:t>
-            </w:r>
-          </w:p>
-        </w:tc>
-        <w:tc>
-          <w:tcPr>
-            <w:tcW w:w="3728" w:type="dxa"/>
-            <w:shd w:val="clear" w:color="auto" w:fill="auto"/>
-          </w:tcPr>
-          <w:p>
-            <w:pPr>
-              <w:ind w:right="-6"/>
-              <w:jc w:val="thaiDistribute"/>
-              <w:rPr>
-                <w:rFonts w:ascii="TH SarabunIT๙" w:hAnsi="TH SarabunIT๙" w:cs="TH SarabunIT๙"/>
-                <w:spacing w:val="4"/>
-                <w:sz w:val="34"/>
-                <w:szCs w:val="34"/>
-              </w:rPr>
-            </w:pPr>
-            <w:r>
-              <w:rPr>
-                <w:rFonts w:ascii="TH SarabunIT๙" w:hAnsi="TH SarabunIT๙" w:cs="TH SarabunIT๙"/>
-                <w:spacing w:val="4"/>
-                <w:sz w:val="34"/>
-                <w:szCs w:val="34"/>
-              </w:rPr>
-              <w:t>${name_n12}</w:t>
-            </w:r>
-          </w:p>
-        </w:tc>
-        <w:tc>
-          <w:tcPr>
-            <w:tcW w:w="1518" w:type="dxa"/>
-            <w:shd w:val="clear" w:color="auto" w:fill="auto"/>
-          </w:tcPr>
-          <w:p>
-            <w:pPr>
-              <w:jc w:val="right"/>
-              <w:rPr>
-                <w:rFonts w:ascii="TH SarabunIT๙" w:hAnsi="TH SarabunIT๙" w:cs="TH SarabunIT๙"/>
-                <w:spacing w:val="4"/>
-                <w:sz w:val="34"/>
-                <w:szCs w:val="34"/>
-              </w:rPr>
-            </w:pPr>
-            <w:r>
-              <w:rPr>
-                <w:rFonts w:ascii="TH SarabunIT๙" w:hAnsi="TH SarabunIT๙" w:cs="TH SarabunIT๙"/>
-                <w:spacing w:val="4"/>
-                <w:sz w:val="34"/>
-                <w:szCs w:val="34"/>
-              </w:rPr>
-              <w:t>${t3_n12}</w:t>
-            </w:r>
-          </w:p>
-        </w:tc>
-        <w:tc>
-          <w:tcPr>
-            <w:tcW w:w="2315" w:type="dxa"/>
-            <w:shd w:val="clear" w:color="auto" w:fill="auto"/>
-          </w:tcPr>
-          <w:p>
-            <w:pPr>
-              <w:ind w:right="-102"/>
-              <w:jc w:val="right"/>
-              <w:rPr>
-                <w:rFonts w:ascii="TH SarabunIT๙" w:hAnsi="TH SarabunIT๙" w:cs="TH SarabunIT๙"/>
-                <w:spacing w:val="4"/>
-                <w:sz w:val="34"/>
-                <w:szCs w:val="34"/>
-              </w:rPr>
-            </w:pPr>
-            <w:r>
-              <w:rPr>
-                <w:rFonts w:ascii="TH SarabunIT๙" w:hAnsi="TH SarabunIT๙" w:cs="TH SarabunIT๙"/>
-                <w:spacing w:val="4"/>
-                <w:sz w:val="34"/>
-                <w:szCs w:val="34"/>
-              </w:rPr>
-              <w:t>${price_n12}</w:t>
-            </w:r>
-          </w:p>
-        </w:tc>
-      </w:tr>
     </w:tbl>
-    <w:p>
-      <w:pPr>
-        <w:spacing w:before="240"/>
-        <w:jc w:val="right"/>
-        <w:rPr>
-          <w:rFonts w:ascii="TH SarabunIT๙" w:hAnsi="TH SarabunIT๙" w:cs="TH SarabunIT๙"/>
-          <w:sz w:val="34"/>
-          <w:szCs w:val="34"/>
-        </w:rPr>
-      </w:pPr>
-      <w:r>
-        <w:rPr>
-          <w:rFonts w:ascii="TH SarabunIT๙" w:hAnsi="TH SarabunIT๙" w:cs="TH SarabunIT๙"/>
-          <w:spacing w:val="4"/>
-          <w:sz w:val="34"/>
-          <w:szCs w:val="34"/>
-        </w:rPr>
-        <w:t>${n13</w:t>
-      </w:r>
-      <w:r>
-        <w:rPr>
-          <w:rFonts w:ascii="TH SarabunIT๙" w:hAnsi="TH SarabunIT๙" w:cs="TH SarabunIT๙"/>
-          <w:spacing w:val="4"/>
-          <w:sz w:val="34"/>
-          <w:szCs w:val="34"/>
-        </w:rPr>
-        <w:t>}</w:t>
-      </w:r>
-      <w:r>
-        <w:rPr>
-          <w:rFonts w:ascii="TH SarabunIT๙" w:hAnsi="TH SarabunIT๙" w:cs="TH SarabunIT๙"/>
-          <w:sz w:val="34"/>
-          <w:szCs w:val="34"/>
-        </w:rPr>
-        <w:t xml:space="preserve"> ${name_n13}</w:t>
-      </w:r>
-      <w:r>
-        <w:rPr>
-          <w:rFonts w:ascii="TH SarabunIT๙" w:hAnsi="TH SarabunIT๙" w:cs="TH SarabunIT๙"/>
-          <w:sz w:val="34"/>
-          <w:szCs w:val="34"/>
-          <w:cs/>
-        </w:rPr>
-        <w:t>…</w:t>
-      </w:r>
-    </w:p>
     <w:p>
       <w:pPr>
         <w:spacing w:before="240"/>
@@ -2857,7 +1659,6 @@
           <w:szCs w:val="58"/>
           <w:cs/>
         </w:rPr>
-        <w:lastRenderedPageBreak/>
         <w:t xml:space="preserve">                          </w:t>
       </w:r>
       <w:r>
@@ -2964,1138 +1765,6 @@
         <w:t xml:space="preserve"> </w:t>
       </w:r>
     </w:p>
-    <w:tbl>
-      <w:tblPr>
-        <w:tblStyle w:val="a6"/>
-        <w:tblW w:w="0" w:type="auto"/>
-        <w:tblInd w:w="567" w:type="dxa"/>
-        <w:tblBorders>
-          <w:top w:val="none" w:sz="0" w:space="0" w:color="auto"/>
-          <w:left w:val="none" w:sz="0" w:space="0" w:color="auto"/>
-          <w:bottom w:val="none" w:sz="0" w:space="0" w:color="auto"/>
-          <w:right w:val="none" w:sz="0" w:space="0" w:color="auto"/>
-          <w:insideH w:val="none" w:sz="0" w:space="0" w:color="auto"/>
-          <w:insideV w:val="none" w:sz="0" w:space="0" w:color="auto"/>
-        </w:tblBorders>
-        <w:tblLook w:val="04A0" w:firstRow="1" w:lastRow="0" w:firstColumn="1" w:lastColumn="0" w:noHBand="0" w:noVBand="1"/>
-      </w:tblPr>
-      <w:tblGrid>
-        <w:gridCol w:w="943"/>
-        <w:gridCol w:w="3731"/>
-        <w:gridCol w:w="1517"/>
-        <w:gridCol w:w="2313"/>
-      </w:tblGrid>
-      <w:tr>
-        <w:tc>
-          <w:tcPr>
-            <w:tcW w:w="943" w:type="dxa"/>
-          </w:tcPr>
-          <w:p>
-            <w:pPr>
-              <w:jc w:val="right"/>
-              <w:rPr>
-                <w:rFonts w:ascii="TH SarabunIT๙" w:hAnsi="TH SarabunIT๙" w:cs="TH SarabunIT๙"/>
-                <w:spacing w:val="4"/>
-                <w:sz w:val="34"/>
-                <w:szCs w:val="34"/>
-              </w:rPr>
-            </w:pPr>
-            <w:r>
-              <w:rPr>
-                <w:rFonts w:ascii="TH SarabunIT๙" w:hAnsi="TH SarabunIT๙" w:cs="TH SarabunIT๙"/>
-                <w:spacing w:val="4"/>
-                <w:sz w:val="34"/>
-                <w:szCs w:val="34"/>
-              </w:rPr>
-              <w:t>${n13}</w:t>
-            </w:r>
-          </w:p>
-        </w:tc>
-        <w:tc>
-          <w:tcPr>
-            <w:tcW w:w="3731" w:type="dxa"/>
-            <w:shd w:val="clear" w:color="auto" w:fill="auto"/>
-          </w:tcPr>
-          <w:p>
-            <w:pPr>
-              <w:ind w:right="-6"/>
-              <w:jc w:val="thaiDistribute"/>
-              <w:rPr>
-                <w:rFonts w:ascii="TH SarabunIT๙" w:hAnsi="TH SarabunIT๙" w:cs="TH SarabunIT๙"/>
-                <w:spacing w:val="4"/>
-                <w:sz w:val="34"/>
-                <w:szCs w:val="34"/>
-              </w:rPr>
-            </w:pPr>
-            <w:r>
-              <w:rPr>
-                <w:rFonts w:ascii="TH SarabunIT๙" w:hAnsi="TH SarabunIT๙" w:cs="TH SarabunIT๙"/>
-                <w:spacing w:val="4"/>
-                <w:sz w:val="34"/>
-                <w:szCs w:val="34"/>
-              </w:rPr>
-              <w:t>${name_n13</w:t>
-            </w:r>
-            <w:r>
-              <w:rPr>
-                <w:rFonts w:ascii="TH SarabunIT๙" w:hAnsi="TH SarabunIT๙" w:cs="TH SarabunIT๙"/>
-                <w:spacing w:val="4"/>
-                <w:sz w:val="34"/>
-                <w:szCs w:val="34"/>
-              </w:rPr>
-              <w:t>}</w:t>
-            </w:r>
-          </w:p>
-        </w:tc>
-        <w:tc>
-          <w:tcPr>
-            <w:tcW w:w="1517" w:type="dxa"/>
-          </w:tcPr>
-          <w:p>
-            <w:pPr>
-              <w:jc w:val="right"/>
-              <w:rPr>
-                <w:rFonts w:ascii="TH SarabunIT๙" w:hAnsi="TH SarabunIT๙" w:cs="TH SarabunIT๙"/>
-                <w:spacing w:val="4"/>
-                <w:sz w:val="34"/>
-                <w:szCs w:val="34"/>
-              </w:rPr>
-            </w:pPr>
-            <w:r>
-              <w:rPr>
-                <w:rFonts w:ascii="TH SarabunIT๙" w:hAnsi="TH SarabunIT๙" w:cs="TH SarabunIT๙"/>
-                <w:spacing w:val="4"/>
-                <w:sz w:val="34"/>
-                <w:szCs w:val="34"/>
-              </w:rPr>
-              <w:t>${t3_n13</w:t>
-            </w:r>
-            <w:r>
-              <w:rPr>
-                <w:rFonts w:ascii="TH SarabunIT๙" w:hAnsi="TH SarabunIT๙" w:cs="TH SarabunIT๙"/>
-                <w:spacing w:val="4"/>
-                <w:sz w:val="34"/>
-                <w:szCs w:val="34"/>
-              </w:rPr>
-              <w:t>}</w:t>
-            </w:r>
-          </w:p>
-        </w:tc>
-        <w:tc>
-          <w:tcPr>
-            <w:tcW w:w="2313" w:type="dxa"/>
-          </w:tcPr>
-          <w:p>
-            <w:pPr>
-              <w:ind w:right="-102"/>
-              <w:jc w:val="right"/>
-              <w:rPr>
-                <w:rFonts w:ascii="TH SarabunIT๙" w:hAnsi="TH SarabunIT๙" w:cs="TH SarabunIT๙"/>
-                <w:spacing w:val="4"/>
-                <w:sz w:val="34"/>
-                <w:szCs w:val="34"/>
-              </w:rPr>
-            </w:pPr>
-            <w:r>
-              <w:rPr>
-                <w:rFonts w:ascii="TH SarabunIT๙" w:hAnsi="TH SarabunIT๙" w:cs="TH SarabunIT๙"/>
-                <w:spacing w:val="4"/>
-                <w:sz w:val="34"/>
-                <w:szCs w:val="34"/>
-              </w:rPr>
-              <w:t>${price_n</w:t>
-            </w:r>
-            <w:r>
-              <w:rPr>
-                <w:rFonts w:ascii="TH SarabunIT๙" w:hAnsi="TH SarabunIT๙" w:cs="TH SarabunIT๙"/>
-                <w:spacing w:val="4"/>
-                <w:sz w:val="34"/>
-                <w:szCs w:val="34"/>
-              </w:rPr>
-              <w:t>13</w:t>
-            </w:r>
-            <w:r>
-              <w:rPr>
-                <w:rFonts w:ascii="TH SarabunIT๙" w:hAnsi="TH SarabunIT๙" w:cs="TH SarabunIT๙"/>
-                <w:spacing w:val="4"/>
-                <w:sz w:val="34"/>
-                <w:szCs w:val="34"/>
-              </w:rPr>
-              <w:t>}</w:t>
-            </w:r>
-          </w:p>
-        </w:tc>
-      </w:tr>
-      <w:tr>
-        <w:tc>
-          <w:tcPr>
-            <w:tcW w:w="943" w:type="dxa"/>
-          </w:tcPr>
-          <w:p>
-            <w:pPr>
-              <w:jc w:val="right"/>
-              <w:rPr>
-                <w:rFonts w:ascii="TH SarabunIT๙" w:hAnsi="TH SarabunIT๙" w:cs="TH SarabunIT๙"/>
-                <w:spacing w:val="4"/>
-                <w:sz w:val="34"/>
-                <w:szCs w:val="34"/>
-              </w:rPr>
-            </w:pPr>
-            <w:r>
-              <w:rPr>
-                <w:rFonts w:ascii="TH SarabunIT๙" w:hAnsi="TH SarabunIT๙" w:cs="TH SarabunIT๙"/>
-                <w:spacing w:val="4"/>
-                <w:sz w:val="34"/>
-                <w:szCs w:val="34"/>
-              </w:rPr>
-              <w:t>${n14}</w:t>
-            </w:r>
-          </w:p>
-        </w:tc>
-        <w:tc>
-          <w:tcPr>
-            <w:tcW w:w="3731" w:type="dxa"/>
-            <w:shd w:val="clear" w:color="auto" w:fill="auto"/>
-          </w:tcPr>
-          <w:p>
-            <w:pPr>
-              <w:ind w:right="-6"/>
-              <w:jc w:val="thaiDistribute"/>
-              <w:rPr>
-                <w:rFonts w:ascii="TH SarabunIT๙" w:hAnsi="TH SarabunIT๙" w:cs="TH SarabunIT๙"/>
-                <w:spacing w:val="4"/>
-                <w:sz w:val="34"/>
-                <w:szCs w:val="34"/>
-              </w:rPr>
-            </w:pPr>
-            <w:r>
-              <w:rPr>
-                <w:rFonts w:ascii="TH SarabunIT๙" w:hAnsi="TH SarabunIT๙" w:cs="TH SarabunIT๙"/>
-                <w:spacing w:val="4"/>
-                <w:sz w:val="34"/>
-                <w:szCs w:val="34"/>
-              </w:rPr>
-              <w:t>${name_n14</w:t>
-            </w:r>
-            <w:r>
-              <w:rPr>
-                <w:rFonts w:ascii="TH SarabunIT๙" w:hAnsi="TH SarabunIT๙" w:cs="TH SarabunIT๙"/>
-                <w:spacing w:val="4"/>
-                <w:sz w:val="34"/>
-                <w:szCs w:val="34"/>
-              </w:rPr>
-              <w:t>}</w:t>
-            </w:r>
-          </w:p>
-        </w:tc>
-        <w:tc>
-          <w:tcPr>
-            <w:tcW w:w="1517" w:type="dxa"/>
-          </w:tcPr>
-          <w:p>
-            <w:pPr>
-              <w:jc w:val="right"/>
-              <w:rPr>
-                <w:rFonts w:ascii="TH SarabunIT๙" w:hAnsi="TH SarabunIT๙" w:cs="TH SarabunIT๙"/>
-                <w:spacing w:val="4"/>
-                <w:sz w:val="34"/>
-                <w:szCs w:val="34"/>
-              </w:rPr>
-            </w:pPr>
-            <w:r>
-              <w:rPr>
-                <w:rFonts w:ascii="TH SarabunIT๙" w:hAnsi="TH SarabunIT๙" w:cs="TH SarabunIT๙"/>
-                <w:spacing w:val="4"/>
-                <w:sz w:val="34"/>
-                <w:szCs w:val="34"/>
-              </w:rPr>
-              <w:t>${t3_n14</w:t>
-            </w:r>
-            <w:r>
-              <w:rPr>
-                <w:rFonts w:ascii="TH SarabunIT๙" w:hAnsi="TH SarabunIT๙" w:cs="TH SarabunIT๙"/>
-                <w:spacing w:val="4"/>
-                <w:sz w:val="34"/>
-                <w:szCs w:val="34"/>
-              </w:rPr>
-              <w:t>}</w:t>
-            </w:r>
-          </w:p>
-        </w:tc>
-        <w:tc>
-          <w:tcPr>
-            <w:tcW w:w="2313" w:type="dxa"/>
-          </w:tcPr>
-          <w:p>
-            <w:pPr>
-              <w:ind w:right="-102"/>
-              <w:jc w:val="right"/>
-              <w:rPr>
-                <w:rFonts w:ascii="TH SarabunIT๙" w:hAnsi="TH SarabunIT๙" w:cs="TH SarabunIT๙"/>
-                <w:spacing w:val="4"/>
-                <w:sz w:val="34"/>
-                <w:szCs w:val="34"/>
-              </w:rPr>
-            </w:pPr>
-            <w:r>
-              <w:rPr>
-                <w:rFonts w:ascii="TH SarabunIT๙" w:hAnsi="TH SarabunIT๙" w:cs="TH SarabunIT๙"/>
-                <w:spacing w:val="4"/>
-                <w:sz w:val="34"/>
-                <w:szCs w:val="34"/>
-              </w:rPr>
-              <w:t>${price_n</w:t>
-            </w:r>
-            <w:r>
-              <w:rPr>
-                <w:rFonts w:ascii="TH SarabunIT๙" w:hAnsi="TH SarabunIT๙" w:cs="TH SarabunIT๙"/>
-                <w:spacing w:val="4"/>
-                <w:sz w:val="34"/>
-                <w:szCs w:val="34"/>
-              </w:rPr>
-              <w:t>14</w:t>
-            </w:r>
-            <w:r>
-              <w:rPr>
-                <w:rFonts w:ascii="TH SarabunIT๙" w:hAnsi="TH SarabunIT๙" w:cs="TH SarabunIT๙"/>
-                <w:spacing w:val="4"/>
-                <w:sz w:val="34"/>
-                <w:szCs w:val="34"/>
-              </w:rPr>
-              <w:t>}</w:t>
-            </w:r>
-          </w:p>
-        </w:tc>
-      </w:tr>
-      <w:tr>
-        <w:tc>
-          <w:tcPr>
-            <w:tcW w:w="943" w:type="dxa"/>
-          </w:tcPr>
-          <w:p>
-            <w:pPr>
-              <w:jc w:val="right"/>
-              <w:rPr>
-                <w:rFonts w:ascii="TH SarabunIT๙" w:hAnsi="TH SarabunIT๙" w:cs="TH SarabunIT๙"/>
-                <w:spacing w:val="4"/>
-                <w:sz w:val="34"/>
-                <w:szCs w:val="34"/>
-              </w:rPr>
-            </w:pPr>
-            <w:r>
-              <w:rPr>
-                <w:rFonts w:ascii="TH SarabunIT๙" w:hAnsi="TH SarabunIT๙" w:cs="TH SarabunIT๙"/>
-                <w:spacing w:val="4"/>
-                <w:sz w:val="34"/>
-                <w:szCs w:val="34"/>
-              </w:rPr>
-              <w:t>${n15}</w:t>
-            </w:r>
-          </w:p>
-        </w:tc>
-        <w:tc>
-          <w:tcPr>
-            <w:tcW w:w="3731" w:type="dxa"/>
-            <w:shd w:val="clear" w:color="auto" w:fill="auto"/>
-          </w:tcPr>
-          <w:p>
-            <w:pPr>
-              <w:ind w:right="-6"/>
-              <w:jc w:val="thaiDistribute"/>
-              <w:rPr>
-                <w:rFonts w:ascii="TH SarabunIT๙" w:hAnsi="TH SarabunIT๙" w:cs="TH SarabunIT๙"/>
-                <w:spacing w:val="4"/>
-                <w:sz w:val="34"/>
-                <w:szCs w:val="34"/>
-              </w:rPr>
-            </w:pPr>
-            <w:r>
-              <w:rPr>
-                <w:rFonts w:ascii="TH SarabunIT๙" w:hAnsi="TH SarabunIT๙" w:cs="TH SarabunIT๙"/>
-                <w:spacing w:val="4"/>
-                <w:sz w:val="34"/>
-                <w:szCs w:val="34"/>
-              </w:rPr>
-              <w:t>${name_n15</w:t>
-            </w:r>
-            <w:r>
-              <w:rPr>
-                <w:rFonts w:ascii="TH SarabunIT๙" w:hAnsi="TH SarabunIT๙" w:cs="TH SarabunIT๙"/>
-                <w:spacing w:val="4"/>
-                <w:sz w:val="34"/>
-                <w:szCs w:val="34"/>
-              </w:rPr>
-              <w:t>}</w:t>
-            </w:r>
-          </w:p>
-        </w:tc>
-        <w:tc>
-          <w:tcPr>
-            <w:tcW w:w="1517" w:type="dxa"/>
-          </w:tcPr>
-          <w:p>
-            <w:pPr>
-              <w:jc w:val="right"/>
-              <w:rPr>
-                <w:rFonts w:ascii="TH SarabunIT๙" w:hAnsi="TH SarabunIT๙" w:cs="TH SarabunIT๙"/>
-                <w:spacing w:val="4"/>
-                <w:sz w:val="34"/>
-                <w:szCs w:val="34"/>
-              </w:rPr>
-            </w:pPr>
-            <w:r>
-              <w:rPr>
-                <w:rFonts w:ascii="TH SarabunIT๙" w:hAnsi="TH SarabunIT๙" w:cs="TH SarabunIT๙"/>
-                <w:spacing w:val="4"/>
-                <w:sz w:val="34"/>
-                <w:szCs w:val="34"/>
-              </w:rPr>
-              <w:t>${t3_n15</w:t>
-            </w:r>
-            <w:r>
-              <w:rPr>
-                <w:rFonts w:ascii="TH SarabunIT๙" w:hAnsi="TH SarabunIT๙" w:cs="TH SarabunIT๙"/>
-                <w:spacing w:val="4"/>
-                <w:sz w:val="34"/>
-                <w:szCs w:val="34"/>
-              </w:rPr>
-              <w:t>}</w:t>
-            </w:r>
-          </w:p>
-        </w:tc>
-        <w:tc>
-          <w:tcPr>
-            <w:tcW w:w="2313" w:type="dxa"/>
-          </w:tcPr>
-          <w:p>
-            <w:pPr>
-              <w:ind w:right="-102"/>
-              <w:jc w:val="right"/>
-              <w:rPr>
-                <w:rFonts w:ascii="TH SarabunIT๙" w:hAnsi="TH SarabunIT๙" w:cs="TH SarabunIT๙"/>
-                <w:spacing w:val="4"/>
-                <w:sz w:val="34"/>
-                <w:szCs w:val="34"/>
-              </w:rPr>
-            </w:pPr>
-            <w:r>
-              <w:rPr>
-                <w:rFonts w:ascii="TH SarabunIT๙" w:hAnsi="TH SarabunIT๙" w:cs="TH SarabunIT๙"/>
-                <w:spacing w:val="4"/>
-                <w:sz w:val="34"/>
-                <w:szCs w:val="34"/>
-              </w:rPr>
-              <w:t>${price_n</w:t>
-            </w:r>
-            <w:r>
-              <w:rPr>
-                <w:rFonts w:ascii="TH SarabunIT๙" w:hAnsi="TH SarabunIT๙" w:cs="TH SarabunIT๙"/>
-                <w:spacing w:val="4"/>
-                <w:sz w:val="34"/>
-                <w:szCs w:val="34"/>
-              </w:rPr>
-              <w:t>15</w:t>
-            </w:r>
-            <w:r>
-              <w:rPr>
-                <w:rFonts w:ascii="TH SarabunIT๙" w:hAnsi="TH SarabunIT๙" w:cs="TH SarabunIT๙"/>
-                <w:spacing w:val="4"/>
-                <w:sz w:val="34"/>
-                <w:szCs w:val="34"/>
-              </w:rPr>
-              <w:t>}</w:t>
-            </w:r>
-          </w:p>
-        </w:tc>
-      </w:tr>
-      <w:tr>
-        <w:tc>
-          <w:tcPr>
-            <w:tcW w:w="943" w:type="dxa"/>
-          </w:tcPr>
-          <w:p>
-            <w:pPr>
-              <w:jc w:val="right"/>
-              <w:rPr>
-                <w:rFonts w:ascii="TH SarabunIT๙" w:hAnsi="TH SarabunIT๙" w:cs="TH SarabunIT๙"/>
-              </w:rPr>
-            </w:pPr>
-            <w:r>
-              <w:rPr>
-                <w:rFonts w:ascii="TH SarabunIT๙" w:hAnsi="TH SarabunIT๙" w:cs="TH SarabunIT๙"/>
-                <w:spacing w:val="4"/>
-                <w:sz w:val="34"/>
-                <w:szCs w:val="34"/>
-              </w:rPr>
-              <w:t>${n16}</w:t>
-            </w:r>
-          </w:p>
-        </w:tc>
-        <w:tc>
-          <w:tcPr>
-            <w:tcW w:w="3731" w:type="dxa"/>
-            <w:shd w:val="clear" w:color="auto" w:fill="auto"/>
-          </w:tcPr>
-          <w:p>
-            <w:pPr>
-              <w:ind w:right="-6"/>
-              <w:jc w:val="thaiDistribute"/>
-              <w:rPr>
-                <w:rFonts w:ascii="TH SarabunIT๙" w:hAnsi="TH SarabunIT๙" w:cs="TH SarabunIT๙"/>
-                <w:spacing w:val="4"/>
-                <w:sz w:val="34"/>
-                <w:szCs w:val="34"/>
-              </w:rPr>
-            </w:pPr>
-            <w:r>
-              <w:rPr>
-                <w:rFonts w:ascii="TH SarabunIT๙" w:hAnsi="TH SarabunIT๙" w:cs="TH SarabunIT๙"/>
-                <w:spacing w:val="4"/>
-                <w:sz w:val="34"/>
-                <w:szCs w:val="34"/>
-              </w:rPr>
-              <w:t>${name_n16}</w:t>
-            </w:r>
-          </w:p>
-        </w:tc>
-        <w:tc>
-          <w:tcPr>
-            <w:tcW w:w="1517" w:type="dxa"/>
-          </w:tcPr>
-          <w:p>
-            <w:pPr>
-              <w:jc w:val="right"/>
-              <w:rPr>
-                <w:rFonts w:ascii="TH SarabunIT๙" w:hAnsi="TH SarabunIT๙" w:cs="TH SarabunIT๙"/>
-              </w:rPr>
-            </w:pPr>
-            <w:r>
-              <w:rPr>
-                <w:rFonts w:ascii="TH SarabunIT๙" w:hAnsi="TH SarabunIT๙" w:cs="TH SarabunIT๙"/>
-                <w:spacing w:val="4"/>
-                <w:sz w:val="34"/>
-                <w:szCs w:val="34"/>
-              </w:rPr>
-              <w:t>${t3_n16}</w:t>
-            </w:r>
-          </w:p>
-        </w:tc>
-        <w:tc>
-          <w:tcPr>
-            <w:tcW w:w="2313" w:type="dxa"/>
-          </w:tcPr>
-          <w:p>
-            <w:pPr>
-              <w:ind w:right="-102"/>
-              <w:jc w:val="right"/>
-              <w:rPr>
-                <w:rFonts w:ascii="TH SarabunIT๙" w:hAnsi="TH SarabunIT๙" w:cs="TH SarabunIT๙"/>
-              </w:rPr>
-            </w:pPr>
-            <w:r>
-              <w:rPr>
-                <w:rFonts w:ascii="TH SarabunIT๙" w:hAnsi="TH SarabunIT๙" w:cs="TH SarabunIT๙"/>
-                <w:spacing w:val="4"/>
-                <w:sz w:val="34"/>
-                <w:szCs w:val="34"/>
-              </w:rPr>
-              <w:t>${price_n16}</w:t>
-            </w:r>
-          </w:p>
-        </w:tc>
-      </w:tr>
-      <w:tr>
-        <w:tc>
-          <w:tcPr>
-            <w:tcW w:w="943" w:type="dxa"/>
-          </w:tcPr>
-          <w:p>
-            <w:pPr>
-              <w:jc w:val="right"/>
-              <w:rPr>
-                <w:rFonts w:ascii="TH SarabunIT๙" w:hAnsi="TH SarabunIT๙" w:cs="TH SarabunIT๙"/>
-              </w:rPr>
-            </w:pPr>
-            <w:r>
-              <w:rPr>
-                <w:rFonts w:ascii="TH SarabunIT๙" w:hAnsi="TH SarabunIT๙" w:cs="TH SarabunIT๙"/>
-                <w:spacing w:val="4"/>
-                <w:sz w:val="34"/>
-                <w:szCs w:val="34"/>
-              </w:rPr>
-              <w:t>${n17}</w:t>
-            </w:r>
-          </w:p>
-        </w:tc>
-        <w:tc>
-          <w:tcPr>
-            <w:tcW w:w="3731" w:type="dxa"/>
-            <w:shd w:val="clear" w:color="auto" w:fill="auto"/>
-          </w:tcPr>
-          <w:p>
-            <w:pPr>
-              <w:ind w:right="-6"/>
-              <w:jc w:val="thaiDistribute"/>
-              <w:rPr>
-                <w:rFonts w:ascii="TH SarabunIT๙" w:hAnsi="TH SarabunIT๙" w:cs="TH SarabunIT๙"/>
-                <w:spacing w:val="4"/>
-                <w:sz w:val="34"/>
-                <w:szCs w:val="34"/>
-              </w:rPr>
-            </w:pPr>
-            <w:r>
-              <w:rPr>
-                <w:rFonts w:ascii="TH SarabunIT๙" w:hAnsi="TH SarabunIT๙" w:cs="TH SarabunIT๙"/>
-                <w:spacing w:val="4"/>
-                <w:sz w:val="34"/>
-                <w:szCs w:val="34"/>
-              </w:rPr>
-              <w:t>${name_n17}</w:t>
-            </w:r>
-          </w:p>
-        </w:tc>
-        <w:tc>
-          <w:tcPr>
-            <w:tcW w:w="1517" w:type="dxa"/>
-          </w:tcPr>
-          <w:p>
-            <w:pPr>
-              <w:jc w:val="right"/>
-              <w:rPr>
-                <w:rFonts w:ascii="TH SarabunIT๙" w:hAnsi="TH SarabunIT๙" w:cs="TH SarabunIT๙"/>
-              </w:rPr>
-            </w:pPr>
-            <w:r>
-              <w:rPr>
-                <w:rFonts w:ascii="TH SarabunIT๙" w:hAnsi="TH SarabunIT๙" w:cs="TH SarabunIT๙"/>
-                <w:spacing w:val="4"/>
-                <w:sz w:val="34"/>
-                <w:szCs w:val="34"/>
-              </w:rPr>
-              <w:t>${t3_n17}</w:t>
-            </w:r>
-          </w:p>
-        </w:tc>
-        <w:tc>
-          <w:tcPr>
-            <w:tcW w:w="2313" w:type="dxa"/>
-          </w:tcPr>
-          <w:p>
-            <w:pPr>
-              <w:ind w:right="-102"/>
-              <w:jc w:val="right"/>
-              <w:rPr>
-                <w:rFonts w:ascii="TH SarabunIT๙" w:hAnsi="TH SarabunIT๙" w:cs="TH SarabunIT๙"/>
-              </w:rPr>
-            </w:pPr>
-            <w:r>
-              <w:rPr>
-                <w:rFonts w:ascii="TH SarabunIT๙" w:hAnsi="TH SarabunIT๙" w:cs="TH SarabunIT๙"/>
-                <w:spacing w:val="4"/>
-                <w:sz w:val="34"/>
-                <w:szCs w:val="34"/>
-              </w:rPr>
-              <w:t>${price_n17}</w:t>
-            </w:r>
-          </w:p>
-        </w:tc>
-      </w:tr>
-      <w:tr>
-        <w:tc>
-          <w:tcPr>
-            <w:tcW w:w="943" w:type="dxa"/>
-          </w:tcPr>
-          <w:p>
-            <w:pPr>
-              <w:jc w:val="right"/>
-              <w:rPr>
-                <w:rFonts w:ascii="TH SarabunIT๙" w:hAnsi="TH SarabunIT๙" w:cs="TH SarabunIT๙"/>
-              </w:rPr>
-            </w:pPr>
-            <w:r>
-              <w:rPr>
-                <w:rFonts w:ascii="TH SarabunIT๙" w:hAnsi="TH SarabunIT๙" w:cs="TH SarabunIT๙"/>
-                <w:spacing w:val="4"/>
-                <w:sz w:val="34"/>
-                <w:szCs w:val="34"/>
-              </w:rPr>
-              <w:t>${n18}</w:t>
-            </w:r>
-          </w:p>
-        </w:tc>
-        <w:tc>
-          <w:tcPr>
-            <w:tcW w:w="3731" w:type="dxa"/>
-            <w:shd w:val="clear" w:color="auto" w:fill="auto"/>
-          </w:tcPr>
-          <w:p>
-            <w:pPr>
-              <w:ind w:right="-6"/>
-              <w:jc w:val="thaiDistribute"/>
-              <w:rPr>
-                <w:rFonts w:ascii="TH SarabunIT๙" w:hAnsi="TH SarabunIT๙" w:cs="TH SarabunIT๙"/>
-                <w:spacing w:val="4"/>
-                <w:sz w:val="34"/>
-                <w:szCs w:val="34"/>
-              </w:rPr>
-            </w:pPr>
-            <w:r>
-              <w:rPr>
-                <w:rFonts w:ascii="TH SarabunIT๙" w:hAnsi="TH SarabunIT๙" w:cs="TH SarabunIT๙"/>
-                <w:spacing w:val="4"/>
-                <w:sz w:val="34"/>
-                <w:szCs w:val="34"/>
-              </w:rPr>
-              <w:t>${name_n18}</w:t>
-            </w:r>
-          </w:p>
-        </w:tc>
-        <w:tc>
-          <w:tcPr>
-            <w:tcW w:w="1517" w:type="dxa"/>
-          </w:tcPr>
-          <w:p>
-            <w:pPr>
-              <w:jc w:val="right"/>
-              <w:rPr>
-                <w:rFonts w:ascii="TH SarabunIT๙" w:hAnsi="TH SarabunIT๙" w:cs="TH SarabunIT๙"/>
-              </w:rPr>
-            </w:pPr>
-            <w:r>
-              <w:rPr>
-                <w:rFonts w:ascii="TH SarabunIT๙" w:hAnsi="TH SarabunIT๙" w:cs="TH SarabunIT๙"/>
-                <w:spacing w:val="4"/>
-                <w:sz w:val="34"/>
-                <w:szCs w:val="34"/>
-              </w:rPr>
-              <w:t>${t3_n18}</w:t>
-            </w:r>
-          </w:p>
-        </w:tc>
-        <w:tc>
-          <w:tcPr>
-            <w:tcW w:w="2313" w:type="dxa"/>
-          </w:tcPr>
-          <w:p>
-            <w:pPr>
-              <w:ind w:right="-102"/>
-              <w:jc w:val="right"/>
-              <w:rPr>
-                <w:rFonts w:ascii="TH SarabunIT๙" w:hAnsi="TH SarabunIT๙" w:cs="TH SarabunIT๙"/>
-              </w:rPr>
-            </w:pPr>
-            <w:r>
-              <w:rPr>
-                <w:rFonts w:ascii="TH SarabunIT๙" w:hAnsi="TH SarabunIT๙" w:cs="TH SarabunIT๙"/>
-                <w:spacing w:val="4"/>
-                <w:sz w:val="34"/>
-                <w:szCs w:val="34"/>
-              </w:rPr>
-              <w:t>${price_n18}</w:t>
-            </w:r>
-          </w:p>
-        </w:tc>
-      </w:tr>
-      <w:tr>
-        <w:tc>
-          <w:tcPr>
-            <w:tcW w:w="943" w:type="dxa"/>
-          </w:tcPr>
-          <w:p>
-            <w:pPr>
-              <w:jc w:val="right"/>
-              <w:rPr>
-                <w:rFonts w:ascii="TH SarabunIT๙" w:hAnsi="TH SarabunIT๙" w:cs="TH SarabunIT๙"/>
-              </w:rPr>
-            </w:pPr>
-            <w:r>
-              <w:rPr>
-                <w:rFonts w:ascii="TH SarabunIT๙" w:hAnsi="TH SarabunIT๙" w:cs="TH SarabunIT๙"/>
-                <w:spacing w:val="4"/>
-                <w:sz w:val="34"/>
-                <w:szCs w:val="34"/>
-              </w:rPr>
-              <w:t>${n19}</w:t>
-            </w:r>
-          </w:p>
-        </w:tc>
-        <w:tc>
-          <w:tcPr>
-            <w:tcW w:w="3731" w:type="dxa"/>
-            <w:shd w:val="clear" w:color="auto" w:fill="auto"/>
-          </w:tcPr>
-          <w:p>
-            <w:pPr>
-              <w:ind w:right="-6"/>
-              <w:jc w:val="thaiDistribute"/>
-              <w:rPr>
-                <w:rFonts w:ascii="TH SarabunIT๙" w:hAnsi="TH SarabunIT๙" w:cs="TH SarabunIT๙"/>
-                <w:spacing w:val="4"/>
-                <w:sz w:val="34"/>
-                <w:szCs w:val="34"/>
-              </w:rPr>
-            </w:pPr>
-            <w:r>
-              <w:rPr>
-                <w:rFonts w:ascii="TH SarabunIT๙" w:hAnsi="TH SarabunIT๙" w:cs="TH SarabunIT๙"/>
-                <w:spacing w:val="4"/>
-                <w:sz w:val="34"/>
-                <w:szCs w:val="34"/>
-              </w:rPr>
-              <w:t>${name_n19}</w:t>
-            </w:r>
-          </w:p>
-        </w:tc>
-        <w:tc>
-          <w:tcPr>
-            <w:tcW w:w="1517" w:type="dxa"/>
-          </w:tcPr>
-          <w:p>
-            <w:pPr>
-              <w:jc w:val="right"/>
-              <w:rPr>
-                <w:rFonts w:ascii="TH SarabunIT๙" w:hAnsi="TH SarabunIT๙" w:cs="TH SarabunIT๙"/>
-              </w:rPr>
-            </w:pPr>
-            <w:r>
-              <w:rPr>
-                <w:rFonts w:ascii="TH SarabunIT๙" w:hAnsi="TH SarabunIT๙" w:cs="TH SarabunIT๙"/>
-                <w:spacing w:val="4"/>
-                <w:sz w:val="34"/>
-                <w:szCs w:val="34"/>
-              </w:rPr>
-              <w:t>${t3_n19}</w:t>
-            </w:r>
-          </w:p>
-        </w:tc>
-        <w:tc>
-          <w:tcPr>
-            <w:tcW w:w="2313" w:type="dxa"/>
-          </w:tcPr>
-          <w:p>
-            <w:pPr>
-              <w:ind w:right="-102"/>
-              <w:jc w:val="right"/>
-              <w:rPr>
-                <w:rFonts w:ascii="TH SarabunIT๙" w:hAnsi="TH SarabunIT๙" w:cs="TH SarabunIT๙"/>
-              </w:rPr>
-            </w:pPr>
-            <w:r>
-              <w:rPr>
-                <w:rFonts w:ascii="TH SarabunIT๙" w:hAnsi="TH SarabunIT๙" w:cs="TH SarabunIT๙"/>
-                <w:spacing w:val="4"/>
-                <w:sz w:val="34"/>
-                <w:szCs w:val="34"/>
-              </w:rPr>
-              <w:t>${price_n19}</w:t>
-            </w:r>
-          </w:p>
-        </w:tc>
-      </w:tr>
-      <w:tr>
-        <w:tc>
-          <w:tcPr>
-            <w:tcW w:w="943" w:type="dxa"/>
-          </w:tcPr>
-          <w:p>
-            <w:pPr>
-              <w:jc w:val="right"/>
-              <w:rPr>
-                <w:rFonts w:ascii="TH SarabunIT๙" w:hAnsi="TH SarabunIT๙" w:cs="TH SarabunIT๙"/>
-              </w:rPr>
-            </w:pPr>
-            <w:r>
-              <w:rPr>
-                <w:rFonts w:ascii="TH SarabunIT๙" w:hAnsi="TH SarabunIT๙" w:cs="TH SarabunIT๙"/>
-                <w:spacing w:val="4"/>
-                <w:sz w:val="34"/>
-                <w:szCs w:val="34"/>
-              </w:rPr>
-              <w:t>${n20}</w:t>
-            </w:r>
-          </w:p>
-        </w:tc>
-        <w:tc>
-          <w:tcPr>
-            <w:tcW w:w="3731" w:type="dxa"/>
-            <w:shd w:val="clear" w:color="auto" w:fill="auto"/>
-          </w:tcPr>
-          <w:p>
-            <w:pPr>
-              <w:ind w:right="-6"/>
-              <w:jc w:val="thaiDistribute"/>
-              <w:rPr>
-                <w:rFonts w:ascii="TH SarabunIT๙" w:hAnsi="TH SarabunIT๙" w:cs="TH SarabunIT๙"/>
-                <w:spacing w:val="4"/>
-                <w:sz w:val="34"/>
-                <w:szCs w:val="34"/>
-              </w:rPr>
-            </w:pPr>
-            <w:r>
-              <w:rPr>
-                <w:rFonts w:ascii="TH SarabunIT๙" w:hAnsi="TH SarabunIT๙" w:cs="TH SarabunIT๙"/>
-                <w:spacing w:val="4"/>
-                <w:sz w:val="34"/>
-                <w:szCs w:val="34"/>
-              </w:rPr>
-              <w:t>${name_n20}</w:t>
-            </w:r>
-          </w:p>
-        </w:tc>
-        <w:tc>
-          <w:tcPr>
-            <w:tcW w:w="1517" w:type="dxa"/>
-          </w:tcPr>
-          <w:p>
-            <w:pPr>
-              <w:jc w:val="right"/>
-              <w:rPr>
-                <w:rFonts w:ascii="TH SarabunIT๙" w:hAnsi="TH SarabunIT๙" w:cs="TH SarabunIT๙"/>
-              </w:rPr>
-            </w:pPr>
-            <w:r>
-              <w:rPr>
-                <w:rFonts w:ascii="TH SarabunIT๙" w:hAnsi="TH SarabunIT๙" w:cs="TH SarabunIT๙"/>
-                <w:spacing w:val="4"/>
-                <w:sz w:val="34"/>
-                <w:szCs w:val="34"/>
-              </w:rPr>
-              <w:t>${t3_n20}</w:t>
-            </w:r>
-          </w:p>
-        </w:tc>
-        <w:tc>
-          <w:tcPr>
-            <w:tcW w:w="2313" w:type="dxa"/>
-          </w:tcPr>
-          <w:p>
-            <w:pPr>
-              <w:ind w:right="-102"/>
-              <w:jc w:val="right"/>
-              <w:rPr>
-                <w:rFonts w:ascii="TH SarabunIT๙" w:hAnsi="TH SarabunIT๙" w:cs="TH SarabunIT๙"/>
-              </w:rPr>
-            </w:pPr>
-            <w:r>
-              <w:rPr>
-                <w:rFonts w:ascii="TH SarabunIT๙" w:hAnsi="TH SarabunIT๙" w:cs="TH SarabunIT๙"/>
-                <w:spacing w:val="4"/>
-                <w:sz w:val="34"/>
-                <w:szCs w:val="34"/>
-              </w:rPr>
-              <w:t>${price_n20}</w:t>
-            </w:r>
-          </w:p>
-        </w:tc>
-      </w:tr>
-      <w:tr>
-        <w:tc>
-          <w:tcPr>
-            <w:tcW w:w="943" w:type="dxa"/>
-          </w:tcPr>
-          <w:p>
-            <w:pPr>
-              <w:ind w:right="-6"/>
-              <w:jc w:val="right"/>
-              <w:rPr>
-                <w:rFonts w:ascii="TH SarabunIT๙" w:hAnsi="TH SarabunIT๙" w:cs="TH SarabunIT๙"/>
-                <w:spacing w:val="4"/>
-                <w:sz w:val="34"/>
-                <w:szCs w:val="34"/>
-                <w:cs/>
-              </w:rPr>
-            </w:pPr>
-            <w:r>
-              <w:rPr>
-                <w:rFonts w:ascii="TH SarabunIT๙" w:hAnsi="TH SarabunIT๙" w:cs="TH SarabunIT๙"/>
-                <w:spacing w:val="4"/>
-                <w:sz w:val="34"/>
-                <w:szCs w:val="34"/>
-              </w:rPr>
-              <w:t>${n21}</w:t>
-            </w:r>
-          </w:p>
-        </w:tc>
-        <w:tc>
-          <w:tcPr>
-            <w:tcW w:w="3731" w:type="dxa"/>
-            <w:shd w:val="clear" w:color="auto" w:fill="auto"/>
-          </w:tcPr>
-          <w:p>
-            <w:pPr>
-              <w:ind w:right="-6"/>
-              <w:jc w:val="thaiDistribute"/>
-              <w:rPr>
-                <w:rFonts w:ascii="TH SarabunIT๙" w:hAnsi="TH SarabunIT๙" w:cs="TH SarabunIT๙"/>
-                <w:spacing w:val="4"/>
-                <w:sz w:val="34"/>
-                <w:szCs w:val="34"/>
-              </w:rPr>
-            </w:pPr>
-            <w:r>
-              <w:rPr>
-                <w:rFonts w:ascii="TH SarabunIT๙" w:hAnsi="TH SarabunIT๙" w:cs="TH SarabunIT๙"/>
-                <w:spacing w:val="4"/>
-                <w:sz w:val="34"/>
-                <w:szCs w:val="34"/>
-              </w:rPr>
-              <w:t>${name_n21}</w:t>
-            </w:r>
-          </w:p>
-        </w:tc>
-        <w:tc>
-          <w:tcPr>
-            <w:tcW w:w="1517" w:type="dxa"/>
-          </w:tcPr>
-          <w:p>
-            <w:pPr>
-              <w:jc w:val="right"/>
-              <w:rPr>
-                <w:rFonts w:ascii="TH SarabunIT๙" w:hAnsi="TH SarabunIT๙" w:cs="TH SarabunIT๙"/>
-              </w:rPr>
-            </w:pPr>
-            <w:r>
-              <w:rPr>
-                <w:rFonts w:ascii="TH SarabunIT๙" w:hAnsi="TH SarabunIT๙" w:cs="TH SarabunIT๙"/>
-                <w:spacing w:val="4"/>
-                <w:sz w:val="34"/>
-                <w:szCs w:val="34"/>
-              </w:rPr>
-              <w:t>${t3_n21}</w:t>
-            </w:r>
-          </w:p>
-        </w:tc>
-        <w:tc>
-          <w:tcPr>
-            <w:tcW w:w="2313" w:type="dxa"/>
-          </w:tcPr>
-          <w:p>
-            <w:pPr>
-              <w:ind w:right="-102"/>
-              <w:jc w:val="right"/>
-              <w:rPr>
-                <w:rFonts w:ascii="TH SarabunIT๙" w:hAnsi="TH SarabunIT๙" w:cs="TH SarabunIT๙"/>
-              </w:rPr>
-            </w:pPr>
-            <w:r>
-              <w:rPr>
-                <w:rFonts w:ascii="TH SarabunIT๙" w:hAnsi="TH SarabunIT๙" w:cs="TH SarabunIT๙"/>
-                <w:spacing w:val="4"/>
-                <w:sz w:val="34"/>
-                <w:szCs w:val="34"/>
-              </w:rPr>
-              <w:t>${price_n21}</w:t>
-            </w:r>
-          </w:p>
-        </w:tc>
-      </w:tr>
-      <w:tr>
-        <w:tc>
-          <w:tcPr>
-            <w:tcW w:w="943" w:type="dxa"/>
-          </w:tcPr>
-          <w:p>
-            <w:pPr>
-              <w:ind w:right="-6"/>
-              <w:jc w:val="right"/>
-              <w:rPr>
-                <w:rFonts w:ascii="TH SarabunIT๙" w:hAnsi="TH SarabunIT๙" w:cs="TH SarabunIT๙"/>
-                <w:spacing w:val="4"/>
-                <w:sz w:val="34"/>
-                <w:szCs w:val="34"/>
-              </w:rPr>
-            </w:pPr>
-            <w:r>
-              <w:rPr>
-                <w:rFonts w:ascii="TH SarabunIT๙" w:hAnsi="TH SarabunIT๙" w:cs="TH SarabunIT๙"/>
-                <w:spacing w:val="4"/>
-                <w:sz w:val="34"/>
-                <w:szCs w:val="34"/>
-              </w:rPr>
-              <w:t>${n22}</w:t>
-            </w:r>
-          </w:p>
-        </w:tc>
-        <w:tc>
-          <w:tcPr>
-            <w:tcW w:w="3731" w:type="dxa"/>
-            <w:shd w:val="clear" w:color="auto" w:fill="auto"/>
-          </w:tcPr>
-          <w:p>
-            <w:pPr>
-              <w:ind w:right="-6"/>
-              <w:jc w:val="thaiDistribute"/>
-              <w:rPr>
-                <w:rFonts w:ascii="TH SarabunIT๙" w:hAnsi="TH SarabunIT๙" w:cs="TH SarabunIT๙"/>
-                <w:spacing w:val="4"/>
-                <w:sz w:val="34"/>
-                <w:szCs w:val="34"/>
-              </w:rPr>
-            </w:pPr>
-            <w:r>
-              <w:rPr>
-                <w:rFonts w:ascii="TH SarabunIT๙" w:hAnsi="TH SarabunIT๙" w:cs="TH SarabunIT๙"/>
-                <w:spacing w:val="4"/>
-                <w:sz w:val="34"/>
-                <w:szCs w:val="34"/>
-              </w:rPr>
-              <w:t>${name_n22}</w:t>
-            </w:r>
-          </w:p>
-        </w:tc>
-        <w:tc>
-          <w:tcPr>
-            <w:tcW w:w="1517" w:type="dxa"/>
-          </w:tcPr>
-          <w:p>
-            <w:pPr>
-              <w:jc w:val="right"/>
-              <w:rPr>
-                <w:rFonts w:ascii="TH SarabunIT๙" w:hAnsi="TH SarabunIT๙" w:cs="TH SarabunIT๙"/>
-                <w:spacing w:val="4"/>
-                <w:sz w:val="34"/>
-                <w:szCs w:val="34"/>
-              </w:rPr>
-            </w:pPr>
-            <w:r>
-              <w:rPr>
-                <w:rFonts w:ascii="TH SarabunIT๙" w:hAnsi="TH SarabunIT๙" w:cs="TH SarabunIT๙"/>
-                <w:spacing w:val="4"/>
-                <w:sz w:val="34"/>
-                <w:szCs w:val="34"/>
-              </w:rPr>
-              <w:t>${t3_n22}</w:t>
-            </w:r>
-          </w:p>
-        </w:tc>
-        <w:tc>
-          <w:tcPr>
-            <w:tcW w:w="2313" w:type="dxa"/>
-          </w:tcPr>
-          <w:p>
-            <w:pPr>
-              <w:ind w:right="-102"/>
-              <w:jc w:val="right"/>
-              <w:rPr>
-                <w:rFonts w:ascii="TH SarabunIT๙" w:hAnsi="TH SarabunIT๙" w:cs="TH SarabunIT๙"/>
-                <w:spacing w:val="4"/>
-                <w:sz w:val="34"/>
-                <w:szCs w:val="34"/>
-              </w:rPr>
-            </w:pPr>
-            <w:r>
-              <w:rPr>
-                <w:rFonts w:ascii="TH SarabunIT๙" w:hAnsi="TH SarabunIT๙" w:cs="TH SarabunIT๙"/>
-                <w:spacing w:val="4"/>
-                <w:sz w:val="34"/>
-                <w:szCs w:val="34"/>
-              </w:rPr>
-              <w:t>${price_n22}</w:t>
-            </w:r>
-          </w:p>
-        </w:tc>
-      </w:tr>
-    </w:tbl>
     <w:p>
       <w:pPr>
         <w:spacing w:after="120"/>
@@ -4134,9 +1803,38 @@
           <w:sz w:val="34"/>
           <w:szCs w:val="34"/>
         </w:rPr>
-        <w:t>${</w:t>
-      </w:r>
-      <w:proofErr w:type="spellStart"/>
+        <w:t>${price_all}</w:t>
+      </w:r>
+      <w:r>
+        <w:rPr>
+          <w:rFonts w:ascii="TH SarabunIT๙" w:hAnsi="TH SarabunIT๙" w:cs="TH SarabunIT๙" w:hint="cs"/>
+          <w:spacing w:val="10"/>
+          <w:sz w:val="34"/>
+          <w:szCs w:val="34"/>
+          <w:cs/>
+        </w:rPr>
+        <w:t>.</w:t>
+      </w:r>
+      <w:r>
+        <w:rPr>
+          <w:rFonts w:ascii="TH SarabunIT๙" w:hAnsi="TH SarabunIT๙" w:cs="TH SarabunIT๙" w:hint="cs"/>
+          <w:spacing w:val="10"/>
+          <w:sz w:val="34"/>
+          <w:szCs w:val="34"/>
+          <w:cs/>
+        </w:rPr>
+        <w:t xml:space="preserve">- บาท </w:t>
+      </w:r>
+      <w:r>
+        <w:rPr>
+          <w:rFonts w:ascii="TH SarabunIT๙" w:hAnsi="TH SarabunIT๙" w:cs="TH SarabunIT๙" w:hint="cs"/>
+          <w:spacing w:val="10"/>
+          <w:sz w:val="34"/>
+          <w:szCs w:val="34"/>
+          <w:cs/>
+        </w:rPr>
+        <w:t>(</w:t>
+      </w:r>
       <w:r>
         <w:rPr>
           <w:rFonts w:ascii="TH SarabunIT๙" w:hAnsi="TH SarabunIT๙" w:cs="TH SarabunIT๙"/>
@@ -4144,13 +1842,12 @@
           <w:sz w:val="34"/>
           <w:szCs w:val="34"/>
         </w:rPr>
-        <w:t>price_all</w:t>
-      </w:r>
-      <w:proofErr w:type="spellEnd"/>
-      <w:r>
-        <w:rPr>
-          <w:rFonts w:ascii="TH SarabunIT๙" w:hAnsi="TH SarabunIT๙" w:cs="TH SarabunIT๙"/>
-          <w:spacing w:val="-6"/>
+        <w:t>${price_all_text</w:t>
+      </w:r>
+      <w:r>
+        <w:rPr>
+          <w:rFonts w:ascii="TH SarabunIT๙" w:hAnsi="TH SarabunIT๙" w:cs="TH SarabunIT๙"/>
+          <w:spacing w:val="10"/>
           <w:sz w:val="34"/>
           <w:szCs w:val="34"/>
         </w:rPr>
@@ -4164,65 +1861,6 @@
           <w:szCs w:val="34"/>
           <w:cs/>
         </w:rPr>
-        <w:t>.</w:t>
-      </w:r>
-      <w:r>
-        <w:rPr>
-          <w:rFonts w:ascii="TH SarabunIT๙" w:hAnsi="TH SarabunIT๙" w:cs="TH SarabunIT๙" w:hint="cs"/>
-          <w:spacing w:val="10"/>
-          <w:sz w:val="34"/>
-          <w:szCs w:val="34"/>
-          <w:cs/>
-        </w:rPr>
-        <w:t xml:space="preserve">- บาท </w:t>
-      </w:r>
-      <w:r>
-        <w:rPr>
-          <w:rFonts w:ascii="TH SarabunIT๙" w:hAnsi="TH SarabunIT๙" w:cs="TH SarabunIT๙" w:hint="cs"/>
-          <w:spacing w:val="10"/>
-          <w:sz w:val="34"/>
-          <w:szCs w:val="34"/>
-          <w:cs/>
-        </w:rPr>
-        <w:t>(</w:t>
-      </w:r>
-      <w:r>
-        <w:rPr>
-          <w:rFonts w:ascii="TH SarabunIT๙" w:hAnsi="TH SarabunIT๙" w:cs="TH SarabunIT๙"/>
-          <w:spacing w:val="-6"/>
-          <w:sz w:val="34"/>
-          <w:szCs w:val="34"/>
-        </w:rPr>
-        <w:t>${</w:t>
-      </w:r>
-      <w:proofErr w:type="spellStart"/>
-      <w:r>
-        <w:rPr>
-          <w:rFonts w:ascii="TH SarabunIT๙" w:hAnsi="TH SarabunIT๙" w:cs="TH SarabunIT๙"/>
-          <w:spacing w:val="-6"/>
-          <w:sz w:val="34"/>
-          <w:szCs w:val="34"/>
-        </w:rPr>
-        <w:t>price_all_text</w:t>
-      </w:r>
-      <w:proofErr w:type="spellEnd"/>
-      <w:r>
-        <w:rPr>
-          <w:rFonts w:ascii="TH SarabunIT๙" w:hAnsi="TH SarabunIT๙" w:cs="TH SarabunIT๙"/>
-          <w:spacing w:val="10"/>
-          <w:sz w:val="34"/>
-          <w:szCs w:val="34"/>
-        </w:rPr>
-        <w:t>}</w:t>
-      </w:r>
-      <w:r>
-        <w:rPr>
-          <w:rFonts w:ascii="TH SarabunIT๙" w:hAnsi="TH SarabunIT๙" w:cs="TH SarabunIT๙" w:hint="cs"/>
-          <w:spacing w:val="10"/>
-          <w:sz w:val="34"/>
-          <w:szCs w:val="34"/>
-          <w:cs/>
-        </w:rPr>
         <w:t xml:space="preserve">) </w:t>
       </w:r>
       <w:r>
@@ -4243,7 +1881,27 @@
           <w:szCs w:val="34"/>
           <w:cs/>
         </w:rPr>
-        <w:t>จากบัญชีสำนักงานประจำศาลเยาวชนและครอบครัวจังหวัดประจวบคีรีขันธ์ เพื่องบดำเนินการ</w:t>
+        <w:t>จากบัญชีสำนักงานประจำศาลจังหวัด</w:t>
+      </w:r>
+      <w:r>
+        <w:rPr>
+          <w:rFonts w:ascii="TH SarabunIT๙" w:hAnsi="TH SarabunIT๙" w:cs="TH SarabunIT๙" w:hint="cs"/>
+          <w:spacing w:val="-4"/>
+          <w:sz w:val="34"/>
+          <w:szCs w:val="34"/>
+          <w:cs/>
+        </w:rPr>
+        <w:t>เบตง</w:t>
+      </w:r>
+      <w:r>
+        <w:rPr>
+          <w:rFonts w:ascii="TH SarabunIT๙" w:hAnsi="TH SarabunIT๙" w:cs="TH SarabunIT๙"/>
+          <w:spacing w:val="-4"/>
+          <w:sz w:val="34"/>
+          <w:szCs w:val="34"/>
+          <w:cs/>
+        </w:rPr>
+        <w:t xml:space="preserve"> เพื่องบดำเนินการ</w:t>
       </w:r>
       <w:r>
         <w:rPr>
@@ -4476,6 +2134,7 @@
           <w:szCs w:val="34"/>
           <w:cs/>
         </w:rPr>
+        <w:lastRenderedPageBreak/>
         <w:t xml:space="preserve">                                             </w:t>
       </w:r>
       <w:r>
@@ -4542,25 +2201,16 @@
           <w:szCs w:val="34"/>
           <w:cs/>
         </w:rPr>
-        <w:t>นางสาวพจนา</w:t>
-      </w:r>
-      <w:r>
-        <w:rPr>
-          <w:rFonts w:ascii="TH SarabunIT๙" w:hAnsi="TH SarabunIT๙" w:cs="TH SarabunIT๙" w:hint="cs"/>
-          <w:sz w:val="34"/>
-          <w:szCs w:val="34"/>
-          <w:cs/>
-        </w:rPr>
-        <w:t xml:space="preserve"> </w:t>
-      </w:r>
-      <w:r>
-        <w:rPr>
-          <w:rFonts w:ascii="TH SarabunIT๙" w:hAnsi="TH SarabunIT๙" w:cs="TH SarabunIT๙" w:hint="cs"/>
-          <w:sz w:val="34"/>
-          <w:szCs w:val="34"/>
-          <w:cs/>
-        </w:rPr>
-        <w:t>เทพพิชิตสมุทร</w:t>
+        <w:t>นางสาว</w:t>
+      </w:r>
+      <w:r>
+        <w:rPr>
+          <w:rFonts w:ascii="TH SarabunIT๙" w:hAnsi="TH SarabunIT๙" w:cs="TH SarabunIT๙" w:hint="cs"/>
+          <w:sz w:val="34"/>
+          <w:szCs w:val="34"/>
+          <w:cs/>
+        </w:rPr>
+        <w:t>จุฑามาศ  มโนสันติ์</w:t>
       </w:r>
       <w:r>
         <w:rPr>
@@ -4606,7 +2256,16 @@
           <w:szCs w:val="34"/>
           <w:cs/>
         </w:rPr>
-        <w:t>นักวิชาการเงินและบัญชีปฏิบัติการ</w:t>
+        <w:t>นักวิชาการเงินและบัญชี</w:t>
+      </w:r>
+      <w:r>
+        <w:rPr>
+          <w:rFonts w:ascii="TH SarabunIT๙" w:hAnsi="TH SarabunIT๙" w:cs="TH SarabunIT๙" w:hint="cs"/>
+          <w:sz w:val="34"/>
+          <w:szCs w:val="34"/>
+          <w:cs/>
+        </w:rPr>
+        <w:t>ชำนาญงาน</w:t>
       </w:r>
     </w:p>
     <w:p>
@@ -4739,7 +2398,6 @@
           <w:szCs w:val="58"/>
           <w:cs/>
         </w:rPr>
-        <w:lastRenderedPageBreak/>
         <w:t xml:space="preserve">                          </w:t>
       </w:r>
       <w:r>
@@ -4908,7 +2566,16 @@
           <w:szCs w:val="34"/>
           <w:cs/>
         </w:rPr>
-        <w:t>ผู้พิพากษาหัวหน้าศาลเยาวชนและครอบครัวจังหวัดประจวบคีรีขันธ์</w:t>
+        <w:t>ผู้พิพากษาหัวหน้าศาล</w:t>
+      </w:r>
+      <w:r>
+        <w:rPr>
+          <w:rFonts w:ascii="TH SarabunIT๙" w:hAnsi="TH SarabunIT๙" w:cs="TH SarabunIT๙" w:hint="cs"/>
+          <w:sz w:val="34"/>
+          <w:szCs w:val="34"/>
+          <w:cs/>
+        </w:rPr>
+        <w:t>จังหวัดเบตง</w:t>
       </w:r>
     </w:p>
     <w:p>
@@ -5029,9 +2696,37 @@
           <w:sz w:val="34"/>
           <w:szCs w:val="34"/>
         </w:rPr>
-        <w:t>${</w:t>
-      </w:r>
-      <w:proofErr w:type="spellStart"/>
+        <w:t>${price_all}</w:t>
+      </w:r>
+      <w:r>
+        <w:rPr>
+          <w:rFonts w:ascii="TH SarabunIT๙" w:hAnsi="TH SarabunIT๙" w:cs="TH SarabunIT๙" w:hint="cs"/>
+          <w:spacing w:val="-2"/>
+          <w:sz w:val="34"/>
+          <w:szCs w:val="34"/>
+          <w:cs/>
+        </w:rPr>
+        <w:t>.</w:t>
+      </w:r>
+      <w:r>
+        <w:rPr>
+          <w:rFonts w:ascii="TH SarabunIT๙" w:hAnsi="TH SarabunIT๙" w:cs="TH SarabunIT๙" w:hint="cs"/>
+          <w:spacing w:val="-2"/>
+          <w:sz w:val="34"/>
+          <w:szCs w:val="34"/>
+          <w:cs/>
+        </w:rPr>
+        <w:t>- บาท</w:t>
+      </w:r>
+      <w:r>
+        <w:rPr>
+          <w:rFonts w:ascii="TH SarabunIT๙" w:hAnsi="TH SarabunIT๙" w:cs="TH SarabunIT๙" w:hint="cs"/>
+          <w:sz w:val="34"/>
+          <w:szCs w:val="34"/>
+          <w:cs/>
+        </w:rPr>
+        <w:t xml:space="preserve"> (</w:t>
+      </w:r>
       <w:r>
         <w:rPr>
           <w:rFonts w:ascii="TH SarabunIT๙" w:hAnsi="TH SarabunIT๙" w:cs="TH SarabunIT๙"/>
@@ -5039,75 +2734,7 @@
           <w:sz w:val="34"/>
           <w:szCs w:val="34"/>
         </w:rPr>
-        <w:t>price_all</w:t>
-      </w:r>
-      <w:proofErr w:type="spellEnd"/>
-      <w:r>
-        <w:rPr>
-          <w:rFonts w:ascii="TH SarabunIT๙" w:hAnsi="TH SarabunIT๙" w:cs="TH SarabunIT๙"/>
-          <w:spacing w:val="-6"/>
-          <w:sz w:val="34"/>
-          <w:szCs w:val="34"/>
-        </w:rPr>
-        <w:t>}</w:t>
-      </w:r>
-      <w:r>
-        <w:rPr>
-          <w:rFonts w:ascii="TH SarabunIT๙" w:hAnsi="TH SarabunIT๙" w:cs="TH SarabunIT๙" w:hint="cs"/>
-          <w:spacing w:val="-2"/>
-          <w:sz w:val="34"/>
-          <w:szCs w:val="34"/>
-          <w:cs/>
-        </w:rPr>
-        <w:t>.</w:t>
-      </w:r>
-      <w:r>
-        <w:rPr>
-          <w:rFonts w:ascii="TH SarabunIT๙" w:hAnsi="TH SarabunIT๙" w:cs="TH SarabunIT๙" w:hint="cs"/>
-          <w:spacing w:val="-2"/>
-          <w:sz w:val="34"/>
-          <w:szCs w:val="34"/>
-          <w:cs/>
-        </w:rPr>
-        <w:t>- บาท</w:t>
-      </w:r>
-      <w:r>
-        <w:rPr>
-          <w:rFonts w:ascii="TH SarabunIT๙" w:hAnsi="TH SarabunIT๙" w:cs="TH SarabunIT๙" w:hint="cs"/>
-          <w:sz w:val="34"/>
-          <w:szCs w:val="34"/>
-          <w:cs/>
-        </w:rPr>
-        <w:t xml:space="preserve"> (</w:t>
-      </w:r>
-      <w:r>
-        <w:rPr>
-          <w:rFonts w:ascii="TH SarabunIT๙" w:hAnsi="TH SarabunIT๙" w:cs="TH SarabunIT๙"/>
-          <w:spacing w:val="-6"/>
-          <w:sz w:val="34"/>
-          <w:szCs w:val="34"/>
-        </w:rPr>
-        <w:t>${</w:t>
-      </w:r>
-      <w:proofErr w:type="spellStart"/>
-      <w:r>
-        <w:rPr>
-          <w:rFonts w:ascii="TH SarabunIT๙" w:hAnsi="TH SarabunIT๙" w:cs="TH SarabunIT๙"/>
-          <w:spacing w:val="-6"/>
-          <w:sz w:val="34"/>
-          <w:szCs w:val="34"/>
-        </w:rPr>
-        <w:t>price_all_text</w:t>
-      </w:r>
-      <w:proofErr w:type="spellEnd"/>
-      <w:r>
-        <w:rPr>
-          <w:rFonts w:ascii="TH SarabunIT๙" w:hAnsi="TH SarabunIT๙" w:cs="TH SarabunIT๙"/>
-          <w:spacing w:val="-6"/>
-          <w:sz w:val="34"/>
-          <w:szCs w:val="34"/>
-        </w:rPr>
-        <w:t>}</w:t>
+        <w:t>${price_all_text}</w:t>
       </w:r>
       <w:r>
         <w:rPr>
@@ -5258,7 +2885,16 @@
                                 <w:szCs w:val="34"/>
                                 <w:cs/>
                               </w:rPr>
-                              <w:t>นางสาววนิดา พิพัฒน์นภาพร</w:t>
+                              <w:t>นาง</w:t>
+                            </w:r>
+                            <w:r>
+                              <w:rPr>
+                                <w:rFonts w:ascii="TH SarabunIT๙" w:hAnsi="TH SarabunIT๙" w:cs="TH SarabunIT๙" w:hint="cs"/>
+                                <w:sz w:val="34"/>
+                                <w:szCs w:val="34"/>
+                                <w:cs/>
+                              </w:rPr>
+                              <w:t>ศศิพัชร์  กิไพโรจน์</w:t>
                             </w:r>
                             <w:r>
                               <w:rPr>
@@ -5286,26 +2922,16 @@
                                 <w:szCs w:val="34"/>
                                 <w:cs/>
                               </w:rPr>
-                              <w:t>ผู้อำนวยการสำนักงานประจำศาลเยาวชนและครอบครัว</w:t>
-                            </w:r>
-                          </w:p>
-                          <w:p>
-                            <w:pPr>
-                              <w:jc w:val="center"/>
-                              <w:rPr>
-                                <w:rFonts w:ascii="TH SarabunIT๙" w:hAnsi="TH SarabunIT๙" w:cs="TH SarabunIT๙"/>
-                                <w:sz w:val="34"/>
-                                <w:szCs w:val="34"/>
-                              </w:rPr>
-                            </w:pPr>
-                            <w:r>
-                              <w:rPr>
-                                <w:rFonts w:ascii="TH SarabunIT๙" w:hAnsi="TH SarabunIT๙" w:cs="TH SarabunIT๙"/>
-                                <w:sz w:val="34"/>
-                                <w:szCs w:val="34"/>
-                                <w:cs/>
-                              </w:rPr>
-                              <w:t>จังหวัดประจวบคีรีขันธ์</w:t>
+                              <w:t>ผู้อำนวยการสำนักงานประจำศาลจังหวัด</w:t>
+                            </w:r>
+                            <w:r>
+                              <w:rPr>
+                                <w:rFonts w:ascii="TH SarabunIT๙" w:hAnsi="TH SarabunIT๙" w:cs="TH SarabunIT๙" w:hint="cs"/>
+                                <w:sz w:val="34"/>
+                                <w:szCs w:val="34"/>
+                                <w:cs/>
+                              </w:rPr>
+                              <w:t>เบตง</w:t>
                             </w:r>
                           </w:p>
                           <w:p>
@@ -5352,7 +2978,7 @@
           </mc:Choice>
           <mc:Fallback>
             <w:pict>
-              <v:shape w14:anchorId="03A6435B" id="Text Box 86" o:spid="_x0000_s1027" type="#_x0000_t202" style="position:absolute;left:0;text-align:left;margin-left:180.45pt;margin-top:21.15pt;width:300.75pt;height:108.75pt;z-index:251656192;visibility:visible;mso-wrap-style:square;mso-width-percent:0;mso-height-percent:0;mso-wrap-distance-left:9pt;mso-wrap-distance-top:0;mso-wrap-distance-right:9pt;mso-wrap-distance-bottom:0;mso-position-horizontal:absolute;mso-position-horizontal-relative:text;mso-position-vertical:absolute;mso-position-vertical-relative:text;mso-width-percent:0;mso-height-percent:0;mso-width-relative:page;mso-height-relative:page;v-text-anchor:top" o:gfxdata="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" filled="f" stroked="f">
+              <v:shape w14:anchorId="03A6435B" id="Text Box 86" o:spid="_x0000_s1027" type="#_x0000_t202" style="position:absolute;left:0;text-align:left;margin-left:180.45pt;margin-top:21.15pt;width:300.75pt;height:108.75pt;z-index:251656192;visibility:visible;mso-wrap-style:square;mso-width-percent:0;mso-height-percent:0;mso-wrap-distance-left:9pt;mso-wrap-distance-top:0;mso-wrap-distance-right:9pt;mso-wrap-distance-bottom:0;mso-position-horizontal:absolute;mso-position-horizontal-relative:text;mso-position-vertical:absolute;mso-position-vertical-relative:text;mso-width-percent:0;mso-height-percent:0;mso-width-relative:page;mso-height-relative:page;v-text-anchor:top" o:gfxdata="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" filled="f" stroked="f">
                 <v:textbox>
                   <w:txbxContent>
                     <w:p>
@@ -5399,7 +3025,36 @@
                           <w:szCs w:val="34"/>
                           <w:cs/>
                         </w:rPr>
-                        <w:t>นางสาววนิดา พิพัฒน์นภาพร</w:t>
+                        <w:t>นาง</w:t>
+                      </w:r>
+                      <w:r>
+                        <w:rPr>
+                          <w:rFonts w:ascii="TH SarabunIT๙" w:hAnsi="TH SarabunIT๙" w:cs="TH SarabunIT๙" w:hint="cs"/>
+                          <w:sz w:val="34"/>
+                          <w:szCs w:val="34"/>
+                          <w:cs/>
+                        </w:rPr>
+                        <w:t xml:space="preserve">ศศิพัชร์  </w:t>
+                      </w:r>
+                      <w:proofErr w:type="spellStart"/>
+                      <w:r>
+                        <w:rPr>
+                          <w:rFonts w:ascii="TH SarabunIT๙" w:hAnsi="TH SarabunIT๙" w:cs="TH SarabunIT๙" w:hint="cs"/>
+                          <w:sz w:val="34"/>
+                          <w:szCs w:val="34"/>
+                          <w:cs/>
+                        </w:rPr>
+                        <w:t>กิ</w:t>
+                      </w:r>
+                      <w:proofErr w:type="spellEnd"/>
+                      <w:r>
+                        <w:rPr>
+                          <w:rFonts w:ascii="TH SarabunIT๙" w:hAnsi="TH SarabunIT๙" w:cs="TH SarabunIT๙" w:hint="cs"/>
+                          <w:sz w:val="34"/>
+                          <w:szCs w:val="34"/>
+                          <w:cs/>
+                        </w:rPr>
+                        <w:t>ไพโรจน์</w:t>
                       </w:r>
                       <w:r>
                         <w:rPr>
@@ -5427,26 +3082,27 @@
                           <w:szCs w:val="34"/>
                           <w:cs/>
                         </w:rPr>
-                        <w:t>ผู้อำนวยการสำนักงานประจำศาลเยาวชนและครอบครัว</w:t>
-                      </w:r>
-                    </w:p>
-                    <w:p>
-                      <w:pPr>
-                        <w:jc w:val="center"/>
-                        <w:rPr>
-                          <w:rFonts w:ascii="TH SarabunIT๙" w:hAnsi="TH SarabunIT๙" w:cs="TH SarabunIT๙"/>
-                          <w:sz w:val="34"/>
-                          <w:szCs w:val="34"/>
-                        </w:rPr>
-                      </w:pPr>
-                      <w:r>
-                        <w:rPr>
-                          <w:rFonts w:ascii="TH SarabunIT๙" w:hAnsi="TH SarabunIT๙" w:cs="TH SarabunIT๙"/>
-                          <w:sz w:val="34"/>
-                          <w:szCs w:val="34"/>
-                          <w:cs/>
-                        </w:rPr>
-                        <w:t>จังหวัดประจวบคีรีขันธ์</w:t>
+                        <w:t>ผู้อำนวยการสำนักงานประจำศาลจังหวัด</w:t>
+                      </w:r>
+                      <w:proofErr w:type="spellStart"/>
+                      <w:r>
+                        <w:rPr>
+                          <w:rFonts w:ascii="TH SarabunIT๙" w:hAnsi="TH SarabunIT๙" w:cs="TH SarabunIT๙" w:hint="cs"/>
+                          <w:sz w:val="34"/>
+                          <w:szCs w:val="34"/>
+                          <w:cs/>
+                        </w:rPr>
+                        <w:t>เบ</w:t>
+                      </w:r>
+                      <w:proofErr w:type="spellEnd"/>
+                      <w:r>
+                        <w:rPr>
+                          <w:rFonts w:ascii="TH SarabunIT๙" w:hAnsi="TH SarabunIT๙" w:cs="TH SarabunIT๙" w:hint="cs"/>
+                          <w:sz w:val="34"/>
+                          <w:szCs w:val="34"/>
+                          <w:cs/>
+                        </w:rPr>
+                        <w:t>ตง</w:t>
                       </w:r>
                     </w:p>
                     <w:p>
@@ -5746,7 +3402,26 @@
                                 <w:szCs w:val="34"/>
                                 <w:cs/>
                               </w:rPr>
-                              <w:t>นายประยุทธ</w:t>
+                              <w:t>นาย</w:t>
+                            </w:r>
+                            <w:r>
+                              <w:rPr>
+                                <w:rFonts w:ascii="TH SarabunIT๙" w:eastAsia="Times New Roman" w:hAnsi="TH SarabunIT๙" w:cs="TH SarabunIT๙" w:hint="cs"/>
+                                <w:color w:val="333333"/>
+                                <w:sz w:val="34"/>
+                                <w:szCs w:val="34"/>
+                                <w:cs/>
+                              </w:rPr>
+                              <w:t>ฉัตรชวงศ์  ศรีพวาทกุล</w:t>
+                            </w:r>
+                            <w:r>
+                              <w:rPr>
+                                <w:rFonts w:ascii="TH SarabunIT๙" w:hAnsi="TH SarabunIT๙" w:cs="TH SarabunIT๙"/>
+                                <w:sz w:val="34"/>
+                                <w:szCs w:val="34"/>
+                                <w:cs/>
+                              </w:rPr>
+                              <w:t>)</w:t>
                             </w:r>
                             <w:r>
                               <w:rPr>
@@ -5754,9 +3429,8 @@
                                 <w:color w:val="333333"/>
                                 <w:sz w:val="34"/>
                                 <w:szCs w:val="34"/>
-                                <w:cs/>
-                              </w:rPr>
-                              <w:t xml:space="preserve"> </w:t>
+                              </w:rPr>
+                              <w:br/>
                             </w:r>
                             <w:r>
                               <w:rPr>
@@ -5766,7 +3440,7 @@
                                 <w:szCs w:val="34"/>
                                 <w:cs/>
                               </w:rPr>
-                              <w:t>แก้วภักดี</w:t>
+                              <w:t>ผู้พิพากษาหัวหน้าศาล</w:t>
                             </w:r>
                             <w:r>
                               <w:rPr>
@@ -5775,26 +3449,16 @@
                                 <w:szCs w:val="34"/>
                                 <w:cs/>
                               </w:rPr>
-                              <w:t>)</w:t>
-                            </w:r>
-                            <w:r>
-                              <w:rPr>
-                                <w:rFonts w:ascii="TH SarabunIT๙" w:eastAsia="Times New Roman" w:hAnsi="TH SarabunIT๙" w:cs="TH SarabunIT๙"/>
-                                <w:color w:val="333333"/>
-                                <w:sz w:val="34"/>
-                                <w:szCs w:val="34"/>
-                              </w:rPr>
-                              <w:br/>
-                            </w:r>
-                            <w:r>
-                              <w:rPr>
-                                <w:rFonts w:ascii="TH SarabunIT๙" w:eastAsia="Times New Roman" w:hAnsi="TH SarabunIT๙" w:cs="TH SarabunIT๙" w:hint="cs"/>
-                                <w:color w:val="333333"/>
-                                <w:sz w:val="34"/>
-                                <w:szCs w:val="34"/>
-                                <w:cs/>
-                              </w:rPr>
-                              <w:t>ผู้พิพากษาหัวหน้าคณะชั้นต้นในศาลแขวงพระนครเหนือ</w:t>
+                              <w:t>ศาลเยาวชนและครอบครัวจังหวัด</w:t>
+                            </w:r>
+                            <w:r>
+                              <w:rPr>
+                                <w:rFonts w:ascii="TH SarabunIT๙" w:hAnsi="TH SarabunIT๙" w:cs="TH SarabunIT๙" w:hint="cs"/>
+                                <w:sz w:val="34"/>
+                                <w:szCs w:val="34"/>
+                                <w:cs/>
+                              </w:rPr>
+                              <w:t>แม่ฮ่องสอน</w:t>
                             </w:r>
                           </w:p>
                           <w:p>
@@ -5831,25 +3495,16 @@
                                 <w:szCs w:val="34"/>
                                 <w:cs/>
                               </w:rPr>
-                              <w:t>ผู้พิพากษาหัวหน้าศาลเยาวชนและครอบครัว</w:t>
-                            </w:r>
-                            <w:r>
-                              <w:rPr>
-                                <w:rFonts w:ascii="TH SarabunIT๙" w:hAnsi="TH SarabunIT๙" w:cs="TH SarabunIT๙"/>
-                                <w:sz w:val="34"/>
-                                <w:szCs w:val="34"/>
-                                <w:cs/>
-                              </w:rPr>
-                              <w:br/>
-                            </w:r>
-                            <w:r>
-                              <w:rPr>
-                                <w:rFonts w:ascii="TH SarabunIT๙" w:hAnsi="TH SarabunIT๙" w:cs="TH SarabunIT๙"/>
-                                <w:sz w:val="34"/>
-                                <w:szCs w:val="34"/>
-                                <w:cs/>
-                              </w:rPr>
-                              <w:t>จังหวัดประจวบคีรีขันธ์</w:t>
+                              <w:t>ผู้พิพากษาหัวหน้าศาล</w:t>
+                            </w:r>
+                            <w:r>
+                              <w:rPr>
+                                <w:rFonts w:ascii="TH SarabunIT๙" w:hAnsi="TH SarabunIT๙" w:cs="TH SarabunIT๙" w:hint="cs"/>
+                                <w:sz w:val="34"/>
+                                <w:szCs w:val="34"/>
+                                <w:cs/>
+                              </w:rPr>
+                              <w:t>จังหวัดเบตง</w:t>
                             </w:r>
                           </w:p>
                           <w:p>
@@ -5897,11 +3552,7 @@
           </mc:Choice>
           <mc:Fallback>
             <w:pict>
-              <v:shapetype w14:anchorId="23D7AC94" id="_x0000_t202" coordsize="21600,21600" o:spt="202" path="m,l,21600r21600,l21600,xe">
-                <v:stroke joinstyle="miter"/>
-                <v:path gradientshapeok="t" o:connecttype="rect"/>
-              </v:shapetype>
-              <v:shape id="Text Box 88" o:spid="_x0000_s1028" type="#_x0000_t202" style="position:absolute;margin-left:-41.55pt;margin-top:17.4pt;width:380.65pt;height:2in;z-index:251657216;visibility:visible;mso-wrap-style:square;mso-width-percent:0;mso-height-percent:0;mso-wrap-distance-left:9pt;mso-wrap-distance-top:0;mso-wrap-distance-right:9pt;mso-wrap-distance-bottom:0;mso-position-horizontal:absolute;mso-position-horizontal-relative:text;mso-position-vertical:absolute;mso-position-vertical-relative:text;mso-width-percent:0;mso-height-percent:0;mso-width-relative:page;mso-height-relative:page;v-text-anchor:top" o:gfxdata="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" filled="f" stroked="f">
+              <v:shape w14:anchorId="23D7AC94" id="Text Box 88" o:spid="_x0000_s1028" type="#_x0000_t202" style="position:absolute;margin-left:-41.55pt;margin-top:17.4pt;width:380.65pt;height:2in;z-index:251657216;visibility:visible;mso-wrap-style:square;mso-width-percent:0;mso-height-percent:0;mso-wrap-distance-left:9pt;mso-wrap-distance-top:0;mso-wrap-distance-right:9pt;mso-wrap-distance-bottom:0;mso-position-horizontal:absolute;mso-position-horizontal-relative:text;mso-position-vertical:absolute;mso-position-vertical-relative:text;mso-width-percent:0;mso-height-percent:0;mso-width-relative:page;mso-height-relative:page;v-text-anchor:top" o:gfxdata="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" filled="f" stroked="f">
                 <v:textbox>
                   <w:txbxContent>
                     <w:p>
@@ -6047,7 +3698,26 @@
                           <w:szCs w:val="34"/>
                           <w:cs/>
                         </w:rPr>
-                        <w:t>นายประยุทธ</w:t>
+                        <w:t>นาย</w:t>
+                      </w:r>
+                      <w:r>
+                        <w:rPr>
+                          <w:rFonts w:ascii="TH SarabunIT๙" w:eastAsia="Times New Roman" w:hAnsi="TH SarabunIT๙" w:cs="TH SarabunIT๙" w:hint="cs"/>
+                          <w:color w:val="333333"/>
+                          <w:sz w:val="34"/>
+                          <w:szCs w:val="34"/>
+                          <w:cs/>
+                        </w:rPr>
+                        <w:t>ฉัตรชวงศ์  ศรีพวาทกุล</w:t>
+                      </w:r>
+                      <w:r>
+                        <w:rPr>
+                          <w:rFonts w:ascii="TH SarabunIT๙" w:hAnsi="TH SarabunIT๙" w:cs="TH SarabunIT๙"/>
+                          <w:sz w:val="34"/>
+                          <w:szCs w:val="34"/>
+                          <w:cs/>
+                        </w:rPr>
+                        <w:t>)</w:t>
                       </w:r>
                       <w:r>
                         <w:rPr>
@@ -6055,9 +3725,8 @@
                           <w:color w:val="333333"/>
                           <w:sz w:val="34"/>
                           <w:szCs w:val="34"/>
-                          <w:cs/>
-                        </w:rPr>
-                        <w:t xml:space="preserve"> </w:t>
+                        </w:rPr>
+                        <w:br/>
                       </w:r>
                       <w:r>
                         <w:rPr>
@@ -6067,7 +3736,7 @@
                           <w:szCs w:val="34"/>
                           <w:cs/>
                         </w:rPr>
-                        <w:t>แก้วภักดี</w:t>
+                        <w:t>ผู้พิพากษาหัวหน้าศาล</w:t>
                       </w:r>
                       <w:r>
                         <w:rPr>
@@ -6076,37 +3745,54 @@
                           <w:szCs w:val="34"/>
                           <w:cs/>
                         </w:rPr>
-                        <w:t>)</w:t>
-                      </w:r>
-                      <w:r>
-                        <w:rPr>
-                          <w:rFonts w:ascii="TH SarabunIT๙" w:eastAsia="Times New Roman" w:hAnsi="TH SarabunIT๙" w:cs="TH SarabunIT๙"/>
-                          <w:color w:val="333333"/>
-                          <w:sz w:val="34"/>
-                          <w:szCs w:val="34"/>
-                        </w:rPr>
-                        <w:br/>
-                      </w:r>
-                      <w:r>
-                        <w:rPr>
-                          <w:rFonts w:ascii="TH SarabunIT๙" w:eastAsia="Times New Roman" w:hAnsi="TH SarabunIT๙" w:cs="TH SarabunIT๙" w:hint="cs"/>
-                          <w:color w:val="333333"/>
-                          <w:sz w:val="34"/>
-                          <w:szCs w:val="34"/>
-                          <w:cs/>
-                        </w:rPr>
-                        <w:t>ผู้พิพากษาหัวหน้าคณะชั้นต้นในศาลแขวงพระนครเหนือ</w:t>
+                        <w:t>ศาลเยาวชนและครอบครัวจังหวัด</w:t>
+                      </w:r>
+                      <w:r>
+                        <w:rPr>
+                          <w:rFonts w:ascii="TH SarabunIT๙" w:hAnsi="TH SarabunIT๙" w:cs="TH SarabunIT๙" w:hint="cs"/>
+                          <w:sz w:val="34"/>
+                          <w:szCs w:val="34"/>
+                          <w:cs/>
+                        </w:rPr>
+                        <w:t>แม่ฮ่องสอน</w:t>
                       </w:r>
                     </w:p>
                     <w:p>
                       <w:pPr>
                         <w:jc w:val="center"/>
                         <w:rPr>
+                          <w:rFonts w:ascii="TH SarabunIT๙" w:hAnsi="TH SarabunIT๙" w:cs="TH SarabunIT๙" w:hint="cs"/>
+                          <w:sz w:val="34"/>
+                          <w:szCs w:val="34"/>
+                        </w:rPr>
+                      </w:pPr>
+                      <w:r>
+                        <w:rPr>
+                          <w:rFonts w:ascii="TH SarabunIT๙" w:hAnsi="TH SarabunIT๙" w:cs="TH SarabunIT๙" w:hint="cs"/>
+                          <w:sz w:val="34"/>
+                          <w:szCs w:val="34"/>
+                          <w:cs/>
+                        </w:rPr>
+                        <w:t>ช่วยทำงานชั่วคราวในตำ</w:t>
+                      </w:r>
+                      <w:r>
+                        <w:rPr>
+                          <w:rFonts w:ascii="TH SarabunIT๙" w:hAnsi="TH SarabunIT๙" w:cs="TH SarabunIT๙" w:hint="cs"/>
+                          <w:sz w:val="34"/>
+                          <w:szCs w:val="34"/>
+                          <w:cs/>
+                        </w:rPr>
+                        <w:t>แหน่ง</w:t>
+                      </w:r>
+                      <w:r>
+                        <w:rPr>
                           <w:rFonts w:ascii="TH SarabunIT๙" w:hAnsi="TH SarabunIT๙" w:cs="TH SarabunIT๙"/>
                           <w:sz w:val="34"/>
                           <w:szCs w:val="34"/>
-                        </w:rPr>
-                      </w:pPr>
+                          <w:cs/>
+                        </w:rPr>
+                        <w:t>ผู้พิพากษาหัวหน้าศาล</w:t>
+                      </w:r>
                       <w:r>
                         <w:rPr>
                           <w:rFonts w:ascii="TH SarabunIT๙" w:hAnsi="TH SarabunIT๙" w:cs="TH SarabunIT๙" w:hint="cs"/>
@@ -6114,8 +3800,9 @@
                           <w:szCs w:val="34"/>
                           <w:cs/>
                         </w:rPr>
-                        <w:t>ช่วยทำงานชั่วคราวในตำ</w:t>
-                      </w:r>
+                        <w:t>จังหวัด</w:t>
+                      </w:r>
+                      <w:proofErr w:type="spellStart"/>
                       <w:r>
                         <w:rPr>
                           <w:rFonts w:ascii="TH SarabunIT๙" w:hAnsi="TH SarabunIT๙" w:cs="TH SarabunIT๙" w:hint="cs"/>
@@ -6123,34 +3810,17 @@
                           <w:szCs w:val="34"/>
                           <w:cs/>
                         </w:rPr>
-                        <w:t>แหน่ง</w:t>
-                      </w:r>
-                      <w:r>
-                        <w:rPr>
-                          <w:rFonts w:ascii="TH SarabunIT๙" w:hAnsi="TH SarabunIT๙" w:cs="TH SarabunIT๙"/>
-                          <w:sz w:val="34"/>
-                          <w:szCs w:val="34"/>
-                          <w:cs/>
-                        </w:rPr>
-                        <w:t>ผู้พิพากษาหัวหน้าศาลเยาวชนและครอบครัว</w:t>
-                      </w:r>
-                      <w:r>
-                        <w:rPr>
-                          <w:rFonts w:ascii="TH SarabunIT๙" w:hAnsi="TH SarabunIT๙" w:cs="TH SarabunIT๙"/>
-                          <w:sz w:val="34"/>
-                          <w:szCs w:val="34"/>
-                          <w:cs/>
-                        </w:rPr>
-                        <w:br/>
-                      </w:r>
-                      <w:r>
-                        <w:rPr>
-                          <w:rFonts w:ascii="TH SarabunIT๙" w:hAnsi="TH SarabunIT๙" w:cs="TH SarabunIT๙"/>
-                          <w:sz w:val="34"/>
-                          <w:szCs w:val="34"/>
-                          <w:cs/>
-                        </w:rPr>
-                        <w:t>จังหวัดประจวบคีรีขันธ์</w:t>
+                        <w:t>เบ</w:t>
+                      </w:r>
+                      <w:proofErr w:type="spellEnd"/>
+                      <w:r>
+                        <w:rPr>
+                          <w:rFonts w:ascii="TH SarabunIT๙" w:hAnsi="TH SarabunIT๙" w:cs="TH SarabunIT๙" w:hint="cs"/>
+                          <w:sz w:val="34"/>
+                          <w:szCs w:val="34"/>
+                          <w:cs/>
+                        </w:rPr>
+                        <w:t>ตง</w:t>
                       </w:r>
                     </w:p>
                     <w:p>
@@ -6329,6 +3999,7 @@
           <w:szCs w:val="32"/>
           <w:lang w:eastAsia="en-US"/>
         </w:rPr>
+        <w:lastRenderedPageBreak/>
         <mc:AlternateContent>
           <mc:Choice Requires="wps">
             <w:drawing>
@@ -6441,25 +4112,7 @@
                                 <w:sz w:val="34"/>
                                 <w:szCs w:val="34"/>
                               </w:rPr>
-                              <w:t>${</w:t>
-                            </w:r>
-                            <w:proofErr w:type="spellStart"/>
-                            <w:r>
-                              <w:rPr>
-                                <w:rFonts w:ascii="TH SarabunIT๙" w:hAnsi="TH SarabunIT๙" w:cs="TH SarabunIT๙"/>
-                                <w:sz w:val="34"/>
-                                <w:szCs w:val="34"/>
-                              </w:rPr>
-                              <w:t>doc_date</w:t>
-                            </w:r>
-                            <w:proofErr w:type="spellEnd"/>
-                            <w:r>
-                              <w:rPr>
-                                <w:rFonts w:ascii="TH SarabunIT๙" w:hAnsi="TH SarabunIT๙" w:cs="TH SarabunIT๙"/>
-                                <w:sz w:val="34"/>
-                                <w:szCs w:val="34"/>
-                              </w:rPr>
-                              <w:t>}</w:t>
+                              <w:t>${doc_date}</w:t>
                             </w:r>
                             <w:r>
                               <w:rPr>
@@ -6536,6 +4189,89 @@
                                 <w:cs/>
                               </w:rPr>
                               <w:t>ผู้อนุมัติ 1</w:t>
+                            </w:r>
+                          </w:p>
+                          <w:p>
+                            <w:pPr>
+                              <w:jc w:val="center"/>
+                              <w:rPr>
+                                <w:rFonts w:ascii="TH SarabunIT๙" w:hAnsi="TH SarabunIT๙" w:cs="TH SarabunIT๙"/>
+                                <w:sz w:val="34"/>
+                                <w:szCs w:val="34"/>
+                              </w:rPr>
+                            </w:pPr>
+                            <w:r>
+                              <w:rPr>
+                                <w:rFonts w:ascii="TH SarabunIT๙" w:hAnsi="TH SarabunIT๙" w:cs="TH SarabunIT๙"/>
+                                <w:sz w:val="34"/>
+                                <w:szCs w:val="34"/>
+                                <w:cs/>
+                              </w:rPr>
+                              <w:t xml:space="preserve"> </w:t>
+                            </w:r>
+                            <w:r>
+                              <w:rPr>
+                                <w:rFonts w:ascii="TH SarabunIT๙" w:hAnsi="TH SarabunIT๙" w:cs="TH SarabunIT๙"/>
+                                <w:sz w:val="34"/>
+                                <w:szCs w:val="34"/>
+                                <w:cs/>
+                              </w:rPr>
+                              <w:t xml:space="preserve">  </w:t>
+                            </w:r>
+                            <w:r>
+                              <w:rPr>
+                                <w:rFonts w:ascii="TH SarabunIT๙" w:hAnsi="TH SarabunIT๙" w:cs="TH SarabunIT๙"/>
+                                <w:sz w:val="34"/>
+                                <w:szCs w:val="34"/>
+                                <w:cs/>
+                              </w:rPr>
+                              <w:t>(นาง</w:t>
+                            </w:r>
+                            <w:r>
+                              <w:rPr>
+                                <w:rFonts w:ascii="TH SarabunIT๙" w:hAnsi="TH SarabunIT๙" w:cs="TH SarabunIT๙" w:hint="cs"/>
+                                <w:sz w:val="34"/>
+                                <w:szCs w:val="34"/>
+                                <w:cs/>
+                              </w:rPr>
+                              <w:t>ศศิพัชร์  กิไพโรจน์</w:t>
+                            </w:r>
+                            <w:r>
+                              <w:rPr>
+                                <w:rFonts w:ascii="TH SarabunIT๙" w:hAnsi="TH SarabunIT๙" w:cs="TH SarabunIT๙"/>
+                                <w:sz w:val="34"/>
+                                <w:szCs w:val="34"/>
+                                <w:cs/>
+                              </w:rPr>
+                              <w:t>)</w:t>
+                            </w:r>
+                          </w:p>
+                          <w:p>
+                            <w:pPr>
+                              <w:jc w:val="center"/>
+                              <w:rPr>
+                                <w:rFonts w:ascii="TH SarabunIT๙" w:hAnsi="TH SarabunIT๙" w:cs="TH SarabunIT๙"/>
+                                <w:sz w:val="34"/>
+                                <w:szCs w:val="34"/>
+                              </w:rPr>
+                            </w:pPr>
+                            <w:r>
+                              <w:rPr>
+                                <w:rFonts w:ascii="TH SarabunIT๙" w:hAnsi="TH SarabunIT๙" w:cs="TH SarabunIT๙"/>
+                                <w:sz w:val="34"/>
+                                <w:szCs w:val="34"/>
+                                <w:cs/>
+                              </w:rPr>
+                              <w:t>ผู้อำนวยการสำนักงานประจำศาลจังหวัด</w:t>
+                            </w:r>
+                            <w:r>
+                              <w:rPr>
+                                <w:rFonts w:ascii="TH SarabunIT๙" w:hAnsi="TH SarabunIT๙" w:cs="TH SarabunIT๙" w:hint="cs"/>
+                                <w:sz w:val="34"/>
+                                <w:szCs w:val="34"/>
+                                <w:cs/>
+                              </w:rPr>
+                              <w:t>เบตง</w:t>
                             </w:r>
                           </w:p>
                           <w:p>
@@ -6555,132 +4291,6 @@
                                 <w:rFonts w:ascii="TH SarabunIT๙" w:hAnsi="TH SarabunIT๙" w:cs="TH SarabunIT๙"/>
                                 <w:sz w:val="34"/>
                                 <w:szCs w:val="34"/>
-                                <w:cs/>
-                              </w:rPr>
-                              <w:t xml:space="preserve"> </w:t>
-                            </w:r>
-                            <w:r>
-                              <w:rPr>
-                                <w:rFonts w:ascii="TH SarabunIT๙" w:hAnsi="TH SarabunIT๙" w:cs="TH SarabunIT๙"/>
-                                <w:sz w:val="34"/>
-                                <w:szCs w:val="34"/>
-                                <w:cs/>
-                              </w:rPr>
-                              <w:t xml:space="preserve">  </w:t>
-                            </w:r>
-                            <w:r>
-                              <w:rPr>
-                                <w:rFonts w:ascii="TH SarabunIT๙" w:hAnsi="TH SarabunIT๙" w:cs="TH SarabunIT๙"/>
-                                <w:sz w:val="34"/>
-                                <w:szCs w:val="34"/>
-                                <w:cs/>
-                              </w:rPr>
-                              <w:t>(</w:t>
-                            </w:r>
-                            <w:r>
-                              <w:rPr>
-                                <w:rFonts w:ascii="TH SarabunIT๙" w:hAnsi="TH SarabunIT๙" w:cs="TH SarabunIT๙"/>
-                                <w:sz w:val="34"/>
-                                <w:szCs w:val="34"/>
-                                <w:cs/>
-                              </w:rPr>
-                              <w:t>นางสาววนิดา พิพัฒน์นภาพร</w:t>
-                            </w:r>
-                            <w:r>
-                              <w:rPr>
-                                <w:rFonts w:ascii="TH SarabunIT๙" w:hAnsi="TH SarabunIT๙" w:cs="TH SarabunIT๙"/>
-                                <w:sz w:val="34"/>
-                                <w:szCs w:val="34"/>
-                                <w:cs/>
-                              </w:rPr>
-                              <w:t>)</w:t>
-                            </w:r>
-                          </w:p>
-                          <w:p>
-                            <w:pPr>
-                              <w:tabs>
-                                <w:tab w:val="center" w:pos="2160"/>
-                              </w:tabs>
-                              <w:jc w:val="center"/>
-                              <w:rPr>
-                                <w:rFonts w:ascii="TH SarabunIT๙" w:hAnsi="TH SarabunIT๙" w:cs="TH SarabunIT๙"/>
-                                <w:sz w:val="34"/>
-                                <w:szCs w:val="34"/>
-                              </w:rPr>
-                            </w:pPr>
-                            <w:r>
-                              <w:rPr>
-                                <w:rFonts w:ascii="TH SarabunIT๙" w:hAnsi="TH SarabunIT๙" w:cs="TH SarabunIT๙"/>
-                                <w:sz w:val="34"/>
-                                <w:szCs w:val="34"/>
-                                <w:cs/>
-                              </w:rPr>
-                              <w:t xml:space="preserve">  </w:t>
-                            </w:r>
-                            <w:r>
-                              <w:rPr>
-                                <w:rFonts w:ascii="TH SarabunIT๙" w:hAnsi="TH SarabunIT๙" w:cs="TH SarabunIT๙"/>
-                                <w:sz w:val="34"/>
-                                <w:szCs w:val="34"/>
-                                <w:cs/>
-                              </w:rPr>
-                              <w:t xml:space="preserve"> </w:t>
-                            </w:r>
-                            <w:r>
-                              <w:rPr>
-                                <w:rFonts w:ascii="TH SarabunIT๙" w:hAnsi="TH SarabunIT๙" w:cs="TH SarabunIT๙"/>
-                                <w:sz w:val="34"/>
-                                <w:szCs w:val="34"/>
-                                <w:cs/>
-                              </w:rPr>
-                              <w:t>ผู้อำนวยการสำนักงานประจำศาลเยาวชนและครอบครัว</w:t>
-                            </w:r>
-                          </w:p>
-                          <w:p>
-                            <w:pPr>
-                              <w:tabs>
-                                <w:tab w:val="center" w:pos="2160"/>
-                              </w:tabs>
-                              <w:jc w:val="center"/>
-                              <w:rPr>
-                                <w:rFonts w:ascii="TH SarabunIT๙" w:hAnsi="TH SarabunIT๙" w:cs="TH SarabunIT๙"/>
-                                <w:sz w:val="34"/>
-                                <w:szCs w:val="34"/>
-                              </w:rPr>
-                            </w:pPr>
-                            <w:r>
-                              <w:rPr>
-                                <w:rFonts w:ascii="TH SarabunIT๙" w:hAnsi="TH SarabunIT๙" w:cs="TH SarabunIT๙"/>
-                                <w:sz w:val="34"/>
-                                <w:szCs w:val="34"/>
-                                <w:cs/>
-                              </w:rPr>
-                              <w:t xml:space="preserve">  </w:t>
-                            </w:r>
-                            <w:r>
-                              <w:rPr>
-                                <w:rFonts w:ascii="TH SarabunIT๙" w:hAnsi="TH SarabunIT๙" w:cs="TH SarabunIT๙"/>
-                                <w:sz w:val="34"/>
-                                <w:szCs w:val="34"/>
-                                <w:cs/>
-                              </w:rPr>
-                              <w:t>จังหวัดประจวบคีรีขันธ์</w:t>
-                            </w:r>
-                          </w:p>
-                          <w:p>
-                            <w:pPr>
-                              <w:ind w:firstLine="567"/>
-                              <w:rPr>
-                                <w:rFonts w:ascii="TH SarabunIT๙" w:hAnsi="TH SarabunIT๙" w:cs="TH SarabunIT๙"/>
-                                <w:sz w:val="34"/>
-                                <w:szCs w:val="34"/>
-                              </w:rPr>
-                            </w:pPr>
-                            <w:r>
-                              <w:rPr>
-                                <w:rFonts w:ascii="TH SarabunIT๙" w:hAnsi="TH SarabunIT๙" w:cs="TH SarabunIT๙"/>
-                                <w:sz w:val="34"/>
-                                <w:szCs w:val="34"/>
                               </w:rPr>
                               <w:sym w:font="Wingdings 2" w:char="F0A3"/>
                             </w:r>
@@ -6842,7 +4452,26 @@
                                 <w:szCs w:val="34"/>
                                 <w:cs/>
                               </w:rPr>
-                              <w:t>นายประยุทธ</w:t>
+                              <w:t>นาย</w:t>
+                            </w:r>
+                            <w:r>
+                              <w:rPr>
+                                <w:rFonts w:ascii="TH SarabunIT๙" w:eastAsia="Times New Roman" w:hAnsi="TH SarabunIT๙" w:cs="TH SarabunIT๙" w:hint="cs"/>
+                                <w:color w:val="333333"/>
+                                <w:sz w:val="34"/>
+                                <w:szCs w:val="34"/>
+                                <w:cs/>
+                              </w:rPr>
+                              <w:t>ฉัตรชวงศ์  ศรีพวาทกุล</w:t>
+                            </w:r>
+                            <w:r>
+                              <w:rPr>
+                                <w:rFonts w:ascii="TH SarabunIT๙" w:hAnsi="TH SarabunIT๙" w:cs="TH SarabunIT๙"/>
+                                <w:sz w:val="34"/>
+                                <w:szCs w:val="34"/>
+                                <w:cs/>
+                              </w:rPr>
+                              <w:t>)</w:t>
                             </w:r>
                             <w:r>
                               <w:rPr>
@@ -6850,9 +4479,8 @@
                                 <w:color w:val="333333"/>
                                 <w:sz w:val="34"/>
                                 <w:szCs w:val="34"/>
-                                <w:cs/>
-                              </w:rPr>
-                              <w:t xml:space="preserve"> </w:t>
+                              </w:rPr>
+                              <w:br/>
                             </w:r>
                             <w:r>
                               <w:rPr>
@@ -6862,7 +4490,7 @@
                                 <w:szCs w:val="34"/>
                                 <w:cs/>
                               </w:rPr>
-                              <w:t>แก้วภักดี</w:t>
+                              <w:t>ผู้พิพากษาหัวหน้าศาล</w:t>
                             </w:r>
                             <w:r>
                               <w:rPr>
@@ -6871,26 +4499,62 @@
                                 <w:szCs w:val="34"/>
                                 <w:cs/>
                               </w:rPr>
-                              <w:t>)</w:t>
-                            </w:r>
-                            <w:r>
-                              <w:rPr>
-                                <w:rFonts w:ascii="TH SarabunIT๙" w:eastAsia="Times New Roman" w:hAnsi="TH SarabunIT๙" w:cs="TH SarabunIT๙"/>
-                                <w:color w:val="333333"/>
-                                <w:sz w:val="34"/>
-                                <w:szCs w:val="34"/>
-                              </w:rPr>
-                              <w:br/>
-                            </w:r>
-                            <w:r>
-                              <w:rPr>
-                                <w:rFonts w:ascii="TH SarabunIT๙" w:eastAsia="Times New Roman" w:hAnsi="TH SarabunIT๙" w:cs="TH SarabunIT๙" w:hint="cs"/>
-                                <w:color w:val="333333"/>
-                                <w:sz w:val="34"/>
-                                <w:szCs w:val="34"/>
-                                <w:cs/>
-                              </w:rPr>
-                              <w:t>ผู้พิพากษาหัวหน้าคณะชั้นต้นในศาลแขวงพระนครเหนือ</w:t>
+                              <w:t>ศาลเยาวชนและครอบครัวจังหวัด</w:t>
+                            </w:r>
+                            <w:r>
+                              <w:rPr>
+                                <w:rFonts w:ascii="TH SarabunIT๙" w:hAnsi="TH SarabunIT๙" w:cs="TH SarabunIT๙" w:hint="cs"/>
+                                <w:sz w:val="34"/>
+                                <w:szCs w:val="34"/>
+                                <w:cs/>
+                              </w:rPr>
+                              <w:t>แม่ฮ่องสอน</w:t>
+                            </w:r>
+                          </w:p>
+                          <w:p>
+                            <w:pPr>
+                              <w:jc w:val="center"/>
+                              <w:rPr>
+                                <w:rFonts w:ascii="TH SarabunIT๙" w:hAnsi="TH SarabunIT๙" w:cs="TH SarabunIT๙"/>
+                                <w:sz w:val="34"/>
+                                <w:szCs w:val="34"/>
+                              </w:rPr>
+                            </w:pPr>
+                            <w:r>
+                              <w:rPr>
+                                <w:rFonts w:ascii="TH SarabunIT๙" w:hAnsi="TH SarabunIT๙" w:cs="TH SarabunIT๙" w:hint="cs"/>
+                                <w:sz w:val="34"/>
+                                <w:szCs w:val="34"/>
+                                <w:cs/>
+                              </w:rPr>
+                              <w:t>ช่วยทำงานชั่วคราวในตำ</w:t>
+                            </w:r>
+                            <w:r>
+                              <w:rPr>
+                                <w:rFonts w:ascii="TH SarabunIT๙" w:hAnsi="TH SarabunIT๙" w:cs="TH SarabunIT๙" w:hint="cs"/>
+                                <w:sz w:val="34"/>
+                                <w:szCs w:val="34"/>
+                                <w:cs/>
+                              </w:rPr>
+                              <w:t>แหน่ง</w:t>
+                            </w:r>
+                            <w:r>
+                              <w:rPr>
+                                <w:rFonts w:ascii="TH SarabunIT๙" w:hAnsi="TH SarabunIT๙" w:cs="TH SarabunIT๙"/>
+                                <w:sz w:val="34"/>
+                                <w:szCs w:val="34"/>
+                                <w:cs/>
+                              </w:rPr>
+                              <w:t>ผู้พิพากษาหัวหน้าศาล</w:t>
+                            </w:r>
+                            <w:r>
+                              <w:rPr>
+                                <w:rFonts w:ascii="TH SarabunIT๙" w:hAnsi="TH SarabunIT๙" w:cs="TH SarabunIT๙" w:hint="cs"/>
+                                <w:sz w:val="34"/>
+                                <w:szCs w:val="34"/>
+                                <w:cs/>
+                              </w:rPr>
+                              <w:t>จังหวัดเบตง</w:t>
                             </w:r>
                           </w:p>
                           <w:p>
@@ -6903,62 +4567,6 @@
                                 <w:szCs w:val="34"/>
                               </w:rPr>
                             </w:pPr>
-                            <w:r>
-                              <w:rPr>
-                                <w:rFonts w:ascii="TH SarabunIT๙" w:hAnsi="TH SarabunIT๙" w:cs="TH SarabunIT๙"/>
-                                <w:sz w:val="34"/>
-                                <w:szCs w:val="34"/>
-                                <w:cs/>
-                              </w:rPr>
-                              <w:t xml:space="preserve">     </w:t>
-                            </w:r>
-                            <w:r>
-                              <w:rPr>
-                                <w:rFonts w:ascii="TH SarabunIT๙" w:hAnsi="TH SarabunIT๙" w:cs="TH SarabunIT๙" w:hint="cs"/>
-                                <w:sz w:val="34"/>
-                                <w:szCs w:val="34"/>
-                                <w:cs/>
-                              </w:rPr>
-                              <w:t>ช่วยทำงานชั่วคราวในตำ</w:t>
-                            </w:r>
-                            <w:r>
-                              <w:rPr>
-                                <w:rFonts w:ascii="TH SarabunIT๙" w:hAnsi="TH SarabunIT๙" w:cs="TH SarabunIT๙" w:hint="cs"/>
-                                <w:sz w:val="34"/>
-                                <w:szCs w:val="34"/>
-                                <w:cs/>
-                              </w:rPr>
-                              <w:t>แหน่ง</w:t>
-                            </w:r>
-                            <w:r>
-                              <w:rPr>
-                                <w:rFonts w:ascii="TH SarabunIT๙" w:hAnsi="TH SarabunIT๙" w:cs="TH SarabunIT๙"/>
-                                <w:sz w:val="34"/>
-                                <w:szCs w:val="34"/>
-                                <w:cs/>
-                              </w:rPr>
-                              <w:t>ผู้พิพากษาหัวหน้าศาลเยาวชนและครอบครัว</w:t>
-                            </w:r>
-                          </w:p>
-                          <w:p>
-                            <w:pPr>
-                              <w:shd w:val="clear" w:color="auto" w:fill="FFFFFF"/>
-                              <w:jc w:val="center"/>
-                              <w:rPr>
-                                <w:rFonts w:ascii="TH SarabunIT๙" w:hAnsi="TH SarabunIT๙" w:cs="TH SarabunIT๙"/>
-                                <w:sz w:val="34"/>
-                                <w:szCs w:val="34"/>
-                              </w:rPr>
-                            </w:pPr>
-                            <w:r>
-                              <w:rPr>
-                                <w:rFonts w:ascii="TH SarabunIT๙" w:hAnsi="TH SarabunIT๙" w:cs="TH SarabunIT๙"/>
-                                <w:sz w:val="34"/>
-                                <w:szCs w:val="34"/>
-                                <w:cs/>
-                              </w:rPr>
-                              <w:t>จังหวัดประจวบคีรีขันธ์</w:t>
-                            </w:r>
                           </w:p>
                         </w:txbxContent>
                       </wps:txbx>
@@ -6979,11 +4587,7 @@
           </mc:Choice>
           <mc:Fallback>
             <w:pict>
-              <v:shapetype w14:anchorId="67084B77" id="_x0000_t202" coordsize="21600,21600" o:spt="202" path="m,l,21600r21600,l21600,xe">
-                <v:stroke joinstyle="miter"/>
-                <v:path gradientshapeok="t" o:connecttype="rect"/>
-              </v:shapetype>
-              <v:shape id="Text Box 563" o:spid="_x0000_s1029" type="#_x0000_t202" style="position:absolute;margin-left:0;margin-top:16.4pt;width:452.4pt;height:249pt;z-index:251658240;visibility:visible;mso-wrap-style:square;mso-width-percent:0;mso-height-percent:0;mso-wrap-distance-left:9pt;mso-wrap-distance-top:0;mso-wrap-distance-right:9pt;mso-wrap-distance-bottom:0;mso-position-horizontal:left;mso-position-horizontal-relative:margin;mso-position-vertical:absolute;mso-position-vertical-relative:text;mso-width-percent:0;mso-height-percent:0;mso-width-relative:page;mso-height-relative:page;v-text-anchor:top" o:gfxdata="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" filled="f">
+              <v:shape w14:anchorId="67084B77" id="Text Box 563" o:spid="_x0000_s1029" type="#_x0000_t202" style="position:absolute;margin-left:0;margin-top:16.4pt;width:452.4pt;height:249pt;z-index:251658240;visibility:visible;mso-wrap-style:square;mso-width-percent:0;mso-height-percent:0;mso-wrap-distance-left:9pt;mso-wrap-distance-top:0;mso-wrap-distance-right:9pt;mso-wrap-distance-bottom:0;mso-position-horizontal:left;mso-position-horizontal-relative:margin;mso-position-vertical:absolute;mso-position-vertical-relative:text;mso-width-percent:0;mso-height-percent:0;mso-width-relative:page;mso-height-relative:page;v-text-anchor:top" o:gfxdata="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" filled="f">
                 <v:textbox>
                   <w:txbxContent>
                     <w:p>
@@ -7140,6 +4744,120 @@
                           <w:cs/>
                         </w:rPr>
                         <w:t>ผู้อนุมัติ 1</w:t>
+                      </w:r>
+                    </w:p>
+                    <w:p>
+                      <w:pPr>
+                        <w:jc w:val="center"/>
+                        <w:rPr>
+                          <w:rFonts w:ascii="TH SarabunIT๙" w:hAnsi="TH SarabunIT๙" w:cs="TH SarabunIT๙"/>
+                          <w:sz w:val="34"/>
+                          <w:szCs w:val="34"/>
+                        </w:rPr>
+                      </w:pPr>
+                      <w:r>
+                        <w:rPr>
+                          <w:rFonts w:ascii="TH SarabunIT๙" w:hAnsi="TH SarabunIT๙" w:cs="TH SarabunIT๙"/>
+                          <w:sz w:val="34"/>
+                          <w:szCs w:val="34"/>
+                          <w:cs/>
+                        </w:rPr>
+                        <w:t xml:space="preserve"> </w:t>
+                      </w:r>
+                      <w:r>
+                        <w:rPr>
+                          <w:rFonts w:ascii="TH SarabunIT๙" w:hAnsi="TH SarabunIT๙" w:cs="TH SarabunIT๙"/>
+                          <w:sz w:val="34"/>
+                          <w:szCs w:val="34"/>
+                          <w:cs/>
+                        </w:rPr>
+                        <w:t xml:space="preserve">  </w:t>
+                      </w:r>
+                      <w:r>
+                        <w:rPr>
+                          <w:rFonts w:ascii="TH SarabunIT๙" w:hAnsi="TH SarabunIT๙" w:cs="TH SarabunIT๙"/>
+                          <w:sz w:val="34"/>
+                          <w:szCs w:val="34"/>
+                          <w:cs/>
+                        </w:rPr>
+                        <w:t>(นาง</w:t>
+                      </w:r>
+                      <w:r>
+                        <w:rPr>
+                          <w:rFonts w:ascii="TH SarabunIT๙" w:hAnsi="TH SarabunIT๙" w:cs="TH SarabunIT๙" w:hint="cs"/>
+                          <w:sz w:val="34"/>
+                          <w:szCs w:val="34"/>
+                          <w:cs/>
+                        </w:rPr>
+                        <w:t xml:space="preserve">ศศิพัชร์  </w:t>
+                      </w:r>
+                      <w:proofErr w:type="spellStart"/>
+                      <w:r>
+                        <w:rPr>
+                          <w:rFonts w:ascii="TH SarabunIT๙" w:hAnsi="TH SarabunIT๙" w:cs="TH SarabunIT๙" w:hint="cs"/>
+                          <w:sz w:val="34"/>
+                          <w:szCs w:val="34"/>
+                          <w:cs/>
+                        </w:rPr>
+                        <w:t>กิ</w:t>
+                      </w:r>
+                      <w:proofErr w:type="spellEnd"/>
+                      <w:r>
+                        <w:rPr>
+                          <w:rFonts w:ascii="TH SarabunIT๙" w:hAnsi="TH SarabunIT๙" w:cs="TH SarabunIT๙" w:hint="cs"/>
+                          <w:sz w:val="34"/>
+                          <w:szCs w:val="34"/>
+                          <w:cs/>
+                        </w:rPr>
+                        <w:t>ไพโรจน์</w:t>
+                      </w:r>
+                      <w:r>
+                        <w:rPr>
+                          <w:rFonts w:ascii="TH SarabunIT๙" w:hAnsi="TH SarabunIT๙" w:cs="TH SarabunIT๙"/>
+                          <w:sz w:val="34"/>
+                          <w:szCs w:val="34"/>
+                          <w:cs/>
+                        </w:rPr>
+                        <w:t>)</w:t>
+                      </w:r>
+                    </w:p>
+                    <w:p>
+                      <w:pPr>
+                        <w:jc w:val="center"/>
+                        <w:rPr>
+                          <w:rFonts w:ascii="TH SarabunIT๙" w:hAnsi="TH SarabunIT๙" w:cs="TH SarabunIT๙"/>
+                          <w:sz w:val="34"/>
+                          <w:szCs w:val="34"/>
+                        </w:rPr>
+                      </w:pPr>
+                      <w:r>
+                        <w:rPr>
+                          <w:rFonts w:ascii="TH SarabunIT๙" w:hAnsi="TH SarabunIT๙" w:cs="TH SarabunIT๙"/>
+                          <w:sz w:val="34"/>
+                          <w:szCs w:val="34"/>
+                          <w:cs/>
+                        </w:rPr>
+                        <w:t>ผู้อำนวยการสำนักงานประจำศาลจังหวัด</w:t>
+                      </w:r>
+                      <w:proofErr w:type="spellStart"/>
+                      <w:r>
+                        <w:rPr>
+                          <w:rFonts w:ascii="TH SarabunIT๙" w:hAnsi="TH SarabunIT๙" w:cs="TH SarabunIT๙" w:hint="cs"/>
+                          <w:sz w:val="34"/>
+                          <w:szCs w:val="34"/>
+                          <w:cs/>
+                        </w:rPr>
+                        <w:t>เบ</w:t>
+                      </w:r>
+                      <w:proofErr w:type="spellEnd"/>
+                      <w:r>
+                        <w:rPr>
+                          <w:rFonts w:ascii="TH SarabunIT๙" w:hAnsi="TH SarabunIT๙" w:cs="TH SarabunIT๙" w:hint="cs"/>
+                          <w:sz w:val="34"/>
+                          <w:szCs w:val="34"/>
+                          <w:cs/>
+                        </w:rPr>
+                        <w:t>ตง</w:t>
                       </w:r>
                     </w:p>
                     <w:p>
@@ -7159,9 +4877,8 @@
                           <w:rFonts w:ascii="TH SarabunIT๙" w:hAnsi="TH SarabunIT๙" w:cs="TH SarabunIT๙"/>
                           <w:sz w:val="34"/>
                           <w:szCs w:val="34"/>
-                          <w:cs/>
-                        </w:rPr>
-                        <w:t xml:space="preserve"> </w:t>
+                        </w:rPr>
+                        <w:sym w:font="Wingdings 2" w:char="F0A3"/>
                       </w:r>
                       <w:r>
                         <w:rPr>
@@ -7170,7 +4887,7 @@
                           <w:szCs w:val="34"/>
                           <w:cs/>
                         </w:rPr>
-                        <w:t xml:space="preserve">  </w:t>
+                        <w:t xml:space="preserve"> อนุมัติโอนเงินงบประมาณ                       </w:t>
                       </w:r>
                       <w:r>
                         <w:rPr>
@@ -7179,7 +4896,7 @@
                           <w:szCs w:val="34"/>
                           <w:cs/>
                         </w:rPr>
-                        <w:t>(</w:t>
+                        <w:t xml:space="preserve">                    </w:t>
                       </w:r>
                       <w:r>
                         <w:rPr>
@@ -7188,38 +4905,33 @@
                           <w:szCs w:val="34"/>
                           <w:cs/>
                         </w:rPr>
-                        <w:t>นางสาววนิดา พิพัฒน์นภาพร</w:t>
+                        <w:t xml:space="preserve">วันที่ </w:t>
                       </w:r>
                       <w:r>
                         <w:rPr>
                           <w:rFonts w:ascii="TH SarabunIT๙" w:hAnsi="TH SarabunIT๙" w:cs="TH SarabunIT๙"/>
                           <w:sz w:val="34"/>
                           <w:szCs w:val="34"/>
-                          <w:cs/>
-                        </w:rPr>
-                        <w:t>)</w:t>
-                      </w:r>
-                    </w:p>
-                    <w:p>
-                      <w:pPr>
-                        <w:tabs>
-                          <w:tab w:val="center" w:pos="2160"/>
-                        </w:tabs>
-                        <w:jc w:val="center"/>
+                        </w:rPr>
+                        <w:t>${</w:t>
+                      </w:r>
+                      <w:proofErr w:type="spellStart"/>
+                      <w:r>
                         <w:rPr>
                           <w:rFonts w:ascii="TH SarabunIT๙" w:hAnsi="TH SarabunIT๙" w:cs="TH SarabunIT๙"/>
                           <w:sz w:val="34"/>
                           <w:szCs w:val="34"/>
                         </w:rPr>
-                      </w:pPr>
+                        <w:t>doc_date</w:t>
+                      </w:r>
+                      <w:proofErr w:type="spellEnd"/>
                       <w:r>
                         <w:rPr>
                           <w:rFonts w:ascii="TH SarabunIT๙" w:hAnsi="TH SarabunIT๙" w:cs="TH SarabunIT๙"/>
                           <w:sz w:val="34"/>
                           <w:szCs w:val="34"/>
-                          <w:cs/>
-                        </w:rPr>
-                        <w:t xml:space="preserve">  </w:t>
+                        </w:rPr>
+                        <w:t>}</w:t>
                       </w:r>
                       <w:r>
                         <w:rPr>
@@ -7227,116 +4939,6 @@
                           <w:sz w:val="34"/>
                           <w:szCs w:val="34"/>
                           <w:cs/>
-                        </w:rPr>
-                        <w:t xml:space="preserve"> </w:t>
-                      </w:r>
-                      <w:r>
-                        <w:rPr>
-                          <w:rFonts w:ascii="TH SarabunIT๙" w:hAnsi="TH SarabunIT๙" w:cs="TH SarabunIT๙"/>
-                          <w:sz w:val="34"/>
-                          <w:szCs w:val="34"/>
-                          <w:cs/>
-                        </w:rPr>
-                        <w:t>ผู้อำนวยการสำนักงานประจำศาลเยาวชนและครอบครัว</w:t>
-                      </w:r>
-                    </w:p>
-                    <w:p>
-                      <w:pPr>
-                        <w:tabs>
-                          <w:tab w:val="center" w:pos="2160"/>
-                        </w:tabs>
-                        <w:jc w:val="center"/>
-                        <w:rPr>
-                          <w:rFonts w:ascii="TH SarabunIT๙" w:hAnsi="TH SarabunIT๙" w:cs="TH SarabunIT๙"/>
-                          <w:sz w:val="34"/>
-                          <w:szCs w:val="34"/>
-                        </w:rPr>
-                      </w:pPr>
-                      <w:r>
-                        <w:rPr>
-                          <w:rFonts w:ascii="TH SarabunIT๙" w:hAnsi="TH SarabunIT๙" w:cs="TH SarabunIT๙"/>
-                          <w:sz w:val="34"/>
-                          <w:szCs w:val="34"/>
-                          <w:cs/>
-                        </w:rPr>
-                        <w:t xml:space="preserve">  </w:t>
-                      </w:r>
-                      <w:r>
-                        <w:rPr>
-                          <w:rFonts w:ascii="TH SarabunIT๙" w:hAnsi="TH SarabunIT๙" w:cs="TH SarabunIT๙"/>
-                          <w:sz w:val="34"/>
-                          <w:szCs w:val="34"/>
-                          <w:cs/>
-                        </w:rPr>
-                        <w:t>จังหวัดประจวบคีรีขันธ์</w:t>
-                      </w:r>
-                    </w:p>
-                    <w:p>
-                      <w:pPr>
-                        <w:ind w:firstLine="567"/>
-                        <w:rPr>
-                          <w:rFonts w:ascii="TH SarabunIT๙" w:hAnsi="TH SarabunIT๙" w:cs="TH SarabunIT๙"/>
-                          <w:sz w:val="34"/>
-                          <w:szCs w:val="34"/>
-                        </w:rPr>
-                      </w:pPr>
-                      <w:r>
-                        <w:rPr>
-                          <w:rFonts w:ascii="TH SarabunIT๙" w:hAnsi="TH SarabunIT๙" w:cs="TH SarabunIT๙"/>
-                          <w:sz w:val="34"/>
-                          <w:szCs w:val="34"/>
-                        </w:rPr>
-                        <w:sym w:font="Wingdings 2" w:char="F0A3"/>
-                      </w:r>
-                      <w:r>
-                        <w:rPr>
-                          <w:rFonts w:ascii="TH SarabunIT๙" w:hAnsi="TH SarabunIT๙" w:cs="TH SarabunIT๙"/>
-                          <w:sz w:val="34"/>
-                          <w:szCs w:val="34"/>
-                          <w:cs/>
-                        </w:rPr>
-                        <w:t xml:space="preserve"> </w:t>
-                      </w:r>
-                      <w:r>
-                        <w:rPr>
-                          <w:rFonts w:ascii="TH SarabunIT๙" w:hAnsi="TH SarabunIT๙" w:cs="TH SarabunIT๙"/>
-                          <w:sz w:val="34"/>
-                          <w:szCs w:val="34"/>
-                          <w:cs/>
-                        </w:rPr>
-                        <w:t xml:space="preserve">อนุมัติโอนเงินงบประมาณ                       </w:t>
-                      </w:r>
-                      <w:r>
-                        <w:rPr>
-                          <w:rFonts w:ascii="TH SarabunIT๙" w:hAnsi="TH SarabunIT๙" w:cs="TH SarabunIT๙"/>
-                          <w:sz w:val="34"/>
-                          <w:szCs w:val="34"/>
-                          <w:cs/>
-                        </w:rPr>
-                        <w:t xml:space="preserve">                    </w:t>
-                      </w:r>
-                      <w:r>
-                        <w:rPr>
-                          <w:rFonts w:ascii="TH SarabunIT๙" w:hAnsi="TH SarabunIT๙" w:cs="TH SarabunIT๙"/>
-                          <w:sz w:val="34"/>
-                          <w:szCs w:val="34"/>
-                          <w:cs/>
-                        </w:rPr>
-                        <w:t xml:space="preserve">วันที่ </w:t>
-                      </w:r>
-                      <w:r>
-                        <w:rPr>
-                          <w:rFonts w:ascii="TH SarabunIT๙" w:hAnsi="TH SarabunIT๙" w:cs="TH SarabunIT๙"/>
-                          <w:sz w:val="34"/>
-                          <w:szCs w:val="34"/>
-                        </w:rPr>
-                        <w:t>${doc_date}</w:t>
-                      </w:r>
-                      <w:r>
-                        <w:rPr>
-                          <w:rFonts w:ascii="TH SarabunIT๙" w:hAnsi="TH SarabunIT๙" w:cs="TH SarabunIT๙"/>
-                          <w:sz w:val="34"/>
-                          <w:szCs w:val="34"/>
                         </w:rPr>
                         <w:t xml:space="preserve"> </w:t>
                       </w:r>
@@ -7454,7 +5056,26 @@
                           <w:szCs w:val="34"/>
                           <w:cs/>
                         </w:rPr>
-                        <w:t>นายประยุทธ</w:t>
+                        <w:t>นาย</w:t>
+                      </w:r>
+                      <w:r>
+                        <w:rPr>
+                          <w:rFonts w:ascii="TH SarabunIT๙" w:eastAsia="Times New Roman" w:hAnsi="TH SarabunIT๙" w:cs="TH SarabunIT๙" w:hint="cs"/>
+                          <w:color w:val="333333"/>
+                          <w:sz w:val="34"/>
+                          <w:szCs w:val="34"/>
+                          <w:cs/>
+                        </w:rPr>
+                        <w:t>ฉัตรชวงศ์  ศรีพวาทกุล</w:t>
+                      </w:r>
+                      <w:r>
+                        <w:rPr>
+                          <w:rFonts w:ascii="TH SarabunIT๙" w:hAnsi="TH SarabunIT๙" w:cs="TH SarabunIT๙"/>
+                          <w:sz w:val="34"/>
+                          <w:szCs w:val="34"/>
+                          <w:cs/>
+                        </w:rPr>
+                        <w:t>)</w:t>
                       </w:r>
                       <w:r>
                         <w:rPr>
@@ -7462,9 +5083,8 @@
                           <w:color w:val="333333"/>
                           <w:sz w:val="34"/>
                           <w:szCs w:val="34"/>
-                          <w:cs/>
-                        </w:rPr>
-                        <w:t xml:space="preserve"> </w:t>
+                        </w:rPr>
+                        <w:br/>
                       </w:r>
                       <w:r>
                         <w:rPr>
@@ -7474,7 +5094,7 @@
                           <w:szCs w:val="34"/>
                           <w:cs/>
                         </w:rPr>
-                        <w:t>แก้วภักดี</w:t>
+                        <w:t>ผู้พิพากษาหัวหน้าศาล</w:t>
                       </w:r>
                       <w:r>
                         <w:rPr>
@@ -7483,26 +5103,82 @@
                           <w:szCs w:val="34"/>
                           <w:cs/>
                         </w:rPr>
-                        <w:t>)</w:t>
-                      </w:r>
-                      <w:r>
-                        <w:rPr>
-                          <w:rFonts w:ascii="TH SarabunIT๙" w:eastAsia="Times New Roman" w:hAnsi="TH SarabunIT๙" w:cs="TH SarabunIT๙"/>
-                          <w:color w:val="333333"/>
-                          <w:sz w:val="34"/>
-                          <w:szCs w:val="34"/>
-                        </w:rPr>
-                        <w:br/>
-                      </w:r>
-                      <w:r>
-                        <w:rPr>
-                          <w:rFonts w:ascii="TH SarabunIT๙" w:eastAsia="Times New Roman" w:hAnsi="TH SarabunIT๙" w:cs="TH SarabunIT๙" w:hint="cs"/>
-                          <w:color w:val="333333"/>
-                          <w:sz w:val="34"/>
-                          <w:szCs w:val="34"/>
-                          <w:cs/>
-                        </w:rPr>
-                        <w:t>ผู้พิพากษาหัวหน้าคณะชั้นต้นในศาลแขวงพระนครเหนือ</w:t>
+                        <w:t>ศาลเยาวชนและครอบครัวจังหวัด</w:t>
+                      </w:r>
+                      <w:r>
+                        <w:rPr>
+                          <w:rFonts w:ascii="TH SarabunIT๙" w:hAnsi="TH SarabunIT๙" w:cs="TH SarabunIT๙" w:hint="cs"/>
+                          <w:sz w:val="34"/>
+                          <w:szCs w:val="34"/>
+                          <w:cs/>
+                        </w:rPr>
+                        <w:t>แม่ฮ่องสอน</w:t>
+                      </w:r>
+                    </w:p>
+                    <w:p>
+                      <w:pPr>
+                        <w:jc w:val="center"/>
+                        <w:rPr>
+                          <w:rFonts w:ascii="TH SarabunIT๙" w:hAnsi="TH SarabunIT๙" w:cs="TH SarabunIT๙" w:hint="cs"/>
+                          <w:sz w:val="34"/>
+                          <w:szCs w:val="34"/>
+                        </w:rPr>
+                      </w:pPr>
+                      <w:r>
+                        <w:rPr>
+                          <w:rFonts w:ascii="TH SarabunIT๙" w:hAnsi="TH SarabunIT๙" w:cs="TH SarabunIT๙" w:hint="cs"/>
+                          <w:sz w:val="34"/>
+                          <w:szCs w:val="34"/>
+                          <w:cs/>
+                        </w:rPr>
+                        <w:t>ช่วยทำงานชั่วคราวในตำ</w:t>
+                      </w:r>
+                      <w:r>
+                        <w:rPr>
+                          <w:rFonts w:ascii="TH SarabunIT๙" w:hAnsi="TH SarabunIT๙" w:cs="TH SarabunIT๙" w:hint="cs"/>
+                          <w:sz w:val="34"/>
+                          <w:szCs w:val="34"/>
+                          <w:cs/>
+                        </w:rPr>
+                        <w:t>แหน่ง</w:t>
+                      </w:r>
+                      <w:r>
+                        <w:rPr>
+                          <w:rFonts w:ascii="TH SarabunIT๙" w:hAnsi="TH SarabunIT๙" w:cs="TH SarabunIT๙"/>
+                          <w:sz w:val="34"/>
+                          <w:szCs w:val="34"/>
+                          <w:cs/>
+                        </w:rPr>
+                        <w:t>ผู้พิพากษาหัวหน้าศาล</w:t>
+                      </w:r>
+                      <w:r>
+                        <w:rPr>
+                          <w:rFonts w:ascii="TH SarabunIT๙" w:hAnsi="TH SarabunIT๙" w:cs="TH SarabunIT๙" w:hint="cs"/>
+                          <w:sz w:val="34"/>
+                          <w:szCs w:val="34"/>
+                          <w:cs/>
+                        </w:rPr>
+                        <w:t>จังหวัด</w:t>
+                      </w:r>
+                      <w:proofErr w:type="spellStart"/>
+                      <w:r>
+                        <w:rPr>
+                          <w:rFonts w:ascii="TH SarabunIT๙" w:hAnsi="TH SarabunIT๙" w:cs="TH SarabunIT๙" w:hint="cs"/>
+                          <w:sz w:val="34"/>
+                          <w:szCs w:val="34"/>
+                          <w:cs/>
+                        </w:rPr>
+                        <w:t>เบ</w:t>
+                      </w:r>
+                      <w:proofErr w:type="spellEnd"/>
+                      <w:r>
+                        <w:rPr>
+                          <w:rFonts w:ascii="TH SarabunIT๙" w:hAnsi="TH SarabunIT๙" w:cs="TH SarabunIT๙" w:hint="cs"/>
+                          <w:sz w:val="34"/>
+                          <w:szCs w:val="34"/>
+                          <w:cs/>
+                        </w:rPr>
+                        <w:t>ตง</w:t>
                       </w:r>
                     </w:p>
                     <w:p>
@@ -7515,62 +5191,6 @@
                           <w:szCs w:val="34"/>
                         </w:rPr>
                       </w:pPr>
-                      <w:r>
-                        <w:rPr>
-                          <w:rFonts w:ascii="TH SarabunIT๙" w:hAnsi="TH SarabunIT๙" w:cs="TH SarabunIT๙"/>
-                          <w:sz w:val="34"/>
-                          <w:szCs w:val="34"/>
-                          <w:cs/>
-                        </w:rPr>
-                        <w:t xml:space="preserve">     </w:t>
-                      </w:r>
-                      <w:r>
-                        <w:rPr>
-                          <w:rFonts w:ascii="TH SarabunIT๙" w:hAnsi="TH SarabunIT๙" w:cs="TH SarabunIT๙" w:hint="cs"/>
-                          <w:sz w:val="34"/>
-                          <w:szCs w:val="34"/>
-                          <w:cs/>
-                        </w:rPr>
-                        <w:t>ช่วยทำงานชั่วคราวในตำ</w:t>
-                      </w:r>
-                      <w:r>
-                        <w:rPr>
-                          <w:rFonts w:ascii="TH SarabunIT๙" w:hAnsi="TH SarabunIT๙" w:cs="TH SarabunIT๙" w:hint="cs"/>
-                          <w:sz w:val="34"/>
-                          <w:szCs w:val="34"/>
-                          <w:cs/>
-                        </w:rPr>
-                        <w:t>แหน่ง</w:t>
-                      </w:r>
-                      <w:r>
-                        <w:rPr>
-                          <w:rFonts w:ascii="TH SarabunIT๙" w:hAnsi="TH SarabunIT๙" w:cs="TH SarabunIT๙"/>
-                          <w:sz w:val="34"/>
-                          <w:szCs w:val="34"/>
-                          <w:cs/>
-                        </w:rPr>
-                        <w:t>ผู้พิพากษาหัวหน้าศาลเยาวชนและครอบครัว</w:t>
-                      </w:r>
-                    </w:p>
-                    <w:p>
-                      <w:pPr>
-                        <w:shd w:val="clear" w:color="auto" w:fill="FFFFFF"/>
-                        <w:jc w:val="center"/>
-                        <w:rPr>
-                          <w:rFonts w:ascii="TH SarabunIT๙" w:hAnsi="TH SarabunIT๙" w:cs="TH SarabunIT๙"/>
-                          <w:sz w:val="34"/>
-                          <w:szCs w:val="34"/>
-                        </w:rPr>
-                      </w:pPr>
-                      <w:r>
-                        <w:rPr>
-                          <w:rFonts w:ascii="TH SarabunIT๙" w:hAnsi="TH SarabunIT๙" w:cs="TH SarabunIT๙"/>
-                          <w:sz w:val="34"/>
-                          <w:szCs w:val="34"/>
-                          <w:cs/>
-                        </w:rPr>
-                        <w:t>จังหวัดประจวบคีรีขันธ์</w:t>
-                      </w:r>
                     </w:p>
                   </w:txbxContent>
                 </v:textbox>
@@ -7811,7 +5431,7 @@
 </file>
 
 <file path=word/numbering.xml><?xml version="1.0" encoding="utf-8"?>
-<w:numbering xmlns:wpc="http://schemas.microsoft.com/office/word/2010/wordprocessingCanvas" xmlns:cx="http://schemas.microsoft.com/office/drawing/2014/chartex" xmlns:cx1="http://schemas.microsoft.com/office/drawing/2015/9/8/chartex" xmlns:mc="http://schemas.openxmlformats.org/markup-compatibility/2006" xmlns:o="urn:schemas-microsoft-com:office:office" xmlns:r="http://schemas.openxmlformats.org/officeDocument/2006/relationships" xmlns:m="http://schemas.openxmlformats.org/officeDocument/2006/math" xmlns:v="urn:schemas-microsoft-com:vml" xmlns:wp14="http://schemas.microsoft.com/office/word/2010/wordprocessingDrawing" xmlns:wp="http://schemas.openxmlformats.org/drawingml/2006/wordprocessingDrawing" xmlns:w10="urn:schemas-microsoft-com:office:word" xmlns:w="http://schemas.openxmlformats.org/wordprocessingml/2006/main" xmlns:w14="http://schemas.microsoft.com/office/word/2010/wordml" xmlns:w15="http://schemas.microsoft.com/office/word/2012/wordml" xmlns:w16se="http://schemas.microsoft.com/office/word/2015/wordml/symex" xmlns:wpg="http://schemas.microsoft.com/office/word/2010/wordprocessingGroup" xmlns:wpi="http://schemas.microsoft.com/office/word/2010/wordprocessingInk" xmlns:wne="http://schemas.microsoft.com/office/word/2006/wordml" xmlns:wps="http://schemas.microsoft.com/office/word/2010/wordprocessingShape" mc:Ignorable="w14 w15 w16se wp14">
+<w:numbering xmlns:wpc="http://schemas.microsoft.com/office/word/2010/wordprocessingCanvas" xmlns:cx="http://schemas.microsoft.com/office/drawing/2014/chartex" xmlns:cx1="http://schemas.microsoft.com/office/drawing/2015/9/8/chartex" xmlns:cx2="http://schemas.microsoft.com/office/drawing/2015/10/21/chartex" xmlns:cx3="http://schemas.microsoft.com/office/drawing/2016/5/9/chartex" xmlns:cx4="http://schemas.microsoft.com/office/drawing/2016/5/10/chartex" xmlns:cx5="http://schemas.microsoft.com/office/drawing/2016/5/11/chartex" xmlns:cx6="http://schemas.microsoft.com/office/drawing/2016/5/12/chartex" xmlns:cx7="http://schemas.microsoft.com/office/drawing/2016/5/13/chartex" xmlns:cx8="http://schemas.microsoft.com/office/drawing/2016/5/14/chartex" xmlns:mc="http://schemas.openxmlformats.org/markup-compatibility/2006" xmlns:aink="http://schemas.microsoft.com/office/drawing/2016/ink" xmlns:am3d="http://schemas.microsoft.com/office/drawing/2017/model3d" xmlns:o="urn:schemas-microsoft-com:office:office" xmlns:oel="http://schemas.microsoft.com/office/2019/extlst" xmlns:r="http://schemas.openxmlformats.org/officeDocument/2006/relationships" xmlns:m="http://schemas.openxmlformats.org/officeDocument/2006/math" xmlns:v="urn:schemas-microsoft-com:vml" xmlns:wp14="http://schemas.microsoft.com/office/word/2010/wordprocessingDrawing" xmlns:wp="http://schemas.openxmlformats.org/drawingml/2006/wordprocessingDrawing" xmlns:w10="urn:schemas-microsoft-com:office:word" xmlns:w="http://schemas.openxmlformats.org/wordprocessingml/2006/main" xmlns:w14="http://schemas.microsoft.com/office/word/2010/wordml" xmlns:w15="http://schemas.microsoft.com/office/word/2012/wordml" xmlns:w16cex="http://schemas.microsoft.com/office/word/2018/wordml/cex" xmlns:w16cid="http://schemas.microsoft.com/office/word/2016/wordml/cid" xmlns:w16="http://schemas.microsoft.com/office/word/2018/wordml" xmlns:w16du="http://schemas.microsoft.com/office/word/2023/wordml/word16du" xmlns:w16sdtdh="http://schemas.microsoft.com/office/word/2020/wordml/sdtdatahash" xmlns:w16sdtfl="http://schemas.microsoft.com/office/word/2024/wordml/sdtformatlock" xmlns:w16se="http://schemas.microsoft.com/office/word/2015/wordml/symex" xmlns:wpg="http://schemas.microsoft.com/office/word/2010/wordprocessingGroup" xmlns:wpi="http://schemas.microsoft.com/office/word/2010/wordprocessingInk" xmlns:wne="http://schemas.microsoft.com/office/word/2006/wordml" xmlns:wps="http://schemas.microsoft.com/office/word/2010/wordprocessingShape" mc:Ignorable="w14 w15 w16se w16cid w16 w16cex w16sdtdh w16sdtfl w16du wp14">
   <w:abstractNum w:abstractNumId="0" w15:restartNumberingAfterBreak="0">
     <w:nsid w:val="01030CB4"/>
     <w:multiLevelType w:val="hybridMultilevel"/>
@@ -9411,50 +7031,50 @@
       </w:rPr>
     </w:lvl>
   </w:abstractNum>
-  <w:num w:numId="1">
+  <w:num w:numId="1" w16cid:durableId="2051875684">
     <w:abstractNumId w:val="0"/>
   </w:num>
-  <w:num w:numId="2">
+  <w:num w:numId="2" w16cid:durableId="819737707">
     <w:abstractNumId w:val="5"/>
   </w:num>
-  <w:num w:numId="3">
+  <w:num w:numId="3" w16cid:durableId="963775024">
     <w:abstractNumId w:val="10"/>
   </w:num>
-  <w:num w:numId="4">
+  <w:num w:numId="4" w16cid:durableId="2048144458">
     <w:abstractNumId w:val="2"/>
   </w:num>
-  <w:num w:numId="5">
+  <w:num w:numId="5" w16cid:durableId="2104914539">
     <w:abstractNumId w:val="4"/>
   </w:num>
-  <w:num w:numId="6">
+  <w:num w:numId="6" w16cid:durableId="541286449">
     <w:abstractNumId w:val="12"/>
   </w:num>
-  <w:num w:numId="7">
+  <w:num w:numId="7" w16cid:durableId="277682802">
     <w:abstractNumId w:val="3"/>
   </w:num>
-  <w:num w:numId="8">
+  <w:num w:numId="8" w16cid:durableId="954214630">
     <w:abstractNumId w:val="8"/>
   </w:num>
-  <w:num w:numId="9">
+  <w:num w:numId="9" w16cid:durableId="280453342">
     <w:abstractNumId w:val="7"/>
   </w:num>
-  <w:num w:numId="10">
+  <w:num w:numId="10" w16cid:durableId="1889412240">
     <w:abstractNumId w:val="9"/>
   </w:num>
-  <w:num w:numId="11">
+  <w:num w:numId="11" w16cid:durableId="1772966513">
     <w:abstractNumId w:val="11"/>
   </w:num>
-  <w:num w:numId="12">
+  <w:num w:numId="12" w16cid:durableId="865873787">
     <w:abstractNumId w:val="1"/>
   </w:num>
-  <w:num w:numId="13">
+  <w:num w:numId="13" w16cid:durableId="1522277535">
     <w:abstractNumId w:val="6"/>
   </w:num>
 </w:numbering>
 </file>
 
 <file path=word/styles.xml><?xml version="1.0" encoding="utf-8"?>
-<w:styles xmlns:mc="http://schemas.openxmlformats.org/markup-compatibility/2006" xmlns:r="http://schemas.openxmlformats.org/officeDocument/2006/relationships" xmlns:w="http://schemas.openxmlformats.org/wordprocessingml/2006/main" xmlns:w14="http://schemas.microsoft.com/office/word/2010/wordml" xmlns:w15="http://schemas.microsoft.com/office/word/2012/wordml" xmlns:w16se="http://schemas.microsoft.com/office/word/2015/wordml/symex" mc:Ignorable="w14 w15 w16se">
+<w:styles xmlns:mc="http://schemas.openxmlformats.org/markup-compatibility/2006" xmlns:r="http://schemas.openxmlformats.org/officeDocument/2006/relationships" xmlns:w="http://schemas.openxmlformats.org/wordprocessingml/2006/main" xmlns:w14="http://schemas.microsoft.com/office/word/2010/wordml" xmlns:w15="http://schemas.microsoft.com/office/word/2012/wordml" xmlns:w16cex="http://schemas.microsoft.com/office/word/2018/wordml/cex" xmlns:w16cid="http://schemas.microsoft.com/office/word/2016/wordml/cid" xmlns:w16="http://schemas.microsoft.com/office/word/2018/wordml" xmlns:w16du="http://schemas.microsoft.com/office/word/2023/wordml/word16du" xmlns:w16sdtdh="http://schemas.microsoft.com/office/word/2020/wordml/sdtdatahash" xmlns:w16sdtfl="http://schemas.microsoft.com/office/word/2024/wordml/sdtformatlock" xmlns:w16se="http://schemas.microsoft.com/office/word/2015/wordml/symex" mc:Ignorable="w14 w15 w16se w16cid w16 w16cex w16sdtdh w16sdtfl w16du">
   <w:docDefaults>
     <w:rPrDefault>
       <w:rPr>
@@ -9464,7 +7084,7 @@
     </w:rPrDefault>
     <w:pPrDefault/>
   </w:docDefaults>
-  <w:latentStyles w:defLockedState="0" w:defUIPriority="0" w:defSemiHidden="0" w:defUnhideWhenUsed="0" w:defQFormat="0" w:count="371">
+  <w:latentStyles w:defLockedState="0" w:defUIPriority="0" w:defSemiHidden="0" w:defUnhideWhenUsed="0" w:defQFormat="0" w:count="376">
     <w:lsdException w:name="Normal" w:qFormat="1"/>
     <w:lsdException w:name="heading 1" w:qFormat="1"/>
     <w:lsdException w:name="heading 2" w:semiHidden="1" w:unhideWhenUsed="1" w:qFormat="1"/>
@@ -9739,6 +7359,11 @@
     <w:lsdException w:name="List Table 5 Dark Accent 6" w:uiPriority="50"/>
     <w:lsdException w:name="List Table 6 Colorful Accent 6" w:uiPriority="51"/>
     <w:lsdException w:name="List Table 7 Colorful Accent 6" w:uiPriority="52"/>
+    <w:lsdException w:name="Mention" w:semiHidden="1" w:uiPriority="99" w:unhideWhenUsed="1"/>
+    <w:lsdException w:name="Smart Hyperlink" w:semiHidden="1" w:uiPriority="99" w:unhideWhenUsed="1"/>
+    <w:lsdException w:name="Hashtag" w:semiHidden="1" w:uiPriority="99" w:unhideWhenUsed="1"/>
+    <w:lsdException w:name="Unresolved Mention" w:semiHidden="1" w:uiPriority="99" w:unhideWhenUsed="1"/>
+    <w:lsdException w:name="Smart Link" w:semiHidden="1" w:uiPriority="99" w:unhideWhenUsed="1"/>
   </w:latentStyles>
   <w:style w:type="paragraph" w:default="1" w:styleId="a">
     <w:name w:val="Normal"/>

</xml_diff>